<commit_message>
Docs: SEC-01 v1.3 con SEC-12 y PRU-01 con la tabla de contenido actualizada - Milko Soto
Se agrega el diagrama de secuencia SEC-12 (consulta de materiales a reponer por la API de disponibilidad, RF-INV-09) con su ficha y aspectos relevantes, y se actualizan el índice de diagramas, el componente API pública y la tabla de contenido del SEC-01. Se actualiza la tabla de contenido del PRU-01, que no mostraba las secciones 6, 7 y 8.
</commit_message>
<xml_diff>
--- a/Fase 2/Evidencias Proyecto/Evidencias de Sistema/Pruebas de Calidad/SITRAFO_PRU-01_Informe_de_Pruebas.docx
+++ b/Fase 2/Evidencias Proyecto/Evidencias de Sistema/Pruebas de Calidad/SITRAFO_PRU-01_Informe_de_Pruebas.docx
@@ -1572,7 +1572,7 @@
               </w:rPr>
               <w:t xml:space="preserve">5.2 Cómo repetir las pruebas</w:t>
               <w:tab/>
-              <w:t xml:space="preserve">5</w:t>
+              <w:t xml:space="preserve">8</w:t>
             </w:r>
           </w:hyperlink>
           <w:r>
@@ -1618,15 +1618,7 @@
               <w:vertAlign w:val="baseline"/>
             </w:rPr>
           </w:pPr>
-          <w:r>
-            <w:rPr>
-              <w:color w:val="000000"/>
-              <w:u w:val="none"/>
-              <w:rtl w:val="0"/>
-            </w:rPr>
-            <w:t xml:space="preserve">6</w:t>
-          </w:r>
-          <w:hyperlink w:anchor="_heading=h.4ytoygum822i">
+          <w:hyperlink w:anchor="_heading=h.api901">
             <w:r>
               <w:rPr>
                 <w:rFonts w:ascii="Calibri" w:cs="Calibri" w:eastAsia="Calibri" w:hAnsi="Calibri"/>
@@ -1644,9 +1636,273 @@
                 <w:vertAlign w:val="baseline"/>
                 <w:rtl w:val="0"/>
               </w:rPr>
-              <w:t xml:space="preserve">. Anexos</w:t>
+              <w:t xml:space="preserve">6. Pruebas de las APIs propias</w:t>
               <w:tab/>
-              <w:t xml:space="preserve">6</w:t>
+              <w:t xml:space="preserve">8</w:t>
+            </w:r>
+          </w:hyperlink>
+          <w:r>
+            <w:rPr>
+              <w:rtl w:val="0"/>
+            </w:rPr>
+          </w:r>
+        </w:p>
+        <w:p>
+          <w:pPr>
+            <w:keepNext w:val="0"/>
+            <w:keepLines w:val="0"/>
+            <w:pageBreakBefore w:val="0"/>
+            <w:widowControl w:val="1"/>
+            <w:pBdr>
+              <w:top w:space="0" w:sz="0" w:val="nil"/>
+              <w:left w:space="0" w:sz="0" w:val="nil"/>
+              <w:bottom w:space="0" w:sz="0" w:val="nil"/>
+              <w:right w:space="0" w:sz="0" w:val="nil"/>
+              <w:between w:space="0" w:sz="0" w:val="nil"/>
+            </w:pBdr>
+            <w:shd w:fill="auto" w:val="clear"/>
+            <w:tabs>
+              <w:tab w:val="right" w:leader="none" w:pos="8743"/>
+              <w:tab w:val="right" w:leader="none" w:pos="9025"/>
+            </w:tabs>
+            <w:spacing w:after="0" w:before="0" w:line="240" w:lineRule="auto"/>
+            <w:ind w:left="283" w:right="0" w:firstLine="0"/>
+            <w:jc w:val="left"/>
+            <w:rPr>
+              <w:rFonts w:ascii="Calibri" w:cs="Calibri" w:eastAsia="Calibri" w:hAnsi="Calibri"/>
+              <w:b w:val="0"/>
+              <w:bCs w:val="0"/>
+              <w:i w:val="0"/>
+              <w:iCs w:val="0"/>
+              <w:smallCaps w:val="0"/>
+              <w:strike w:val="0"/>
+              <w:color w:val="000000"/>
+              <w:sz w:val="22"/>
+              <w:szCs w:val="22"/>
+              <w:u w:val="none"/>
+              <w:shd w:fill="auto" w:val="clear"/>
+              <w:vertAlign w:val="baseline"/>
+            </w:rPr>
+          </w:pPr>
+          <w:hyperlink w:anchor="_heading=h.api902">
+            <w:r>
+              <w:rPr>
+                <w:rFonts w:ascii="Calibri" w:cs="Calibri" w:eastAsia="Calibri" w:hAnsi="Calibri"/>
+                <w:b w:val="0"/>
+                <w:bCs w:val="0"/>
+                <w:i w:val="0"/>
+                <w:iCs w:val="0"/>
+                <w:smallCaps w:val="0"/>
+                <w:strike w:val="0"/>
+                <w:color w:val="000000"/>
+                <w:sz w:val="22"/>
+                <w:szCs w:val="22"/>
+                <w:u w:val="none"/>
+                <w:shd w:fill="auto" w:val="clear"/>
+                <w:vertAlign w:val="baseline"/>
+                <w:rtl w:val="0"/>
+              </w:rPr>
+              <w:t xml:space="preserve">6.1 Pruebas automatizadas</w:t>
+              <w:tab/>
+              <w:t xml:space="preserve">8</w:t>
+            </w:r>
+          </w:hyperlink>
+          <w:r>
+            <w:rPr>
+              <w:rtl w:val="0"/>
+            </w:rPr>
+          </w:r>
+        </w:p>
+        <w:p>
+          <w:pPr>
+            <w:keepNext w:val="0"/>
+            <w:keepLines w:val="0"/>
+            <w:pageBreakBefore w:val="0"/>
+            <w:widowControl w:val="1"/>
+            <w:pBdr>
+              <w:top w:space="0" w:sz="0" w:val="nil"/>
+              <w:left w:space="0" w:sz="0" w:val="nil"/>
+              <w:bottom w:space="0" w:sz="0" w:val="nil"/>
+              <w:right w:space="0" w:sz="0" w:val="nil"/>
+              <w:between w:space="0" w:sz="0" w:val="nil"/>
+            </w:pBdr>
+            <w:shd w:fill="auto" w:val="clear"/>
+            <w:tabs>
+              <w:tab w:val="right" w:leader="none" w:pos="8743"/>
+              <w:tab w:val="right" w:leader="none" w:pos="9025"/>
+            </w:tabs>
+            <w:spacing w:after="0" w:before="0" w:line="240" w:lineRule="auto"/>
+            <w:ind w:left="283" w:right="0" w:firstLine="0"/>
+            <w:jc w:val="left"/>
+            <w:rPr>
+              <w:rFonts w:ascii="Calibri" w:cs="Calibri" w:eastAsia="Calibri" w:hAnsi="Calibri"/>
+              <w:b w:val="0"/>
+              <w:bCs w:val="0"/>
+              <w:i w:val="0"/>
+              <w:iCs w:val="0"/>
+              <w:smallCaps w:val="0"/>
+              <w:strike w:val="0"/>
+              <w:color w:val="000000"/>
+              <w:sz w:val="22"/>
+              <w:szCs w:val="22"/>
+              <w:u w:val="none"/>
+              <w:shd w:fill="auto" w:val="clear"/>
+              <w:vertAlign w:val="baseline"/>
+            </w:rPr>
+          </w:pPr>
+          <w:hyperlink w:anchor="_heading=h.api903">
+            <w:r>
+              <w:rPr>
+                <w:rFonts w:ascii="Calibri" w:cs="Calibri" w:eastAsia="Calibri" w:hAnsi="Calibri"/>
+                <w:b w:val="0"/>
+                <w:bCs w:val="0"/>
+                <w:i w:val="0"/>
+                <w:iCs w:val="0"/>
+                <w:smallCaps w:val="0"/>
+                <w:strike w:val="0"/>
+                <w:color w:val="000000"/>
+                <w:sz w:val="22"/>
+                <w:szCs w:val="22"/>
+                <w:u w:val="none"/>
+                <w:shd w:fill="auto" w:val="clear"/>
+                <w:vertAlign w:val="baseline"/>
+                <w:rtl w:val="0"/>
+              </w:rPr>
+              <w:t xml:space="preserve">6.2 Pruebas manuales</w:t>
+              <w:tab/>
+              <w:t xml:space="preserve">9</w:t>
+            </w:r>
+          </w:hyperlink>
+          <w:r>
+            <w:rPr>
+              <w:rtl w:val="0"/>
+            </w:rPr>
+          </w:r>
+        </w:p>
+        <w:p>
+          <w:pPr>
+            <w:keepNext w:val="0"/>
+            <w:keepLines w:val="0"/>
+            <w:pageBreakBefore w:val="0"/>
+            <w:widowControl w:val="1"/>
+            <w:pBdr>
+              <w:top w:space="0" w:sz="0" w:val="nil"/>
+              <w:left w:space="0" w:sz="0" w:val="nil"/>
+              <w:bottom w:space="0" w:sz="0" w:val="nil"/>
+              <w:right w:space="0" w:sz="0" w:val="nil"/>
+              <w:between w:space="0" w:sz="0" w:val="nil"/>
+            </w:pBdr>
+            <w:shd w:fill="auto" w:val="clear"/>
+            <w:tabs>
+              <w:tab w:val="right" w:leader="none" w:pos="8743"/>
+              <w:tab w:val="right" w:leader="none" w:pos="9025"/>
+            </w:tabs>
+            <w:spacing w:after="0" w:before="0" w:line="240" w:lineRule="auto"/>
+            <w:ind w:left="283" w:right="0" w:firstLine="0"/>
+            <w:jc w:val="left"/>
+            <w:rPr>
+              <w:rFonts w:ascii="Calibri" w:cs="Calibri" w:eastAsia="Calibri" w:hAnsi="Calibri"/>
+              <w:b w:val="0"/>
+              <w:bCs w:val="0"/>
+              <w:i w:val="0"/>
+              <w:iCs w:val="0"/>
+              <w:smallCaps w:val="0"/>
+              <w:strike w:val="0"/>
+              <w:color w:val="000000"/>
+              <w:sz w:val="22"/>
+              <w:szCs w:val="22"/>
+              <w:u w:val="none"/>
+              <w:shd w:fill="auto" w:val="clear"/>
+              <w:vertAlign w:val="baseline"/>
+            </w:rPr>
+          </w:pPr>
+          <w:hyperlink w:anchor="_heading=h.api904">
+            <w:r>
+              <w:rPr>
+                <w:rFonts w:ascii="Calibri" w:cs="Calibri" w:eastAsia="Calibri" w:hAnsi="Calibri"/>
+                <w:b w:val="0"/>
+                <w:bCs w:val="0"/>
+                <w:i w:val="0"/>
+                <w:iCs w:val="0"/>
+                <w:smallCaps w:val="0"/>
+                <w:strike w:val="0"/>
+                <w:color w:val="000000"/>
+                <w:sz w:val="22"/>
+                <w:szCs w:val="22"/>
+                <w:u w:val="none"/>
+                <w:shd w:fill="auto" w:val="clear"/>
+                <w:vertAlign w:val="baseline"/>
+                <w:rtl w:val="0"/>
+              </w:rPr>
+              <w:t xml:space="preserve">6.3 Evidencias</w:t>
+              <w:tab/>
+              <w:t xml:space="preserve">10</w:t>
+            </w:r>
+          </w:hyperlink>
+          <w:r>
+            <w:rPr>
+              <w:rtl w:val="0"/>
+            </w:rPr>
+          </w:r>
+        </w:p>
+        <w:p>
+          <w:pPr>
+            <w:keepNext w:val="0"/>
+            <w:keepLines w:val="0"/>
+            <w:pageBreakBefore w:val="0"/>
+            <w:widowControl w:val="1"/>
+            <w:pBdr>
+              <w:top w:space="0" w:sz="0" w:val="nil"/>
+              <w:left w:space="0" w:sz="0" w:val="nil"/>
+              <w:bottom w:space="0" w:sz="0" w:val="nil"/>
+              <w:right w:space="0" w:sz="0" w:val="nil"/>
+              <w:between w:space="0" w:sz="0" w:val="nil"/>
+            </w:pBdr>
+            <w:shd w:fill="auto" w:val="clear"/>
+            <w:tabs>
+              <w:tab w:val="right" w:leader="none" w:pos="8743"/>
+              <w:tab w:val="right" w:leader="none" w:pos="9025"/>
+            </w:tabs>
+            <w:spacing w:after="0" w:before="0" w:line="240" w:lineRule="auto"/>
+            <w:ind w:left="283" w:right="0" w:firstLine="0"/>
+            <w:jc w:val="left"/>
+            <w:rPr>
+              <w:rFonts w:ascii="Calibri" w:cs="Calibri" w:eastAsia="Calibri" w:hAnsi="Calibri"/>
+              <w:b w:val="0"/>
+              <w:bCs w:val="0"/>
+              <w:i w:val="0"/>
+              <w:iCs w:val="0"/>
+              <w:smallCaps w:val="0"/>
+              <w:strike w:val="0"/>
+              <w:color w:val="000000"/>
+              <w:sz w:val="22"/>
+              <w:szCs w:val="22"/>
+              <w:u w:val="none"/>
+              <w:shd w:fill="auto" w:val="clear"/>
+              <w:vertAlign w:val="baseline"/>
+            </w:rPr>
+          </w:pPr>
+          <w:hyperlink w:anchor="_heading=h.api905">
+            <w:r>
+              <w:rPr>
+                <w:rFonts w:ascii="Calibri" w:cs="Calibri" w:eastAsia="Calibri" w:hAnsi="Calibri"/>
+                <w:b w:val="0"/>
+                <w:bCs w:val="0"/>
+                <w:i w:val="0"/>
+                <w:iCs w:val="0"/>
+                <w:smallCaps w:val="0"/>
+                <w:strike w:val="0"/>
+                <w:color w:val="000000"/>
+                <w:sz w:val="22"/>
+                <w:szCs w:val="22"/>
+                <w:u w:val="none"/>
+                <w:shd w:fill="auto" w:val="clear"/>
+                <w:vertAlign w:val="baseline"/>
+                <w:rtl w:val="0"/>
+              </w:rPr>
+              <w:t xml:space="preserve">6.4 Criterios pendientes de este informe</w:t>
+              <w:tab/>
+              <w:t xml:space="preserve">12</w:t>
             </w:r>
           </w:hyperlink>
           <w:r>
@@ -1692,15 +1948,7 @@
               <w:vertAlign w:val="baseline"/>
             </w:rPr>
           </w:pPr>
-          <w:r>
-            <w:rPr>
-              <w:color w:val="000000"/>
-              <w:u w:val="none"/>
-              <w:rtl w:val="0"/>
-            </w:rPr>
-            <w:t xml:space="preserve">7</w:t>
-          </w:r>
-          <w:hyperlink w:anchor="_heading=h.ynoekp8vpfqc">
+          <w:hyperlink w:anchor="_heading=h.4ytoygum822i">
             <w:r>
               <w:rPr>
                 <w:rFonts w:ascii="Calibri" w:cs="Calibri" w:eastAsia="Calibri" w:hAnsi="Calibri"/>
@@ -1718,15 +1966,81 @@
                 <w:vertAlign w:val="baseline"/>
                 <w:rtl w:val="0"/>
               </w:rPr>
-              <w:t xml:space="preserve">. Historial de revisiones</w:t>
+              <w:t xml:space="preserve">7. Anexos</w:t>
               <w:tab/>
+              <w:t xml:space="preserve">12</w:t>
             </w:r>
           </w:hyperlink>
           <w:r>
             <w:rPr>
               <w:rtl w:val="0"/>
             </w:rPr>
-            <w:t xml:space="preserve">7</w:t>
+          </w:r>
+        </w:p>
+        <w:p>
+          <w:pPr>
+            <w:keepNext w:val="0"/>
+            <w:keepLines w:val="0"/>
+            <w:pageBreakBefore w:val="0"/>
+            <w:widowControl w:val="1"/>
+            <w:pBdr>
+              <w:top w:space="0" w:sz="0" w:val="nil"/>
+              <w:left w:space="0" w:sz="0" w:val="nil"/>
+              <w:bottom w:space="0" w:sz="0" w:val="nil"/>
+              <w:right w:space="0" w:sz="0" w:val="nil"/>
+              <w:between w:space="0" w:sz="0" w:val="nil"/>
+            </w:pBdr>
+            <w:shd w:fill="auto" w:val="clear"/>
+            <w:tabs>
+              <w:tab w:val="right" w:leader="none" w:pos="9026"/>
+              <w:tab w:val="right" w:leader="none" w:pos="9025"/>
+            </w:tabs>
+            <w:spacing w:after="0" w:before="0" w:line="240" w:lineRule="auto"/>
+            <w:ind w:left="0" w:right="0" w:firstLine="0"/>
+            <w:jc w:val="left"/>
+            <w:rPr>
+              <w:rFonts w:ascii="Calibri" w:cs="Calibri" w:eastAsia="Calibri" w:hAnsi="Calibri"/>
+              <w:b w:val="0"/>
+              <w:bCs w:val="0"/>
+              <w:i w:val="0"/>
+              <w:iCs w:val="0"/>
+              <w:smallCaps w:val="0"/>
+              <w:strike w:val="0"/>
+              <w:color w:val="000000"/>
+              <w:sz w:val="22"/>
+              <w:szCs w:val="22"/>
+              <w:u w:val="none"/>
+              <w:shd w:fill="auto" w:val="clear"/>
+              <w:vertAlign w:val="baseline"/>
+            </w:rPr>
+          </w:pPr>
+          <w:hyperlink w:anchor="_heading=h.ynoekp8vpfqc">
+            <w:r>
+              <w:rPr>
+                <w:rFonts w:ascii="Calibri" w:cs="Calibri" w:eastAsia="Calibri" w:hAnsi="Calibri"/>
+                <w:b w:val="0"/>
+                <w:bCs w:val="0"/>
+                <w:i w:val="0"/>
+                <w:iCs w:val="0"/>
+                <w:smallCaps w:val="0"/>
+                <w:strike w:val="0"/>
+                <w:color w:val="000000"/>
+                <w:sz w:val="22"/>
+                <w:szCs w:val="22"/>
+                <w:u w:val="none"/>
+                <w:shd w:fill="auto" w:val="clear"/>
+                <w:vertAlign w:val="baseline"/>
+                <w:rtl w:val="0"/>
+              </w:rPr>
+              <w:t xml:space="preserve">8. Historial de revisiones</w:t>
+              <w:tab/>
+              <w:t xml:space="preserve">12</w:t>
+            </w:r>
+          </w:hyperlink>
+          <w:r>
+            <w:rPr>
+              <w:rtl w:val="0"/>
+            </w:rPr>
           </w:r>
           <w:r>
             <w:fldChar w:fldCharType="end"/>
@@ -6982,6 +7296,8 @@
         <w:keepNext/>
         <w:rPr/>
       </w:pPr>
+      <w:bookmarkStart w:id="901" w:name="_heading=h.api901"/>
+      <w:bookmarkEnd w:id="901"/>
       <w:r>
         <w:rPr>
           <w:rFonts w:ascii="Calibri" w:cs="Calibri" w:eastAsia="Calibri" w:hAnsi="Calibri"/>
@@ -7010,6 +7326,8 @@
           <w:rFonts w:ascii="Calibri" w:cs="Calibri" w:eastAsia="Calibri" w:hAnsi="Calibri"/>
         </w:rPr>
       </w:pPr>
+      <w:bookmarkStart w:id="902" w:name="_heading=h.api902"/>
+      <w:bookmarkEnd w:id="902"/>
       <w:r>
         <w:rPr>
           <w:rFonts w:ascii="Calibri" w:cs="Calibri" w:eastAsia="Calibri" w:hAnsi="Calibri"/>
@@ -7534,6 +7852,8 @@
           <w:rFonts w:ascii="Calibri" w:cs="Calibri" w:eastAsia="Calibri" w:hAnsi="Calibri"/>
         </w:rPr>
       </w:pPr>
+      <w:bookmarkStart w:id="903" w:name="_heading=h.api903"/>
+      <w:bookmarkEnd w:id="903"/>
       <w:r>
         <w:rPr>
           <w:rFonts w:ascii="Calibri" w:cs="Calibri" w:eastAsia="Calibri" w:hAnsi="Calibri"/>
@@ -8870,6 +9190,8 @@
           <w:rFonts w:ascii="Calibri" w:cs="Calibri" w:eastAsia="Calibri" w:hAnsi="Calibri"/>
         </w:rPr>
       </w:pPr>
+      <w:bookmarkStart w:id="904" w:name="_heading=h.api904"/>
+      <w:bookmarkEnd w:id="904"/>
       <w:r>
         <w:rPr>
           <w:rFonts w:ascii="Calibri" w:cs="Calibri" w:eastAsia="Calibri" w:hAnsi="Calibri"/>
@@ -9048,6 +9370,8 @@
           <w:rFonts w:ascii="Calibri" w:cs="Calibri" w:eastAsia="Calibri" w:hAnsi="Calibri"/>
         </w:rPr>
       </w:pPr>
+      <w:bookmarkStart w:id="905" w:name="_heading=h.api905"/>
+      <w:bookmarkEnd w:id="905"/>
       <w:r>
         <w:rPr>
           <w:rFonts w:ascii="Calibri" w:cs="Calibri" w:eastAsia="Calibri" w:hAnsi="Calibri"/>

</xml_diff>

<commit_message>
Docs: SEC-01 corregido, PRU-01 v1.2 y EVI-01 v1.5 con la API de materiales
</commit_message>
<xml_diff>
--- a/Fase 2/Evidencias Proyecto/Evidencias de Sistema/Pruebas de Calidad/SITRAFO_PRU-01_Informe_de_Pruebas.docx
+++ b/Fase 2/Evidencias Proyecto/Evidencias de Sistema/Pruebas de Calidad/SITRAFO_PRU-01_Informe_de_Pruebas.docx
@@ -97,7 +97,7 @@
           <w:szCs w:val="24"/>
           <w:rtl w:val="0"/>
         </w:rPr>
-        <w:t xml:space="preserve">PRU-01  ·  Versión 1.1</w:t>
+        <w:t>PRU-01  ·  Versión 1.2</w:t>
       </w:r>
       <w:r>
         <w:rPr>
@@ -667,7 +667,7 @@
                 <w:szCs w:val="19"/>
                 <w:rtl w:val="0"/>
               </w:rPr>
-              <w:t xml:space="preserve">RNF-03 (seguridad), RNF-06 y RNF-07 (rendimiento y concurrencia) e interfaz web del cliente; APIs propias: RF-OT-12, RF-COM-18, RF-INT-04 y RNF-21</w:t>
+              <w:t>RNF-03 (seguridad), RNF-06 y RNF-07 (rendimiento y concurrencia) e interfaz web del cliente; APIs propias: RF-OT-12, RF-COM-18, RF-INV-09, RF-INT-04 y RNF-21</w:t>
             </w:r>
           </w:p>
         </w:tc>
@@ -800,7 +800,31 @@
                 <w:szCs w:val="19"/>
                 <w:rtl w:val="0"/>
               </w:rPr>
-              <w:t xml:space="preserve">14-10-2026 (producción) y 19-10-2026 (APIs propias)</w:t>
+            </w:r>
+            <w:r>
+              <w:rPr>
+                <w:sz w:val="19"/>
+                <w:szCs w:val="19"/>
+                <w:rtl w:val="0"/>
+              </w:rPr>
+              <w:t xml:space="preserve">14-10-2026 (producción), 19-10-2026 (APIs propias) y </w:t>
+            </w:r>
+            <w:r>
+              <w:rPr>
+                <w:sz w:val="19"/>
+                <w:szCs w:val="19"/>
+                <w:highlight w:val="yellow"/>
+                <w:rtl w:val="0"/>
+              </w:rPr>
+              <w:t xml:space="preserve">dd-mm-2026</w:t>
+            </w:r>
+            <w:r>
+              <w:rPr>
+                <w:sz w:val="19"/>
+                <w:szCs w:val="19"/>
+                <w:rtl w:val="0"/>
+              </w:rPr>
+              <w:t xml:space="preserve"> (API de materiales)</w:t>
             </w:r>
           </w:p>
         </w:tc>
@@ -1374,7 +1398,7 @@
               </w:rPr>
               <w:t xml:space="preserve">4. Prueba de carga</w:t>
               <w:tab/>
-              <w:t xml:space="preserve">4</w:t>
+              <w:t xml:space="preserve">5</w:t>
             </w:r>
           </w:hyperlink>
           <w:r>
@@ -1902,7 +1926,7 @@
               </w:rPr>
               <w:t xml:space="preserve">6.4 Criterios pendientes de este informe</w:t>
               <w:tab/>
-              <w:t xml:space="preserve">12</w:t>
+              <w:t xml:space="preserve">13</w:t>
             </w:r>
           </w:hyperlink>
           <w:r>
@@ -1968,7 +1992,7 @@
               </w:rPr>
               <w:t xml:space="preserve">7. Anexos</w:t>
               <w:tab/>
-              <w:t xml:space="preserve">12</w:t>
+              <w:t xml:space="preserve">13</w:t>
             </w:r>
           </w:hyperlink>
           <w:r>
@@ -2034,7 +2058,7 @@
               </w:rPr>
               <w:t xml:space="preserve">8. Historial de revisiones</w:t>
               <w:tab/>
-              <w:t xml:space="preserve">12</w:t>
+              <w:t xml:space="preserve">14</w:t>
             </w:r>
           </w:hyperlink>
           <w:r>
@@ -2101,7 +2125,7 @@
         <w:rPr>
           <w:rtl w:val="0"/>
         </w:rPr>
-        <w:t xml:space="preserve">Este informe registra las pruebas de calidad ejecutadas sobre el sistema publicado en https://sitrafo.onrender.com: análisis de seguridad con OWASP ZAP, prueba de carga y pruebas de interfaz con Selenium. Complementa al informe QA-01, que verificó el mismo código en una réplica local. La versión 1.1 agrega la verificación de las APIs propias del Sprint 3 (sección 6).</w:t>
+        <w:t>Este informe registra las pruebas de calidad ejecutadas sobre el sistema publicado en https://sitrafo.onrender.com: análisis de seguridad con OWASP ZAP, prueba de carga y pruebas de interfaz con Selenium. Complementa al informe QA-01, que verificó el mismo código en una réplica local. La versión 1.1 agrega la verificación de las APIs propias del Sprint 3 (sección 6) y la versión 1.2, la de la API de disponibilidad de materiales.</w:t>
       </w:r>
     </w:p>
     <w:tbl>
@@ -2750,7 +2774,24 @@
                 <w:szCs w:val="19"/>
                 <w:rtl w:val="0"/>
               </w:rPr>
-              <w:t xml:space="preserve">43 de 43 pruebas de las APIs y 279 de 279 de la suite; 10 de 10 casos manuales</w:t>
+              <w:t xml:space="preserve">55 de 55 pruebas de las APIs y 291 de 291 de la suite; </w:t>
+            </w:r>
+            <w:r>
+              <w:rPr>
+                <w:sz w:val="19"/>
+                <w:szCs w:val="19"/>
+                <w:highlight w:val="yellow"/>
+                <w:rtl w:val="0"/>
+              </w:rPr>
+              <w:t xml:space="preserve">__ de 16</w:t>
+            </w:r>
+            <w:r>
+              <w:rPr>
+                <w:sz w:val="19"/>
+                <w:szCs w:val="19"/>
+                <w:rtl w:val="0"/>
+              </w:rPr>
+              <w:t xml:space="preserve"> casos manuales</w:t>
             </w:r>
           </w:p>
         </w:tc>
@@ -2774,9 +2815,10 @@
               <w:rPr>
                 <w:sz w:val="19"/>
                 <w:szCs w:val="19"/>
-                <w:rtl w:val="0"/>
-              </w:rPr>
-              <w:t xml:space="preserve">CUMPLE</w:t>
+                <w:highlight w:val="yellow"/>
+                <w:rtl w:val="0"/>
+              </w:rPr>
+              <w:t xml:space="preserve">PENDIENTE</w:t>
             </w:r>
           </w:p>
         </w:tc>
@@ -6660,7 +6702,7 @@
           <wp:inline distB="114300" distT="114300" distL="114300" distR="114300">
             <wp:extent cx="5731200" cy="3644900"/>
             <wp:effectExtent b="0" l="0" r="0" t="0"/>
-            <wp:docPr id="3" name="image1.png"/>
+            <wp:docPr id="1" name="image1.png"/>
             <a:graphic>
               <a:graphicData uri="http://schemas.openxmlformats.org/drawingml/2006/picture">
                 <pic:pic>
@@ -6757,7 +6799,7 @@
           <wp:inline distB="114300" distT="114300" distL="114300" distR="114300">
             <wp:extent cx="5731200" cy="3225800"/>
             <wp:effectExtent b="0" l="0" r="0" t="0"/>
-            <wp:docPr id="1" name="image3.png"/>
+            <wp:docPr id="3" name="image3.png"/>
             <a:graphic>
               <a:graphicData uri="http://schemas.openxmlformats.org/drawingml/2006/picture">
                 <pic:pic>
@@ -6789,7 +6831,7 @@
           <wp:inline distB="114300" distT="114300" distL="114300" distR="114300">
             <wp:extent cx="5731200" cy="3225800"/>
             <wp:effectExtent b="0" l="0" r="0" t="0"/>
-            <wp:docPr id="5" name="image4.png"/>
+            <wp:docPr id="4" name="image4.png"/>
             <a:graphic>
               <a:graphicData uri="http://schemas.openxmlformats.org/drawingml/2006/picture">
                 <pic:pic>
@@ -6842,7 +6884,7 @@
           <wp:inline distB="114300" distT="114300" distL="114300" distR="114300">
             <wp:extent cx="5731200" cy="3225800"/>
             <wp:effectExtent b="0" l="0" r="0" t="0"/>
-            <wp:docPr id="4" name="image2.png"/>
+            <wp:docPr id="5" name="image2.png"/>
             <a:graphic>
               <a:graphicData uri="http://schemas.openxmlformats.org/drawingml/2006/picture">
                 <pic:pic>
@@ -7315,7 +7357,7 @@
         <w:rPr>
           <w:rtl w:val="0"/>
         </w:rPr>
-        <w:t xml:space="preserve">Las APIs públicas propias, seguimiento de pedidos y cotizador, se verificaron con pruebas automatizadas en pytest y con pruebas manuales en el ambiente local, con los datos de demostración. Las pruebas automatizadas también se ejecutan en cada cambio en GitHub Actions y no dependen de servicios externos ni del archivo .env.</w:t>
+        <w:t>Las APIs públicas propias, seguimiento de pedidos, cotizador y disponibilidad de materiales, se verificaron con pruebas automatizadas en pytest y con pruebas manuales en el ambiente local, con los datos de demostración. Las pruebas automatizadas también se ejecutan en cada cambio en GitHub Actions y no dependen de servicios externos ni del archivo .env.</w:t>
       </w:r>
     </w:p>
     <w:p>
@@ -7734,6 +7776,120 @@
                 <w:szCs w:val="19"/>
                 <w:rtl w:val="0"/>
               </w:rPr>
+              <w:t xml:space="preserve">api_publica/test_materiales.py (disponibilidad de materiales)</w:t>
+            </w:r>
+          </w:p>
+        </w:tc>
+        <w:tc>
+          <w:tcPr>
+            <w:tcBorders>
+              <w:top w:color="a6a6a6" w:space="0" w:sz="4" w:val="single"/>
+              <w:left w:color="a6a6a6" w:space="0" w:sz="4" w:val="single"/>
+              <w:bottom w:color="a6a6a6" w:space="0" w:sz="4" w:val="single"/>
+              <w:right w:color="a6a6a6" w:space="0" w:sz="4" w:val="single"/>
+            </w:tcBorders>
+            <w:shd w:fill="e2efda" w:val="clear"/>
+          </w:tcPr>
+          <w:p>
+            <w:pPr>
+              <w:spacing w:after="0" w:before="0" w:lineRule="auto"/>
+              <w:jc w:val="left"/>
+              <w:rPr/>
+            </w:pPr>
+            <w:r>
+              <w:rPr>
+                <w:b w:val="0"/>
+                <w:bCs w:val="0"/>
+                <w:sz w:val="19"/>
+                <w:szCs w:val="19"/>
+                <w:rtl w:val="0"/>
+              </w:rPr>
+              <w:t xml:space="preserve">Sólo los materiales activos bajo su stock mínimo; cantidad sugerida = 2 × mínimo − stock del kardex, sumando todas las bodegas y redondeando hacia arriba los que se miden en unidades; no expone costos, bodegas ni stock; un consumo que baja del mínimo aparece en la consulta; lista vacía; 401 sin clave; 403 para las dos claves del portal; la clave de proveedores no puede cotizar ni seguir pedidos; consumidor externo; registro; Swagger versión 1.2.0.</w:t>
+            </w:r>
+          </w:p>
+        </w:tc>
+        <w:tc>
+          <w:tcPr>
+            <w:tcBorders>
+              <w:top w:color="a6a6a6" w:space="0" w:sz="4" w:val="single"/>
+              <w:left w:color="a6a6a6" w:space="0" w:sz="4" w:val="single"/>
+              <w:bottom w:color="a6a6a6" w:space="0" w:sz="4" w:val="single"/>
+              <w:right w:color="a6a6a6" w:space="0" w:sz="4" w:val="single"/>
+            </w:tcBorders>
+            <w:shd w:fill="e2efda" w:val="clear"/>
+          </w:tcPr>
+          <w:p>
+            <w:pPr>
+              <w:spacing w:after="0" w:before="0" w:lineRule="auto"/>
+              <w:jc w:val="left"/>
+              <w:rPr/>
+            </w:pPr>
+            <w:r>
+              <w:rPr>
+                <w:sz w:val="19"/>
+                <w:szCs w:val="19"/>
+                <w:rtl w:val="0"/>
+              </w:rPr>
+              <w:t xml:space="preserve">12 de 12 aprobadas</w:t>
+            </w:r>
+          </w:p>
+        </w:tc>
+        <w:tc>
+          <w:tcPr>
+            <w:tcBorders>
+              <w:top w:color="a6a6a6" w:space="0" w:sz="4" w:val="single"/>
+              <w:left w:color="a6a6a6" w:space="0" w:sz="4" w:val="single"/>
+              <w:bottom w:color="a6a6a6" w:space="0" w:sz="4" w:val="single"/>
+              <w:right w:color="a6a6a6" w:space="0" w:sz="4" w:val="single"/>
+            </w:tcBorders>
+            <w:shd w:fill="e2efda" w:val="clear"/>
+          </w:tcPr>
+          <w:p>
+            <w:pPr>
+              <w:spacing w:after="0" w:before="0" w:lineRule="auto"/>
+              <w:jc w:val="center"/>
+              <w:rPr/>
+            </w:pPr>
+            <w:r>
+              <w:rPr>
+                <w:sz w:val="19"/>
+                <w:szCs w:val="19"/>
+                <w:rtl w:val="0"/>
+              </w:rPr>
+              <w:t xml:space="preserve">CUMPLE</w:t>
+            </w:r>
+          </w:p>
+        </w:tc>
+      </w:tr>
+      <w:tr>
+        <w:trPr>
+          <w:cantSplit w:val="0"/>
+          <w:tblHeader w:val="0"/>
+        </w:trPr>
+        <w:tc>
+          <w:tcPr>
+            <w:tcBorders>
+              <w:top w:color="a6a6a6" w:space="0" w:sz="4" w:val="single"/>
+              <w:left w:color="a6a6a6" w:space="0" w:sz="4" w:val="single"/>
+              <w:bottom w:color="a6a6a6" w:space="0" w:sz="4" w:val="single"/>
+              <w:right w:color="a6a6a6" w:space="0" w:sz="4" w:val="single"/>
+            </w:tcBorders>
+            <w:shd w:fill="e2efda" w:val="clear"/>
+          </w:tcPr>
+          <w:p>
+            <w:pPr>
+              <w:spacing w:after="0" w:before="0" w:lineRule="auto"/>
+              <w:jc w:val="left"/>
+              <w:rPr/>
+            </w:pPr>
+            <w:r>
+              <w:rPr>
+                <w:b w:val="0"/>
+                <w:bCs w:val="0"/>
+                <w:sz w:val="19"/>
+                <w:szCs w:val="19"/>
+                <w:rtl w:val="0"/>
+              </w:rPr>
               <w:t xml:space="preserve">Suite completa del sistema</w:t>
             </w:r>
           </w:p>
@@ -7788,7 +7944,7 @@
                 <w:szCs w:val="19"/>
                 <w:rtl w:val="0"/>
               </w:rPr>
-              <w:t xml:space="preserve">279 de 279 aprobadas en 31 s</w:t>
+              <w:t xml:space="preserve">291 de 291 aprobadas</w:t>
             </w:r>
           </w:p>
         </w:tc>
@@ -7871,7 +8027,32 @@
         <w:rPr>
           <w:rtl w:val="0"/>
         </w:rPr>
-        <w:t xml:space="preserve">Se ejecutaron el 19-10-2026 sobre el ambiente local con los datos de demostración, antes de publicar la API del cotizador. Ese mismo día la API quedó publicada en Render: la documentación de https://sitrafo.onrender.com/api/publica/v1/docs/ muestra la versión 1.1.0 con los servicios de seguimiento y del cotizador. Los casos manuales se repetirán sobre producción.</w:t>
+        <w:t>Los casos 01 a 10 se ejecutaron el 19-10-2026 sobre el ambiente local con los datos de demostración, antes de publicar la API del cotizador. Ese mismo día la API quedó publicada en Render: la documentación de https://sitrafo.onrender.com/api/publica/v1/docs/ muestra la versión 1.1.0 con los servicios de seguimiento y del cotizador. Los casos manuales se repetirán sobre producción.</w:t>
+      </w:r>
+    </w:p>
+    <w:p>
+      <w:pPr>
+        <w:spacing w:after="120" w:before="0" w:line="276" w:lineRule="auto"/>
+        <w:rPr/>
+      </w:pPr>
+      <w:r>
+        <w:rPr>
+          <w:rtl w:val="0"/>
+        </w:rPr>
+        <w:t xml:space="preserve">Los casos 11 a 16, de la API de disponibilidad de materiales, se ejecutaron el </w:t>
+      </w:r>
+      <w:r>
+        <w:rPr>
+          <w:highlight w:val="yellow"/>
+          <w:rtl w:val="0"/>
+        </w:rPr>
+        <w:t xml:space="preserve">dd-mm-2026</w:t>
+      </w:r>
+      <w:r>
+        <w:rPr>
+          <w:rtl w:val="0"/>
+        </w:rPr>
+        <w:t xml:space="preserve"> sobre el ambiente local con los datos de demostración, con la clave del consumidor proveedores que entrega el comando claves_api. En el caso 13 se subió el stock mínimo de un material por sobre su stock para tener un caso conocido.</w:t>
       </w:r>
     </w:p>
     <w:tbl>
@@ -9155,6 +9336,684 @@
           </w:p>
         </w:tc>
       </w:tr>
+      <w:tr>
+        <w:trPr>
+          <w:cantSplit w:val="0"/>
+          <w:tblHeader w:val="0"/>
+        </w:trPr>
+        <w:tc>
+          <w:tcPr>
+            <w:tcBorders>
+              <w:top w:color="a6a6a6" w:space="0" w:sz="4" w:val="single"/>
+              <w:left w:color="a6a6a6" w:space="0" w:sz="4" w:val="single"/>
+              <w:bottom w:color="a6a6a6" w:space="0" w:sz="4" w:val="single"/>
+              <w:right w:color="a6a6a6" w:space="0" w:sz="4" w:val="single"/>
+            </w:tcBorders>
+          </w:tcPr>
+          <w:p>
+            <w:pPr>
+              <w:spacing w:after="0" w:before="0" w:lineRule="auto"/>
+              <w:jc w:val="center"/>
+              <w:rPr/>
+            </w:pPr>
+            <w:r>
+              <w:rPr>
+                <w:b w:val="0"/>
+                <w:bCs w:val="0"/>
+                <w:sz w:val="19"/>
+                <w:szCs w:val="19"/>
+                <w:rtl w:val="0"/>
+              </w:rPr>
+              <w:t xml:space="preserve">11</w:t>
+            </w:r>
+          </w:p>
+        </w:tc>
+        <w:tc>
+          <w:tcPr>
+            <w:tcBorders>
+              <w:top w:color="a6a6a6" w:space="0" w:sz="4" w:val="single"/>
+              <w:left w:color="a6a6a6" w:space="0" w:sz="4" w:val="single"/>
+              <w:bottom w:color="a6a6a6" w:space="0" w:sz="4" w:val="single"/>
+              <w:right w:color="a6a6a6" w:space="0" w:sz="4" w:val="single"/>
+            </w:tcBorders>
+          </w:tcPr>
+          <w:p>
+            <w:pPr>
+              <w:spacing w:after="0" w:before="0" w:lineRule="auto"/>
+              <w:jc w:val="left"/>
+              <w:rPr/>
+            </w:pPr>
+            <w:r>
+              <w:rPr>
+                <w:b w:val="0"/>
+                <w:bCs w:val="0"/>
+                <w:sz w:val="19"/>
+                <w:szCs w:val="19"/>
+                <w:rtl w:val="0"/>
+              </w:rPr>
+              <w:t xml:space="preserve">Swagger: materiales a reponer con la clave proveedores responde 200; cada material trae sólo código, nombre, categoría, unidad, stock mínimo y cantidad sugerida</w:t>
+            </w:r>
+          </w:p>
+        </w:tc>
+        <w:tc>
+          <w:tcPr>
+            <w:tcBorders>
+              <w:top w:color="a6a6a6" w:space="0" w:sz="4" w:val="single"/>
+              <w:left w:color="a6a6a6" w:space="0" w:sz="4" w:val="single"/>
+              <w:bottom w:color="a6a6a6" w:space="0" w:sz="4" w:val="single"/>
+              <w:right w:color="a6a6a6" w:space="0" w:sz="4" w:val="single"/>
+            </w:tcBorders>
+          </w:tcPr>
+          <w:p>
+            <w:pPr>
+              <w:spacing w:after="0" w:before="0" w:lineRule="auto"/>
+              <w:jc w:val="left"/>
+              <w:rPr/>
+            </w:pPr>
+            <w:r>
+              <w:rPr>
+                <w:b w:val="0"/>
+                <w:bCs w:val="0"/>
+                <w:sz w:val="19"/>
+                <w:szCs w:val="19"/>
+                <w:rtl w:val="0"/>
+              </w:rPr>
+              <w:t xml:space="preserve">RF-INV-09</w:t>
+            </w:r>
+          </w:p>
+        </w:tc>
+        <w:tc>
+          <w:tcPr>
+            <w:tcBorders>
+              <w:top w:color="a6a6a6" w:space="0" w:sz="4" w:val="single"/>
+              <w:left w:color="a6a6a6" w:space="0" w:sz="4" w:val="single"/>
+              <w:bottom w:color="a6a6a6" w:space="0" w:sz="4" w:val="single"/>
+              <w:right w:color="a6a6a6" w:space="0" w:sz="4" w:val="single"/>
+            </w:tcBorders>
+          </w:tcPr>
+          <w:p>
+            <w:pPr>
+              <w:spacing w:after="0" w:before="0" w:lineRule="auto"/>
+              <w:jc w:val="center"/>
+              <w:rPr/>
+            </w:pPr>
+            <w:r>
+              <w:rPr>
+                <w:sz w:val="19"/>
+                <w:szCs w:val="19"/>
+                <w:highlight w:val="yellow"/>
+                <w:rtl w:val="0"/>
+              </w:rPr>
+              <w:t xml:space="preserve">PENDIENTE</w:t>
+            </w:r>
+          </w:p>
+        </w:tc>
+      </w:tr>
+      <w:tr>
+        <w:trPr>
+          <w:cantSplit w:val="0"/>
+          <w:tblHeader w:val="0"/>
+        </w:trPr>
+        <w:tc>
+          <w:tcPr>
+            <w:tcBorders>
+              <w:top w:color="a6a6a6" w:space="0" w:sz="4" w:val="single"/>
+              <w:left w:color="a6a6a6" w:space="0" w:sz="4" w:val="single"/>
+              <w:bottom w:color="a6a6a6" w:space="0" w:sz="4" w:val="single"/>
+              <w:right w:color="a6a6a6" w:space="0" w:sz="4" w:val="single"/>
+            </w:tcBorders>
+          </w:tcPr>
+          <w:p>
+            <w:pPr>
+              <w:spacing w:after="0" w:before="0" w:lineRule="auto"/>
+              <w:jc w:val="center"/>
+              <w:rPr/>
+            </w:pPr>
+            <w:r>
+              <w:rPr>
+                <w:b w:val="0"/>
+                <w:bCs w:val="0"/>
+                <w:sz w:val="19"/>
+                <w:szCs w:val="19"/>
+                <w:rtl w:val="0"/>
+              </w:rPr>
+              <w:t xml:space="preserve">12</w:t>
+            </w:r>
+          </w:p>
+        </w:tc>
+        <w:tc>
+          <w:tcPr>
+            <w:tcBorders>
+              <w:top w:color="a6a6a6" w:space="0" w:sz="4" w:val="single"/>
+              <w:left w:color="a6a6a6" w:space="0" w:sz="4" w:val="single"/>
+              <w:bottom w:color="a6a6a6" w:space="0" w:sz="4" w:val="single"/>
+              <w:right w:color="a6a6a6" w:space="0" w:sz="4" w:val="single"/>
+            </w:tcBorders>
+          </w:tcPr>
+          <w:p>
+            <w:pPr>
+              <w:spacing w:after="0" w:before="0" w:lineRule="auto"/>
+              <w:jc w:val="left"/>
+              <w:rPr/>
+            </w:pPr>
+            <w:r>
+              <w:rPr>
+                <w:b w:val="0"/>
+                <w:bCs w:val="0"/>
+                <w:sz w:val="19"/>
+                <w:szCs w:val="19"/>
+                <w:rtl w:val="0"/>
+              </w:rPr>
+              <w:t xml:space="preserve">Los materiales que entrega la API son los mismos que muestra el inventario del escritorio con el filtro «Solo bajo el minimo»</w:t>
+            </w:r>
+          </w:p>
+        </w:tc>
+        <w:tc>
+          <w:tcPr>
+            <w:tcBorders>
+              <w:top w:color="a6a6a6" w:space="0" w:sz="4" w:val="single"/>
+              <w:left w:color="a6a6a6" w:space="0" w:sz="4" w:val="single"/>
+              <w:bottom w:color="a6a6a6" w:space="0" w:sz="4" w:val="single"/>
+              <w:right w:color="a6a6a6" w:space="0" w:sz="4" w:val="single"/>
+            </w:tcBorders>
+          </w:tcPr>
+          <w:p>
+            <w:pPr>
+              <w:spacing w:after="0" w:before="0" w:lineRule="auto"/>
+              <w:jc w:val="left"/>
+              <w:rPr/>
+            </w:pPr>
+            <w:r>
+              <w:rPr>
+                <w:b w:val="0"/>
+                <w:bCs w:val="0"/>
+                <w:sz w:val="19"/>
+                <w:szCs w:val="19"/>
+                <w:rtl w:val="0"/>
+              </w:rPr>
+              <w:t xml:space="preserve">RF-INV-09</w:t>
+            </w:r>
+          </w:p>
+        </w:tc>
+        <w:tc>
+          <w:tcPr>
+            <w:tcBorders>
+              <w:top w:color="a6a6a6" w:space="0" w:sz="4" w:val="single"/>
+              <w:left w:color="a6a6a6" w:space="0" w:sz="4" w:val="single"/>
+              <w:bottom w:color="a6a6a6" w:space="0" w:sz="4" w:val="single"/>
+              <w:right w:color="a6a6a6" w:space="0" w:sz="4" w:val="single"/>
+            </w:tcBorders>
+          </w:tcPr>
+          <w:p>
+            <w:pPr>
+              <w:spacing w:after="0" w:before="0" w:lineRule="auto"/>
+              <w:jc w:val="center"/>
+              <w:rPr/>
+            </w:pPr>
+            <w:r>
+              <w:rPr>
+                <w:sz w:val="19"/>
+                <w:szCs w:val="19"/>
+                <w:highlight w:val="yellow"/>
+                <w:rtl w:val="0"/>
+              </w:rPr>
+              <w:t xml:space="preserve">PENDIENTE</w:t>
+            </w:r>
+          </w:p>
+        </w:tc>
+      </w:tr>
+      <w:tr>
+        <w:trPr>
+          <w:cantSplit w:val="0"/>
+          <w:tblHeader w:val="0"/>
+        </w:trPr>
+        <w:tc>
+          <w:tcPr>
+            <w:tcBorders>
+              <w:top w:color="a6a6a6" w:space="0" w:sz="4" w:val="single"/>
+              <w:left w:color="a6a6a6" w:space="0" w:sz="4" w:val="single"/>
+              <w:bottom w:color="a6a6a6" w:space="0" w:sz="4" w:val="single"/>
+              <w:right w:color="a6a6a6" w:space="0" w:sz="4" w:val="single"/>
+            </w:tcBorders>
+          </w:tcPr>
+          <w:p>
+            <w:pPr>
+              <w:spacing w:after="0" w:before="0" w:lineRule="auto"/>
+              <w:jc w:val="center"/>
+              <w:rPr/>
+            </w:pPr>
+            <w:r>
+              <w:rPr>
+                <w:b w:val="0"/>
+                <w:bCs w:val="0"/>
+                <w:sz w:val="19"/>
+                <w:szCs w:val="19"/>
+                <w:rtl w:val="0"/>
+              </w:rPr>
+              <w:t xml:space="preserve">13</w:t>
+            </w:r>
+          </w:p>
+        </w:tc>
+        <w:tc>
+          <w:tcPr>
+            <w:tcBorders>
+              <w:top w:color="a6a6a6" w:space="0" w:sz="4" w:val="single"/>
+              <w:left w:color="a6a6a6" w:space="0" w:sz="4" w:val="single"/>
+              <w:bottom w:color="a6a6a6" w:space="0" w:sz="4" w:val="single"/>
+              <w:right w:color="a6a6a6" w:space="0" w:sz="4" w:val="single"/>
+            </w:tcBorders>
+          </w:tcPr>
+          <w:p>
+            <w:pPr>
+              <w:spacing w:after="0" w:before="0" w:lineRule="auto"/>
+              <w:jc w:val="left"/>
+              <w:rPr/>
+            </w:pPr>
+            <w:r>
+              <w:rPr>
+                <w:b w:val="0"/>
+                <w:bCs w:val="0"/>
+                <w:sz w:val="19"/>
+                <w:szCs w:val="19"/>
+                <w:rtl w:val="0"/>
+              </w:rPr>
+              <w:t xml:space="preserve">Escritorio: al subir el stock mínimo de TNQ-01 por sobre su stock, la API lo incluye con cantidad sugerida = 2 × mínimo − stock</w:t>
+            </w:r>
+          </w:p>
+        </w:tc>
+        <w:tc>
+          <w:tcPr>
+            <w:tcBorders>
+              <w:top w:color="a6a6a6" w:space="0" w:sz="4" w:val="single"/>
+              <w:left w:color="a6a6a6" w:space="0" w:sz="4" w:val="single"/>
+              <w:bottom w:color="a6a6a6" w:space="0" w:sz="4" w:val="single"/>
+              <w:right w:color="a6a6a6" w:space="0" w:sz="4" w:val="single"/>
+            </w:tcBorders>
+          </w:tcPr>
+          <w:p>
+            <w:pPr>
+              <w:spacing w:after="0" w:before="0" w:lineRule="auto"/>
+              <w:jc w:val="left"/>
+              <w:rPr/>
+            </w:pPr>
+            <w:r>
+              <w:rPr>
+                <w:b w:val="0"/>
+                <w:bCs w:val="0"/>
+                <w:sz w:val="19"/>
+                <w:szCs w:val="19"/>
+                <w:rtl w:val="0"/>
+              </w:rPr>
+              <w:t xml:space="preserve">RF-INV-09</w:t>
+            </w:r>
+          </w:p>
+        </w:tc>
+        <w:tc>
+          <w:tcPr>
+            <w:tcBorders>
+              <w:top w:color="a6a6a6" w:space="0" w:sz="4" w:val="single"/>
+              <w:left w:color="a6a6a6" w:space="0" w:sz="4" w:val="single"/>
+              <w:bottom w:color="a6a6a6" w:space="0" w:sz="4" w:val="single"/>
+              <w:right w:color="a6a6a6" w:space="0" w:sz="4" w:val="single"/>
+            </w:tcBorders>
+          </w:tcPr>
+          <w:p>
+            <w:pPr>
+              <w:spacing w:after="0" w:before="0" w:lineRule="auto"/>
+              <w:jc w:val="center"/>
+              <w:rPr/>
+            </w:pPr>
+            <w:r>
+              <w:rPr>
+                <w:sz w:val="19"/>
+                <w:szCs w:val="19"/>
+                <w:highlight w:val="yellow"/>
+                <w:rtl w:val="0"/>
+              </w:rPr>
+              <w:t xml:space="preserve">PENDIENTE</w:t>
+            </w:r>
+          </w:p>
+        </w:tc>
+      </w:tr>
+      <w:tr>
+        <w:trPr>
+          <w:cantSplit w:val="0"/>
+          <w:tblHeader w:val="0"/>
+        </w:trPr>
+        <w:tc>
+          <w:tcPr>
+            <w:tcBorders>
+              <w:top w:color="a6a6a6" w:space="0" w:sz="4" w:val="single"/>
+              <w:left w:color="a6a6a6" w:space="0" w:sz="4" w:val="single"/>
+              <w:bottom w:color="a6a6a6" w:space="0" w:sz="4" w:val="single"/>
+              <w:right w:color="a6a6a6" w:space="0" w:sz="4" w:val="single"/>
+            </w:tcBorders>
+          </w:tcPr>
+          <w:p>
+            <w:pPr>
+              <w:spacing w:after="0" w:before="0" w:lineRule="auto"/>
+              <w:jc w:val="center"/>
+              <w:rPr/>
+            </w:pPr>
+            <w:r>
+              <w:rPr>
+                <w:b w:val="0"/>
+                <w:bCs w:val="0"/>
+                <w:sz w:val="19"/>
+                <w:szCs w:val="19"/>
+                <w:rtl w:val="0"/>
+              </w:rPr>
+              <w:t xml:space="preserve">14</w:t>
+            </w:r>
+          </w:p>
+        </w:tc>
+        <w:tc>
+          <w:tcPr>
+            <w:tcBorders>
+              <w:top w:color="a6a6a6" w:space="0" w:sz="4" w:val="single"/>
+              <w:left w:color="a6a6a6" w:space="0" w:sz="4" w:val="single"/>
+              <w:bottom w:color="a6a6a6" w:space="0" w:sz="4" w:val="single"/>
+              <w:right w:color="a6a6a6" w:space="0" w:sz="4" w:val="single"/>
+            </w:tcBorders>
+          </w:tcPr>
+          <w:p>
+            <w:pPr>
+              <w:spacing w:after="0" w:before="0" w:lineRule="auto"/>
+              <w:jc w:val="left"/>
+              <w:rPr/>
+            </w:pPr>
+            <w:r>
+              <w:rPr>
+                <w:b w:val="0"/>
+                <w:bCs w:val="0"/>
+                <w:sz w:val="19"/>
+                <w:szCs w:val="19"/>
+                <w:rtl w:val="0"/>
+              </w:rPr>
+              <w:t xml:space="preserve">Swagger: materiales con las claves portal-web y portal-clientes responde 403, sin datos del inventario</w:t>
+            </w:r>
+          </w:p>
+        </w:tc>
+        <w:tc>
+          <w:tcPr>
+            <w:tcBorders>
+              <w:top w:color="a6a6a6" w:space="0" w:sz="4" w:val="single"/>
+              <w:left w:color="a6a6a6" w:space="0" w:sz="4" w:val="single"/>
+              <w:bottom w:color="a6a6a6" w:space="0" w:sz="4" w:val="single"/>
+              <w:right w:color="a6a6a6" w:space="0" w:sz="4" w:val="single"/>
+            </w:tcBorders>
+          </w:tcPr>
+          <w:p>
+            <w:pPr>
+              <w:spacing w:after="0" w:before="0" w:lineRule="auto"/>
+              <w:jc w:val="left"/>
+              <w:rPr/>
+            </w:pPr>
+            <w:r>
+              <w:rPr>
+                <w:b w:val="0"/>
+                <w:bCs w:val="0"/>
+                <w:sz w:val="19"/>
+                <w:szCs w:val="19"/>
+                <w:rtl w:val="0"/>
+              </w:rPr>
+              <w:t xml:space="preserve">RF-INT-04</w:t>
+            </w:r>
+          </w:p>
+        </w:tc>
+        <w:tc>
+          <w:tcPr>
+            <w:tcBorders>
+              <w:top w:color="a6a6a6" w:space="0" w:sz="4" w:val="single"/>
+              <w:left w:color="a6a6a6" w:space="0" w:sz="4" w:val="single"/>
+              <w:bottom w:color="a6a6a6" w:space="0" w:sz="4" w:val="single"/>
+              <w:right w:color="a6a6a6" w:space="0" w:sz="4" w:val="single"/>
+            </w:tcBorders>
+          </w:tcPr>
+          <w:p>
+            <w:pPr>
+              <w:spacing w:after="0" w:before="0" w:lineRule="auto"/>
+              <w:jc w:val="center"/>
+              <w:rPr/>
+            </w:pPr>
+            <w:r>
+              <w:rPr>
+                <w:sz w:val="19"/>
+                <w:szCs w:val="19"/>
+                <w:highlight w:val="yellow"/>
+                <w:rtl w:val="0"/>
+              </w:rPr>
+              <w:t xml:space="preserve">PENDIENTE</w:t>
+            </w:r>
+          </w:p>
+        </w:tc>
+      </w:tr>
+      <w:tr>
+        <w:trPr>
+          <w:cantSplit w:val="0"/>
+          <w:tblHeader w:val="0"/>
+        </w:trPr>
+        <w:tc>
+          <w:tcPr>
+            <w:tcBorders>
+              <w:top w:color="a6a6a6" w:space="0" w:sz="4" w:val="single"/>
+              <w:left w:color="a6a6a6" w:space="0" w:sz="4" w:val="single"/>
+              <w:bottom w:color="a6a6a6" w:space="0" w:sz="4" w:val="single"/>
+              <w:right w:color="a6a6a6" w:space="0" w:sz="4" w:val="single"/>
+            </w:tcBorders>
+          </w:tcPr>
+          <w:p>
+            <w:pPr>
+              <w:spacing w:after="0" w:before="0" w:lineRule="auto"/>
+              <w:jc w:val="center"/>
+              <w:rPr/>
+            </w:pPr>
+            <w:r>
+              <w:rPr>
+                <w:b w:val="0"/>
+                <w:bCs w:val="0"/>
+                <w:sz w:val="19"/>
+                <w:szCs w:val="19"/>
+                <w:rtl w:val="0"/>
+              </w:rPr>
+              <w:t xml:space="preserve">15</w:t>
+            </w:r>
+          </w:p>
+        </w:tc>
+        <w:tc>
+          <w:tcPr>
+            <w:tcBorders>
+              <w:top w:color="a6a6a6" w:space="0" w:sz="4" w:val="single"/>
+              <w:left w:color="a6a6a6" w:space="0" w:sz="4" w:val="single"/>
+              <w:bottom w:color="a6a6a6" w:space="0" w:sz="4" w:val="single"/>
+              <w:right w:color="a6a6a6" w:space="0" w:sz="4" w:val="single"/>
+            </w:tcBorders>
+          </w:tcPr>
+          <w:p>
+            <w:pPr>
+              <w:spacing w:after="0" w:before="0" w:lineRule="auto"/>
+              <w:jc w:val="left"/>
+              <w:rPr/>
+            </w:pPr>
+            <w:r>
+              <w:rPr>
+                <w:b w:val="0"/>
+                <w:bCs w:val="0"/>
+                <w:sz w:val="19"/>
+                <w:szCs w:val="19"/>
+                <w:rtl w:val="0"/>
+              </w:rPr>
+              <w:t xml:space="preserve">Swagger: materiales sin clave responde 401</w:t>
+            </w:r>
+          </w:p>
+        </w:tc>
+        <w:tc>
+          <w:tcPr>
+            <w:tcBorders>
+              <w:top w:color="a6a6a6" w:space="0" w:sz="4" w:val="single"/>
+              <w:left w:color="a6a6a6" w:space="0" w:sz="4" w:val="single"/>
+              <w:bottom w:color="a6a6a6" w:space="0" w:sz="4" w:val="single"/>
+              <w:right w:color="a6a6a6" w:space="0" w:sz="4" w:val="single"/>
+            </w:tcBorders>
+          </w:tcPr>
+          <w:p>
+            <w:pPr>
+              <w:spacing w:after="0" w:before="0" w:lineRule="auto"/>
+              <w:jc w:val="left"/>
+              <w:rPr/>
+            </w:pPr>
+            <w:r>
+              <w:rPr>
+                <w:b w:val="0"/>
+                <w:bCs w:val="0"/>
+                <w:sz w:val="19"/>
+                <w:szCs w:val="19"/>
+                <w:rtl w:val="0"/>
+              </w:rPr>
+              <w:t xml:space="preserve">RF-INT-04</w:t>
+            </w:r>
+          </w:p>
+        </w:tc>
+        <w:tc>
+          <w:tcPr>
+            <w:tcBorders>
+              <w:top w:color="a6a6a6" w:space="0" w:sz="4" w:val="single"/>
+              <w:left w:color="a6a6a6" w:space="0" w:sz="4" w:val="single"/>
+              <w:bottom w:color="a6a6a6" w:space="0" w:sz="4" w:val="single"/>
+              <w:right w:color="a6a6a6" w:space="0" w:sz="4" w:val="single"/>
+            </w:tcBorders>
+          </w:tcPr>
+          <w:p>
+            <w:pPr>
+              <w:spacing w:after="0" w:before="0" w:lineRule="auto"/>
+              <w:jc w:val="center"/>
+              <w:rPr/>
+            </w:pPr>
+            <w:r>
+              <w:rPr>
+                <w:sz w:val="19"/>
+                <w:szCs w:val="19"/>
+                <w:highlight w:val="yellow"/>
+                <w:rtl w:val="0"/>
+              </w:rPr>
+              <w:t xml:space="preserve">PENDIENTE</w:t>
+            </w:r>
+          </w:p>
+        </w:tc>
+      </w:tr>
+      <w:tr>
+        <w:trPr>
+          <w:cantSplit w:val="0"/>
+          <w:tblHeader w:val="0"/>
+        </w:trPr>
+        <w:tc>
+          <w:tcPr>
+            <w:tcBorders>
+              <w:top w:color="a6a6a6" w:space="0" w:sz="4" w:val="single"/>
+              <w:left w:color="a6a6a6" w:space="0" w:sz="4" w:val="single"/>
+              <w:bottom w:color="a6a6a6" w:space="0" w:sz="4" w:val="single"/>
+              <w:right w:color="a6a6a6" w:space="0" w:sz="4" w:val="single"/>
+            </w:tcBorders>
+          </w:tcPr>
+          <w:p>
+            <w:pPr>
+              <w:spacing w:after="0" w:before="0" w:lineRule="auto"/>
+              <w:jc w:val="center"/>
+              <w:rPr/>
+            </w:pPr>
+            <w:r>
+              <w:rPr>
+                <w:b w:val="0"/>
+                <w:bCs w:val="0"/>
+                <w:sz w:val="19"/>
+                <w:szCs w:val="19"/>
+                <w:rtl w:val="0"/>
+              </w:rPr>
+              <w:t xml:space="preserve">16</w:t>
+            </w:r>
+          </w:p>
+        </w:tc>
+        <w:tc>
+          <w:tcPr>
+            <w:tcBorders>
+              <w:top w:color="a6a6a6" w:space="0" w:sz="4" w:val="single"/>
+              <w:left w:color="a6a6a6" w:space="0" w:sz="4" w:val="single"/>
+              <w:bottom w:color="a6a6a6" w:space="0" w:sz="4" w:val="single"/>
+              <w:right w:color="a6a6a6" w:space="0" w:sz="4" w:val="single"/>
+            </w:tcBorders>
+          </w:tcPr>
+          <w:p>
+            <w:pPr>
+              <w:spacing w:after="0" w:before="0" w:lineRule="auto"/>
+              <w:jc w:val="left"/>
+              <w:rPr/>
+            </w:pPr>
+            <w:r>
+              <w:rPr>
+                <w:b w:val="0"/>
+                <w:bCs w:val="0"/>
+                <w:sz w:val="19"/>
+                <w:szCs w:val="19"/>
+                <w:rtl w:val="0"/>
+              </w:rPr>
+              <w:t xml:space="preserve">Escritorio: el registro de integraciones muestra las consultas api_materiales con su código de respuesta y latencia</w:t>
+            </w:r>
+          </w:p>
+        </w:tc>
+        <w:tc>
+          <w:tcPr>
+            <w:tcBorders>
+              <w:top w:color="a6a6a6" w:space="0" w:sz="4" w:val="single"/>
+              <w:left w:color="a6a6a6" w:space="0" w:sz="4" w:val="single"/>
+              <w:bottom w:color="a6a6a6" w:space="0" w:sz="4" w:val="single"/>
+              <w:right w:color="a6a6a6" w:space="0" w:sz="4" w:val="single"/>
+            </w:tcBorders>
+          </w:tcPr>
+          <w:p>
+            <w:pPr>
+              <w:spacing w:after="0" w:before="0" w:lineRule="auto"/>
+              <w:jc w:val="left"/>
+              <w:rPr/>
+            </w:pPr>
+            <w:r>
+              <w:rPr>
+                <w:b w:val="0"/>
+                <w:bCs w:val="0"/>
+                <w:sz w:val="19"/>
+                <w:szCs w:val="19"/>
+                <w:rtl w:val="0"/>
+              </w:rPr>
+              <w:t xml:space="preserve">RF-INT-01</w:t>
+            </w:r>
+          </w:p>
+        </w:tc>
+        <w:tc>
+          <w:tcPr>
+            <w:tcBorders>
+              <w:top w:color="a6a6a6" w:space="0" w:sz="4" w:val="single"/>
+              <w:left w:color="a6a6a6" w:space="0" w:sz="4" w:val="single"/>
+              <w:bottom w:color="a6a6a6" w:space="0" w:sz="4" w:val="single"/>
+              <w:right w:color="a6a6a6" w:space="0" w:sz="4" w:val="single"/>
+            </w:tcBorders>
+          </w:tcPr>
+          <w:p>
+            <w:pPr>
+              <w:spacing w:after="0" w:before="0" w:lineRule="auto"/>
+              <w:jc w:val="center"/>
+              <w:rPr/>
+            </w:pPr>
+            <w:r>
+              <w:rPr>
+                <w:sz w:val="19"/>
+                <w:szCs w:val="19"/>
+                <w:highlight w:val="yellow"/>
+                <w:rtl w:val="0"/>
+              </w:rPr>
+              <w:t xml:space="preserve">PENDIENTE</w:t>
+            </w:r>
+          </w:p>
+        </w:tc>
+      </w:tr>
     </w:tbl>
     <w:p>
       <w:pPr>
@@ -9179,7 +10038,24 @@
           <w:bCs w:val="1"/>
           <w:rtl w:val="0"/>
         </w:rPr>
-        <w:t xml:space="preserve">Resultado: 10 de 10 casos aprobados.</w:t>
+        <w:t xml:space="preserve">Resultado: </w:t>
+      </w:r>
+      <w:r>
+        <w:rPr>
+          <w:b w:val="1"/>
+          <w:bCs w:val="1"/>
+          <w:highlight w:val="yellow"/>
+          <w:rtl w:val="0"/>
+        </w:rPr>
+        <w:t xml:space="preserve">__ de 16</w:t>
+      </w:r>
+      <w:r>
+        <w:rPr>
+          <w:b w:val="1"/>
+          <w:bCs w:val="1"/>
+          <w:rtl w:val="0"/>
+        </w:rPr>
+        <w:t xml:space="preserve"> casos aprobados.</w:t>
       </w:r>
     </w:p>
     <w:p>
@@ -9211,6 +10087,20 @@
           <w:rtl w:val="0"/>
         </w:rPr>
         <w:t xml:space="preserve">Pruebas automatizadas de las APIs y suite completa:</w:t>
+      </w:r>
+    </w:p>
+    <w:p>
+      <w:pPr>
+        <w:spacing w:after="200" w:before="0" w:lineRule="auto"/>
+        <w:jc w:val="center"/>
+        <w:rPr/>
+      </w:pPr>
+      <w:r>
+        <w:rPr>
+          <w:b/>
+          <w:highlight w:val="yellow"/>
+        </w:rPr>
+        <w:t xml:space="preserve">[Reemplazar esta captura por la nueva: 55 pruebas de las APIs y 291 de la suite. Clic derecho en la imagen → Cambiar imagen.]</w:t>
       </w:r>
     </w:p>
     <w:p>
@@ -9364,6 +10254,87 @@
     </w:p>
     <w:p>
       <w:pPr>
+        <w:keepNext/>
+        <w:spacing w:after="120" w:before="0" w:line="276" w:lineRule="auto"/>
+        <w:rPr/>
+      </w:pPr>
+      <w:r>
+        <w:rPr>
+          <w:rtl w:val="0"/>
+        </w:rPr>
+        <w:t xml:space="preserve">Caso 11, materiales a reponer con la clave proveedores:</w:t>
+      </w:r>
+    </w:p>
+    <w:p>
+      <w:pPr>
+        <w:spacing w:after="200" w:before="0" w:lineRule="auto"/>
+        <w:jc w:val="center"/>
+        <w:rPr/>
+      </w:pPr>
+      <w:r>
+        <w:rPr>
+          <w:b/>
+          <w:highlight w:val="yellow"/>
+        </w:rPr>
+        <w:t xml:space="preserve">[Pegar aquí la captura de Swagger con la respuesta 200 de la clave proveedores]</w:t>
+      </w:r>
+    </w:p>
+    <w:p>
+      <w:pPr>
+        <w:keepNext/>
+        <w:spacing w:after="120" w:before="0" w:line="276" w:lineRule="auto"/>
+        <w:rPr/>
+      </w:pPr>
+      <w:r>
+        <w:rPr>
+          <w:rtl w:val="0"/>
+        </w:rPr>
+        <w:t xml:space="preserve">Caso 14, la clave del portal no tiene acceso a la disponibilidad de materiales:</w:t>
+      </w:r>
+    </w:p>
+    <w:p>
+      <w:pPr>
+        <w:spacing w:after="200" w:before="0" w:lineRule="auto"/>
+        <w:jc w:val="center"/>
+        <w:rPr/>
+      </w:pPr>
+      <w:r>
+        <w:rPr>
+          <w:b/>
+          <w:highlight w:val="yellow"/>
+        </w:rPr>
+        <w:t xml:space="preserve">[Pegar aquí la captura de Swagger con la respuesta 403 de la clave portal-web]</w:t>
+      </w:r>
+    </w:p>
+    <w:p>
+      <w:pPr>
+        <w:keepNext/>
+        <w:spacing w:after="120" w:before="0" w:line="276" w:lineRule="auto"/>
+        <w:rPr/>
+      </w:pPr>
+      <w:r>
+        <w:rPr>
+          <w:rtl w:val="0"/>
+        </w:rPr>
+        <w:t xml:space="preserve">Caso 16, consultas api_materiales en el registro de integraciones:</w:t>
+      </w:r>
+    </w:p>
+    <w:p>
+      <w:pPr>
+        <w:spacing w:after="200" w:before="0" w:lineRule="auto"/>
+        <w:jc w:val="center"/>
+        <w:rPr/>
+      </w:pPr>
+      <w:r>
+        <w:rPr>
+          <w:b/>
+          <w:highlight w:val="yellow"/>
+        </w:rPr>
+        <w:t xml:space="preserve">[Pegar aquí la captura del registro de integraciones del escritorio]</w:t>
+      </w:r>
+    </w:p>
+    <w:p>
+      <w:pPr>
         <w:pStyle w:val="Heading2"/>
         <w:keepNext/>
         <w:rPr>
@@ -9866,7 +10837,7 @@
                 <w:szCs w:val="19"/>
                 <w:rtl w:val="0"/>
               </w:rPr>
-              <w:t xml:space="preserve">Salida de las 43 pruebas de las APIs y de la suite completa</w:t>
+              <w:t>Salida de las 55 pruebas de las APIs y de la suite completa</w:t>
             </w:r>
           </w:p>
         </w:tc>
@@ -10337,6 +11308,117 @@
           </w:p>
         </w:tc>
       </w:tr>
+      <w:tr>
+        <w:trPr>
+          <w:cantSplit w:val="0"/>
+          <w:tblHeader w:val="0"/>
+        </w:trPr>
+        <w:tc>
+          <w:tcPr>
+            <w:tcBorders>
+              <w:top w:color="a6a6a6" w:space="0" w:sz="4" w:val="single"/>
+              <w:left w:color="a6a6a6" w:space="0" w:sz="4" w:val="single"/>
+              <w:bottom w:color="a6a6a6" w:space="0" w:sz="4" w:val="single"/>
+              <w:right w:color="a6a6a6" w:space="0" w:sz="4" w:val="single"/>
+            </w:tcBorders>
+          </w:tcPr>
+          <w:p>
+            <w:pPr>
+              <w:spacing w:after="0" w:before="0" w:lineRule="auto"/>
+              <w:jc w:val="left"/>
+              <w:rPr/>
+            </w:pPr>
+            <w:r>
+              <w:rPr>
+                <w:sz w:val="19"/>
+                <w:szCs w:val="19"/>
+                <w:highlight w:val="yellow"/>
+                <w:rtl w:val="0"/>
+              </w:rPr>
+              <w:t xml:space="preserve">dd-mm-2026</w:t>
+            </w:r>
+          </w:p>
+        </w:tc>
+        <w:tc>
+          <w:tcPr>
+            <w:tcBorders>
+              <w:top w:color="a6a6a6" w:space="0" w:sz="4" w:val="single"/>
+              <w:left w:color="a6a6a6" w:space="0" w:sz="4" w:val="single"/>
+              <w:bottom w:color="a6a6a6" w:space="0" w:sz="4" w:val="single"/>
+              <w:right w:color="a6a6a6" w:space="0" w:sz="4" w:val="single"/>
+            </w:tcBorders>
+          </w:tcPr>
+          <w:p>
+            <w:pPr>
+              <w:spacing w:after="0" w:before="0" w:lineRule="auto"/>
+              <w:jc w:val="center"/>
+              <w:rPr/>
+            </w:pPr>
+            <w:r>
+              <w:rPr>
+                <w:b w:val="0"/>
+                <w:bCs w:val="0"/>
+                <w:sz w:val="19"/>
+                <w:szCs w:val="19"/>
+                <w:rtl w:val="0"/>
+              </w:rPr>
+              <w:t xml:space="preserve">1.2</w:t>
+            </w:r>
+          </w:p>
+        </w:tc>
+        <w:tc>
+          <w:tcPr>
+            <w:tcBorders>
+              <w:top w:color="a6a6a6" w:space="0" w:sz="4" w:val="single"/>
+              <w:left w:color="a6a6a6" w:space="0" w:sz="4" w:val="single"/>
+              <w:bottom w:color="a6a6a6" w:space="0" w:sz="4" w:val="single"/>
+              <w:right w:color="a6a6a6" w:space="0" w:sz="4" w:val="single"/>
+            </w:tcBorders>
+          </w:tcPr>
+          <w:p>
+            <w:pPr>
+              <w:spacing w:after="0" w:before="0" w:lineRule="auto"/>
+              <w:jc w:val="left"/>
+              <w:rPr/>
+            </w:pPr>
+            <w:r>
+              <w:rPr>
+                <w:b w:val="0"/>
+                <w:bCs w:val="0"/>
+                <w:sz w:val="19"/>
+                <w:szCs w:val="19"/>
+                <w:rtl w:val="0"/>
+              </w:rPr>
+              <w:t xml:space="preserve">API de disponibilidad de materiales (sección 6): 12 pruebas automatizadas nuevas (55 de las APIs y 291 de la suite completa) y casos manuales 11 a 16.</w:t>
+            </w:r>
+          </w:p>
+        </w:tc>
+        <w:tc>
+          <w:tcPr>
+            <w:tcBorders>
+              <w:top w:color="a6a6a6" w:space="0" w:sz="4" w:val="single"/>
+              <w:left w:color="a6a6a6" w:space="0" w:sz="4" w:val="single"/>
+              <w:bottom w:color="a6a6a6" w:space="0" w:sz="4" w:val="single"/>
+              <w:right w:color="a6a6a6" w:space="0" w:sz="4" w:val="single"/>
+            </w:tcBorders>
+          </w:tcPr>
+          <w:p>
+            <w:pPr>
+              <w:spacing w:after="0" w:before="0" w:lineRule="auto"/>
+              <w:jc w:val="left"/>
+              <w:rPr/>
+            </w:pPr>
+            <w:r>
+              <w:rPr>
+                <w:sz w:val="19"/>
+                <w:szCs w:val="19"/>
+                <w:rtl w:val="0"/>
+              </w:rPr>
+              <w:t xml:space="preserve">Milko Soto</w:t>
+            </w:r>
+          </w:p>
+        </w:tc>
+      </w:tr>
     </w:tbl>
     <w:p>
       <w:pPr>
@@ -10371,7 +11453,7 @@
       <w:footerReference r:id="rId19" w:type="first"/>
       <w:footerReference r:id="rId20" w:type="even"/>
       <w:pgSz w:h="16838" w:w="11906" w:orient="portrait"/>
-      <w:pgMar w:bottom="1440" w:top="1440" w:left="1440" w:right="1440" w:header="708" w:footer="708"/>
+      <w:pgMar w:bottom="1440" w:top="1440" w:left="1440" w:right="1440" w:header="708" w:footer="708" w:gutter="0"/>
       <w:pgNumType w:start="1"/>
     </w:sectPr>
   </w:body>
@@ -10531,7 +11613,7 @@
         <w:szCs w:val="16"/>
         <w:rtl w:val="0"/>
       </w:rPr>
-      <w:t xml:space="preserve">SITRAFO · Informe de pruebas de calidad en producción · PRU-01 v1.1</w:t>
+      <w:t>SITRAFO · Informe de pruebas de calidad en producción · PRU-01 v1.2</w:t>
     </w:r>
     <w:r>
       <w:rPr>

</xml_diff>

<commit_message>
Docs: SEC-01 corregido, PRU-01 v1.2 y EVI-01 v1.5 con la API de materiales - Milko Soto
</commit_message>
<xml_diff>
--- a/Fase 2/Evidencias Proyecto/Evidencias de Sistema/Pruebas de Calidad/SITRAFO_PRU-01_Informe_de_Pruebas.docx
+++ b/Fase 2/Evidencias Proyecto/Evidencias de Sistema/Pruebas de Calidad/SITRAFO_PRU-01_Informe_de_Pruebas.docx
@@ -82,6 +82,11 @@
         </w:rPr>
         <w:t xml:space="preserve">Seguridad (OWASP ZAP) · Prueba de carga · Pruebas de interfaz (Selenium) · APIs propias</w:t>
       </w:r>
+      <w:r>
+        <w:rPr>
+          <w:rtl w:val="0"/>
+        </w:rPr>
+      </w:r>
     </w:p>
     <w:p>
       <w:pPr>
@@ -97,7 +102,7 @@
           <w:szCs w:val="24"/>
           <w:rtl w:val="0"/>
         </w:rPr>
-        <w:t>PRU-01  ·  Versión 1.2</w:t>
+        <w:t xml:space="preserve">PRU-01  ·  Versión 1.2</w:t>
       </w:r>
       <w:r>
         <w:rPr>
@@ -604,6 +609,11 @@
               </w:rPr>
               <w:t xml:space="preserve">Sprint 2 (producción) y Sprint 3 (APIs propias)</w:t>
             </w:r>
+            <w:r>
+              <w:rPr>
+                <w:rtl w:val="0"/>
+              </w:rPr>
+            </w:r>
           </w:p>
         </w:tc>
       </w:tr>
@@ -667,7 +677,12 @@
                 <w:szCs w:val="19"/>
                 <w:rtl w:val="0"/>
               </w:rPr>
-              <w:t>RNF-03 (seguridad), RNF-06 y RNF-07 (rendimiento y concurrencia) e interfaz web del cliente; APIs propias: RF-OT-12, RF-COM-18, RF-INV-09, RF-INT-04 y RNF-21</w:t>
+              <w:t xml:space="preserve">RNF-03 (seguridad), RNF-06 y RNF-07 (rendimiento y concurrencia) e interfaz web del cliente; APIs propias: RF-OT-12, RF-COM-18, RF-INV-09, RF-INT-04 y RNF-21</w:t>
+            </w:r>
+            <w:r>
+              <w:rPr>
+                <w:rtl w:val="0"/>
+              </w:rPr>
             </w:r>
           </w:p>
         </w:tc>
@@ -800,31 +815,20 @@
                 <w:szCs w:val="19"/>
                 <w:rtl w:val="0"/>
               </w:rPr>
-            </w:r>
-            <w:r>
-              <w:rPr>
-                <w:sz w:val="19"/>
-                <w:szCs w:val="19"/>
-                <w:rtl w:val="0"/>
-              </w:rPr>
               <w:t xml:space="preserve">14-10-2026 (producción), 19-10-2026 (APIs propias) y </w:t>
             </w:r>
             <w:r>
               <w:rPr>
                 <w:sz w:val="19"/>
                 <w:szCs w:val="19"/>
-                <w:highlight w:val="yellow"/>
-                <w:rtl w:val="0"/>
-              </w:rPr>
-              <w:t xml:space="preserve">dd-mm-2026</w:t>
-            </w:r>
-            <w:r>
-              <w:rPr>
-                <w:sz w:val="19"/>
-                <w:szCs w:val="19"/>
-                <w:rtl w:val="0"/>
-              </w:rPr>
-              <w:t xml:space="preserve"> (API de materiales)</w:t>
+                <w:rtl w:val="0"/>
+              </w:rPr>
+              <w:t xml:space="preserve">26-10-2026 (API de materiales)</w:t>
+            </w:r>
+            <w:r>
+              <w:rPr>
+                <w:rtl w:val="0"/>
+              </w:rPr>
             </w:r>
           </w:p>
         </w:tc>
@@ -867,7 +871,7 @@
     </w:p>
     <w:sdt>
       <w:sdtPr>
-        <w:id w:val="-2007786641"/>
+        <w:id w:val="-900651405"/>
         <w:docPartObj>
           <w:docPartGallery w:val="Table of Contents"/>
           <w:docPartUnique w:val="1"/>
@@ -876,29 +880,15 @@
       <w:sdtContent>
         <w:p>
           <w:pPr>
-            <w:keepNext w:val="0"/>
-            <w:keepLines w:val="0"/>
-            <w:pageBreakBefore w:val="0"/>
-            <w:widowControl w:val="1"/>
-            <w:pBdr>
-              <w:top w:space="0" w:sz="0" w:val="nil"/>
-              <w:left w:space="0" w:sz="0" w:val="nil"/>
-              <w:bottom w:space="0" w:sz="0" w:val="nil"/>
-              <w:right w:space="0" w:sz="0" w:val="nil"/>
-              <w:between w:space="0" w:sz="0" w:val="nil"/>
-            </w:pBdr>
-            <w:shd w:fill="auto" w:val="clear"/>
+            <w:widowControl w:val="0"/>
             <w:tabs>
-              <w:tab w:val="right" w:leader="none" w:pos="9026"/>
-              <w:tab w:val="right" w:leader="none" w:pos="9025"/>
+              <w:tab w:val="right" w:leader="none" w:pos="12000"/>
             </w:tabs>
-            <w:spacing w:after="0" w:before="0" w:line="240" w:lineRule="auto"/>
-            <w:ind w:left="0" w:right="0" w:firstLine="0"/>
-            <w:jc w:val="left"/>
+            <w:spacing w:before="60" w:lineRule="auto"/>
             <w:rPr>
-              <w:rFonts w:ascii="Calibri" w:cs="Calibri" w:eastAsia="Calibri" w:hAnsi="Calibri"/>
-              <w:b w:val="0"/>
-              <w:bCs w:val="0"/>
+              <w:rFonts w:ascii="Arial" w:cs="Arial" w:eastAsia="Arial" w:hAnsi="Arial"/>
+              <w:b w:val="1"/>
+              <w:bCs w:val="1"/>
               <w:i w:val="0"/>
               <w:iCs w:val="0"/>
               <w:smallCaps w:val="0"/>
@@ -916,7 +906,7 @@
             <w:instrText xml:space="preserve"> TOC \h \u \z \t "Heading 1,1,Heading 2,2,"</w:instrText>
             <w:fldChar w:fldCharType="separate"/>
           </w:r>
-          <w:hyperlink w:anchor="_heading=h.unvmmtdzzicr">
+          <w:hyperlink w:anchor="_r9k0njgczgpj">
             <w:r>
               <w:rPr>
                 <w:rFonts w:ascii="Calibri" w:cs="Calibri" w:eastAsia="Calibri" w:hAnsi="Calibri"/>
@@ -947,27 +937,66 @@
         </w:p>
         <w:p>
           <w:pPr>
-            <w:keepNext w:val="0"/>
-            <w:keepLines w:val="0"/>
-            <w:pageBreakBefore w:val="0"/>
-            <w:widowControl w:val="1"/>
-            <w:pBdr>
-              <w:top w:space="0" w:sz="0" w:val="nil"/>
-              <w:left w:space="0" w:sz="0" w:val="nil"/>
-              <w:bottom w:space="0" w:sz="0" w:val="nil"/>
-              <w:right w:space="0" w:sz="0" w:val="nil"/>
-              <w:between w:space="0" w:sz="0" w:val="nil"/>
-            </w:pBdr>
-            <w:shd w:fill="auto" w:val="clear"/>
+            <w:widowControl w:val="0"/>
             <w:tabs>
-              <w:tab w:val="right" w:leader="none" w:pos="9026"/>
-              <w:tab w:val="right" w:leader="none" w:pos="9025"/>
+              <w:tab w:val="right" w:leader="none" w:pos="12000"/>
             </w:tabs>
-            <w:spacing w:after="0" w:before="0" w:line="240" w:lineRule="auto"/>
-            <w:ind w:left="0" w:right="0" w:firstLine="0"/>
-            <w:jc w:val="left"/>
+            <w:spacing w:before="60" w:lineRule="auto"/>
             <w:rPr>
-              <w:rFonts w:ascii="Calibri" w:cs="Calibri" w:eastAsia="Calibri" w:hAnsi="Calibri"/>
+              <w:rFonts w:ascii="Arial" w:cs="Arial" w:eastAsia="Arial" w:hAnsi="Arial"/>
+              <w:b w:val="1"/>
+              <w:bCs w:val="1"/>
+              <w:i w:val="0"/>
+              <w:iCs w:val="0"/>
+              <w:smallCaps w:val="0"/>
+              <w:strike w:val="0"/>
+              <w:color w:val="000000"/>
+              <w:sz w:val="22"/>
+              <w:szCs w:val="22"/>
+              <w:u w:val="none"/>
+              <w:shd w:fill="auto" w:val="clear"/>
+              <w:vertAlign w:val="baseline"/>
+            </w:rPr>
+          </w:pPr>
+          <w:hyperlink w:anchor="_ylyqtyj4hz2h">
+            <w:r>
+              <w:rPr>
+                <w:rFonts w:ascii="Calibri" w:cs="Calibri" w:eastAsia="Calibri" w:hAnsi="Calibri"/>
+                <w:b w:val="0"/>
+                <w:bCs w:val="0"/>
+                <w:i w:val="0"/>
+                <w:iCs w:val="0"/>
+                <w:smallCaps w:val="0"/>
+                <w:strike w:val="0"/>
+                <w:color w:val="000000"/>
+                <w:sz w:val="22"/>
+                <w:szCs w:val="22"/>
+                <w:u w:val="none"/>
+                <w:shd w:fill="auto" w:val="clear"/>
+                <w:vertAlign w:val="baseline"/>
+                <w:rtl w:val="0"/>
+              </w:rPr>
+              <w:t xml:space="preserve">2. Ambiente de prueba</w:t>
+              <w:tab/>
+              <w:t xml:space="preserve">3</w:t>
+            </w:r>
+          </w:hyperlink>
+          <w:r>
+            <w:rPr>
+              <w:rtl w:val="0"/>
+            </w:rPr>
+          </w:r>
+        </w:p>
+        <w:p>
+          <w:pPr>
+            <w:widowControl w:val="0"/>
+            <w:tabs>
+              <w:tab w:val="right" w:leader="none" w:pos="12000"/>
+            </w:tabs>
+            <w:spacing w:before="60" w:lineRule="auto"/>
+            <w:ind w:left="360" w:firstLine="0"/>
+            <w:rPr>
+              <w:rFonts w:ascii="Arial" w:cs="Arial" w:eastAsia="Arial" w:hAnsi="Arial"/>
               <w:b w:val="0"/>
               <w:bCs w:val="0"/>
               <w:i w:val="0"/>
@@ -982,7 +1011,7 @@
               <w:vertAlign w:val="baseline"/>
             </w:rPr>
           </w:pPr>
-          <w:hyperlink w:anchor="_heading=h.cl0megswmbqs">
+          <w:hyperlink w:anchor="_emsuan4nobp3">
             <w:r>
               <w:rPr>
                 <w:rFonts w:ascii="Calibri" w:cs="Calibri" w:eastAsia="Calibri" w:hAnsi="Calibri"/>
@@ -1000,7 +1029,7 @@
                 <w:vertAlign w:val="baseline"/>
                 <w:rtl w:val="0"/>
               </w:rPr>
-              <w:t xml:space="preserve">2. Ambiente de prueba</w:t>
+              <w:t xml:space="preserve">2.1 Limitaciones</w:t>
               <w:tab/>
               <w:t xml:space="preserve">3</w:t>
             </w:r>
@@ -1013,27 +1042,66 @@
         </w:p>
         <w:p>
           <w:pPr>
-            <w:keepNext w:val="0"/>
-            <w:keepLines w:val="0"/>
-            <w:pageBreakBefore w:val="0"/>
-            <w:widowControl w:val="1"/>
-            <w:pBdr>
-              <w:top w:space="0" w:sz="0" w:val="nil"/>
-              <w:left w:space="0" w:sz="0" w:val="nil"/>
-              <w:bottom w:space="0" w:sz="0" w:val="nil"/>
-              <w:right w:space="0" w:sz="0" w:val="nil"/>
-              <w:between w:space="0" w:sz="0" w:val="nil"/>
-            </w:pBdr>
-            <w:shd w:fill="auto" w:val="clear"/>
+            <w:widowControl w:val="0"/>
             <w:tabs>
-              <w:tab w:val="right" w:leader="none" w:pos="8743"/>
-              <w:tab w:val="right" w:leader="none" w:pos="9025"/>
+              <w:tab w:val="right" w:leader="none" w:pos="12000"/>
             </w:tabs>
-            <w:spacing w:after="0" w:before="0" w:line="240" w:lineRule="auto"/>
-            <w:ind w:left="283" w:right="0" w:firstLine="0"/>
-            <w:jc w:val="left"/>
+            <w:spacing w:before="60" w:lineRule="auto"/>
             <w:rPr>
-              <w:rFonts w:ascii="Calibri" w:cs="Calibri" w:eastAsia="Calibri" w:hAnsi="Calibri"/>
+              <w:rFonts w:ascii="Arial" w:cs="Arial" w:eastAsia="Arial" w:hAnsi="Arial"/>
+              <w:b w:val="1"/>
+              <w:bCs w:val="1"/>
+              <w:i w:val="0"/>
+              <w:iCs w:val="0"/>
+              <w:smallCaps w:val="0"/>
+              <w:strike w:val="0"/>
+              <w:color w:val="000000"/>
+              <w:sz w:val="22"/>
+              <w:szCs w:val="22"/>
+              <w:u w:val="none"/>
+              <w:shd w:fill="auto" w:val="clear"/>
+              <w:vertAlign w:val="baseline"/>
+            </w:rPr>
+          </w:pPr>
+          <w:hyperlink w:anchor="_1s7w8xitgr0d">
+            <w:r>
+              <w:rPr>
+                <w:rFonts w:ascii="Calibri" w:cs="Calibri" w:eastAsia="Calibri" w:hAnsi="Calibri"/>
+                <w:b w:val="0"/>
+                <w:bCs w:val="0"/>
+                <w:i w:val="0"/>
+                <w:iCs w:val="0"/>
+                <w:smallCaps w:val="0"/>
+                <w:strike w:val="0"/>
+                <w:color w:val="000000"/>
+                <w:sz w:val="22"/>
+                <w:szCs w:val="22"/>
+                <w:u w:val="none"/>
+                <w:shd w:fill="auto" w:val="clear"/>
+                <w:vertAlign w:val="baseline"/>
+                <w:rtl w:val="0"/>
+              </w:rPr>
+              <w:t xml:space="preserve">3. Análisis de seguridad con OWASP ZAP</w:t>
+              <w:tab/>
+              <w:t xml:space="preserve">3</w:t>
+            </w:r>
+          </w:hyperlink>
+          <w:r>
+            <w:rPr>
+              <w:rtl w:val="0"/>
+            </w:rPr>
+          </w:r>
+        </w:p>
+        <w:p>
+          <w:pPr>
+            <w:widowControl w:val="0"/>
+            <w:tabs>
+              <w:tab w:val="right" w:leader="none" w:pos="12000"/>
+            </w:tabs>
+            <w:spacing w:before="60" w:lineRule="auto"/>
+            <w:ind w:left="360" w:firstLine="0"/>
+            <w:rPr>
+              <w:rFonts w:ascii="Arial" w:cs="Arial" w:eastAsia="Arial" w:hAnsi="Arial"/>
               <w:b w:val="0"/>
               <w:bCs w:val="0"/>
               <w:i w:val="0"/>
@@ -1048,7 +1116,7 @@
               <w:vertAlign w:val="baseline"/>
             </w:rPr>
           </w:pPr>
-          <w:hyperlink w:anchor="_heading=h.sw9vjxdz021t">
+          <w:hyperlink w:anchor="_f59b46pffcd8">
             <w:r>
               <w:rPr>
                 <w:rFonts w:ascii="Calibri" w:cs="Calibri" w:eastAsia="Calibri" w:hAnsi="Calibri"/>
@@ -1066,7 +1134,7 @@
                 <w:vertAlign w:val="baseline"/>
                 <w:rtl w:val="0"/>
               </w:rPr>
-              <w:t xml:space="preserve">2.1 Limitaciones</w:t>
+              <w:t xml:space="preserve">3.1 Método</w:t>
               <w:tab/>
               <w:t xml:space="preserve">3</w:t>
             </w:r>
@@ -1079,27 +1147,14 @@
         </w:p>
         <w:p>
           <w:pPr>
-            <w:keepNext w:val="0"/>
-            <w:keepLines w:val="0"/>
-            <w:pageBreakBefore w:val="0"/>
-            <w:widowControl w:val="1"/>
-            <w:pBdr>
-              <w:top w:space="0" w:sz="0" w:val="nil"/>
-              <w:left w:space="0" w:sz="0" w:val="nil"/>
-              <w:bottom w:space="0" w:sz="0" w:val="nil"/>
-              <w:right w:space="0" w:sz="0" w:val="nil"/>
-              <w:between w:space="0" w:sz="0" w:val="nil"/>
-            </w:pBdr>
-            <w:shd w:fill="auto" w:val="clear"/>
+            <w:widowControl w:val="0"/>
             <w:tabs>
-              <w:tab w:val="right" w:leader="none" w:pos="9026"/>
-              <w:tab w:val="right" w:leader="none" w:pos="9025"/>
+              <w:tab w:val="right" w:leader="none" w:pos="12000"/>
             </w:tabs>
-            <w:spacing w:after="0" w:before="0" w:line="240" w:lineRule="auto"/>
-            <w:ind w:left="0" w:right="0" w:firstLine="0"/>
-            <w:jc w:val="left"/>
+            <w:spacing w:before="60" w:lineRule="auto"/>
+            <w:ind w:left="360" w:firstLine="0"/>
             <w:rPr>
-              <w:rFonts w:ascii="Calibri" w:cs="Calibri" w:eastAsia="Calibri" w:hAnsi="Calibri"/>
+              <w:rFonts w:ascii="Arial" w:cs="Arial" w:eastAsia="Arial" w:hAnsi="Arial"/>
               <w:b w:val="0"/>
               <w:bCs w:val="0"/>
               <w:i w:val="0"/>
@@ -1114,7 +1169,7 @@
               <w:vertAlign w:val="baseline"/>
             </w:rPr>
           </w:pPr>
-          <w:hyperlink w:anchor="_heading=h.sq1fkrjbft2y">
+          <w:hyperlink w:anchor="_jrh9gx186wya">
             <w:r>
               <w:rPr>
                 <w:rFonts w:ascii="Calibri" w:cs="Calibri" w:eastAsia="Calibri" w:hAnsi="Calibri"/>
@@ -1132,9 +1187,9 @@
                 <w:vertAlign w:val="baseline"/>
                 <w:rtl w:val="0"/>
               </w:rPr>
-              <w:t xml:space="preserve">3. Análisis de seguridad con OWASP ZAP</w:t>
+              <w:t xml:space="preserve">3.2 Alertas obtenidas</w:t>
               <w:tab/>
-              <w:t xml:space="preserve">3</w:t>
+              <w:t xml:space="preserve">4</w:t>
             </w:r>
           </w:hyperlink>
           <w:r>
@@ -1145,27 +1200,14 @@
         </w:p>
         <w:p>
           <w:pPr>
-            <w:keepNext w:val="0"/>
-            <w:keepLines w:val="0"/>
-            <w:pageBreakBefore w:val="0"/>
-            <w:widowControl w:val="1"/>
-            <w:pBdr>
-              <w:top w:space="0" w:sz="0" w:val="nil"/>
-              <w:left w:space="0" w:sz="0" w:val="nil"/>
-              <w:bottom w:space="0" w:sz="0" w:val="nil"/>
-              <w:right w:space="0" w:sz="0" w:val="nil"/>
-              <w:between w:space="0" w:sz="0" w:val="nil"/>
-            </w:pBdr>
-            <w:shd w:fill="auto" w:val="clear"/>
+            <w:widowControl w:val="0"/>
             <w:tabs>
-              <w:tab w:val="right" w:leader="none" w:pos="8743"/>
-              <w:tab w:val="right" w:leader="none" w:pos="9025"/>
+              <w:tab w:val="right" w:leader="none" w:pos="12000"/>
             </w:tabs>
-            <w:spacing w:after="0" w:before="0" w:line="240" w:lineRule="auto"/>
-            <w:ind w:left="283" w:right="0" w:firstLine="0"/>
-            <w:jc w:val="left"/>
+            <w:spacing w:before="60" w:lineRule="auto"/>
+            <w:ind w:left="360" w:firstLine="0"/>
             <w:rPr>
-              <w:rFonts w:ascii="Calibri" w:cs="Calibri" w:eastAsia="Calibri" w:hAnsi="Calibri"/>
+              <w:rFonts w:ascii="Arial" w:cs="Arial" w:eastAsia="Arial" w:hAnsi="Arial"/>
               <w:b w:val="0"/>
               <w:bCs w:val="0"/>
               <w:i w:val="0"/>
@@ -1180,7 +1222,7 @@
               <w:vertAlign w:val="baseline"/>
             </w:rPr>
           </w:pPr>
-          <w:hyperlink w:anchor="_heading=h.1penj6x32shv">
+          <w:hyperlink w:anchor="_ltjeqgwmq399">
             <w:r>
               <w:rPr>
                 <w:rFonts w:ascii="Calibri" w:cs="Calibri" w:eastAsia="Calibri" w:hAnsi="Calibri"/>
@@ -1198,9 +1240,9 @@
                 <w:vertAlign w:val="baseline"/>
                 <w:rtl w:val="0"/>
               </w:rPr>
-              <w:t xml:space="preserve">3.1 Método</w:t>
+              <w:t xml:space="preserve">3.3 Evaluación según el criterio del repositorio</w:t>
               <w:tab/>
-              <w:t xml:space="preserve">3</w:t>
+              <w:t xml:space="preserve">4</w:t>
             </w:r>
           </w:hyperlink>
           <w:r>
@@ -1211,27 +1253,118 @@
         </w:p>
         <w:p>
           <w:pPr>
-            <w:keepNext w:val="0"/>
-            <w:keepLines w:val="0"/>
-            <w:pageBreakBefore w:val="0"/>
-            <w:widowControl w:val="1"/>
-            <w:pBdr>
-              <w:top w:space="0" w:sz="0" w:val="nil"/>
-              <w:left w:space="0" w:sz="0" w:val="nil"/>
-              <w:bottom w:space="0" w:sz="0" w:val="nil"/>
-              <w:right w:space="0" w:sz="0" w:val="nil"/>
-              <w:between w:space="0" w:sz="0" w:val="nil"/>
-            </w:pBdr>
-            <w:shd w:fill="auto" w:val="clear"/>
+            <w:widowControl w:val="0"/>
             <w:tabs>
-              <w:tab w:val="right" w:leader="none" w:pos="8743"/>
-              <w:tab w:val="right" w:leader="none" w:pos="9025"/>
+              <w:tab w:val="right" w:leader="none" w:pos="12000"/>
             </w:tabs>
-            <w:spacing w:after="0" w:before="0" w:line="240" w:lineRule="auto"/>
-            <w:ind w:left="283" w:right="0" w:firstLine="0"/>
-            <w:jc w:val="left"/>
+            <w:spacing w:before="60" w:lineRule="auto"/>
             <w:rPr>
-              <w:rFonts w:ascii="Calibri" w:cs="Calibri" w:eastAsia="Calibri" w:hAnsi="Calibri"/>
+              <w:rFonts w:ascii="Arial" w:cs="Arial" w:eastAsia="Arial" w:hAnsi="Arial"/>
+              <w:b w:val="1"/>
+              <w:bCs w:val="1"/>
+              <w:i w:val="0"/>
+              <w:iCs w:val="0"/>
+              <w:smallCaps w:val="0"/>
+              <w:strike w:val="0"/>
+              <w:color w:val="000000"/>
+              <w:sz w:val="22"/>
+              <w:szCs w:val="22"/>
+              <w:u w:val="none"/>
+              <w:shd w:fill="auto" w:val="clear"/>
+              <w:vertAlign w:val="baseline"/>
+            </w:rPr>
+          </w:pPr>
+          <w:hyperlink w:anchor="_hur4fhcyspp">
+            <w:r>
+              <w:rPr>
+                <w:rFonts w:ascii="Calibri" w:cs="Calibri" w:eastAsia="Calibri" w:hAnsi="Calibri"/>
+                <w:b w:val="0"/>
+                <w:bCs w:val="0"/>
+                <w:i w:val="0"/>
+                <w:iCs w:val="0"/>
+                <w:smallCaps w:val="0"/>
+                <w:strike w:val="0"/>
+                <w:color w:val="000000"/>
+                <w:sz w:val="22"/>
+                <w:szCs w:val="22"/>
+                <w:u w:val="none"/>
+                <w:shd w:fill="auto" w:val="clear"/>
+                <w:vertAlign w:val="baseline"/>
+                <w:rtl w:val="0"/>
+              </w:rPr>
+              <w:t xml:space="preserve">4. Prueba de carga</w:t>
+              <w:tab/>
+              <w:t xml:space="preserve">4</w:t>
+            </w:r>
+          </w:hyperlink>
+          <w:r>
+            <w:rPr>
+              <w:rtl w:val="0"/>
+            </w:rPr>
+          </w:r>
+        </w:p>
+        <w:p>
+          <w:pPr>
+            <w:widowControl w:val="0"/>
+            <w:tabs>
+              <w:tab w:val="right" w:leader="none" w:pos="12000"/>
+            </w:tabs>
+            <w:spacing w:before="60" w:lineRule="auto"/>
+            <w:rPr>
+              <w:rFonts w:ascii="Arial" w:cs="Arial" w:eastAsia="Arial" w:hAnsi="Arial"/>
+              <w:b w:val="1"/>
+              <w:bCs w:val="1"/>
+              <w:i w:val="0"/>
+              <w:iCs w:val="0"/>
+              <w:smallCaps w:val="0"/>
+              <w:strike w:val="0"/>
+              <w:color w:val="000000"/>
+              <w:sz w:val="22"/>
+              <w:szCs w:val="22"/>
+              <w:u w:val="none"/>
+              <w:shd w:fill="auto" w:val="clear"/>
+              <w:vertAlign w:val="baseline"/>
+            </w:rPr>
+          </w:pPr>
+          <w:hyperlink w:anchor="_vobk4k4su2za">
+            <w:r>
+              <w:rPr>
+                <w:rFonts w:ascii="Calibri" w:cs="Calibri" w:eastAsia="Calibri" w:hAnsi="Calibri"/>
+                <w:b w:val="0"/>
+                <w:bCs w:val="0"/>
+                <w:i w:val="0"/>
+                <w:iCs w:val="0"/>
+                <w:smallCaps w:val="0"/>
+                <w:strike w:val="0"/>
+                <w:color w:val="000000"/>
+                <w:sz w:val="22"/>
+                <w:szCs w:val="22"/>
+                <w:u w:val="none"/>
+                <w:shd w:fill="auto" w:val="clear"/>
+                <w:vertAlign w:val="baseline"/>
+                <w:rtl w:val="0"/>
+              </w:rPr>
+              <w:t xml:space="preserve">5. Pruebas de interfaz con Selenium</w:t>
+              <w:tab/>
+              <w:t xml:space="preserve">5</w:t>
+            </w:r>
+          </w:hyperlink>
+          <w:r>
+            <w:rPr>
+              <w:rtl w:val="0"/>
+            </w:rPr>
+          </w:r>
+        </w:p>
+        <w:p>
+          <w:pPr>
+            <w:widowControl w:val="0"/>
+            <w:tabs>
+              <w:tab w:val="right" w:leader="none" w:pos="12000"/>
+            </w:tabs>
+            <w:spacing w:before="60" w:lineRule="auto"/>
+            <w:ind w:left="360" w:firstLine="0"/>
+            <w:rPr>
+              <w:rFonts w:ascii="Arial" w:cs="Arial" w:eastAsia="Arial" w:hAnsi="Arial"/>
               <w:b w:val="0"/>
               <w:bCs w:val="0"/>
               <w:i w:val="0"/>
@@ -1246,7 +1379,7 @@
               <w:vertAlign w:val="baseline"/>
             </w:rPr>
           </w:pPr>
-          <w:hyperlink w:anchor="_heading=h.i5yghsed6kjf">
+          <w:hyperlink w:anchor="_6mtpv463p0ib">
             <w:r>
               <w:rPr>
                 <w:rFonts w:ascii="Calibri" w:cs="Calibri" w:eastAsia="Calibri" w:hAnsi="Calibri"/>
@@ -1264,9 +1397,9 @@
                 <w:vertAlign w:val="baseline"/>
                 <w:rtl w:val="0"/>
               </w:rPr>
-              <w:t xml:space="preserve">3.2 Alertas obtenidas</w:t>
+              <w:t xml:space="preserve">5.1 Evidencias</w:t>
               <w:tab/>
-              <w:t xml:space="preserve">4</w:t>
+              <w:t xml:space="preserve">5</w:t>
             </w:r>
           </w:hyperlink>
           <w:r>
@@ -1277,27 +1410,14 @@
         </w:p>
         <w:p>
           <w:pPr>
-            <w:keepNext w:val="0"/>
-            <w:keepLines w:val="0"/>
-            <w:pageBreakBefore w:val="0"/>
-            <w:widowControl w:val="1"/>
-            <w:pBdr>
-              <w:top w:space="0" w:sz="0" w:val="nil"/>
-              <w:left w:space="0" w:sz="0" w:val="nil"/>
-              <w:bottom w:space="0" w:sz="0" w:val="nil"/>
-              <w:right w:space="0" w:sz="0" w:val="nil"/>
-              <w:between w:space="0" w:sz="0" w:val="nil"/>
-            </w:pBdr>
-            <w:shd w:fill="auto" w:val="clear"/>
+            <w:widowControl w:val="0"/>
             <w:tabs>
-              <w:tab w:val="right" w:leader="none" w:pos="8743"/>
-              <w:tab w:val="right" w:leader="none" w:pos="9025"/>
+              <w:tab w:val="right" w:leader="none" w:pos="12000"/>
             </w:tabs>
-            <w:spacing w:after="0" w:before="0" w:line="240" w:lineRule="auto"/>
-            <w:ind w:left="283" w:right="0" w:firstLine="0"/>
-            <w:jc w:val="left"/>
+            <w:spacing w:before="60" w:lineRule="auto"/>
+            <w:ind w:left="360" w:firstLine="0"/>
             <w:rPr>
-              <w:rFonts w:ascii="Calibri" w:cs="Calibri" w:eastAsia="Calibri" w:hAnsi="Calibri"/>
+              <w:rFonts w:ascii="Arial" w:cs="Arial" w:eastAsia="Arial" w:hAnsi="Arial"/>
               <w:b w:val="0"/>
               <w:bCs w:val="0"/>
               <w:i w:val="0"/>
@@ -1312,7 +1432,7 @@
               <w:vertAlign w:val="baseline"/>
             </w:rPr>
           </w:pPr>
-          <w:hyperlink w:anchor="_heading=h.ynt2xouxq3lu">
+          <w:hyperlink w:anchor="_4rod2kdj49im">
             <w:r>
               <w:rPr>
                 <w:rFonts w:ascii="Calibri" w:cs="Calibri" w:eastAsia="Calibri" w:hAnsi="Calibri"/>
@@ -1330,9 +1450,9 @@
                 <w:vertAlign w:val="baseline"/>
                 <w:rtl w:val="0"/>
               </w:rPr>
-              <w:t xml:space="preserve">3.3 Evaluación según el criterio del repositorio</w:t>
+              <w:t xml:space="preserve">5.2 Cómo repetir las pruebas</w:t>
               <w:tab/>
-              <w:t xml:space="preserve">4</w:t>
+              <w:t xml:space="preserve">8</w:t>
             </w:r>
           </w:hyperlink>
           <w:r>
@@ -1343,27 +1463,66 @@
         </w:p>
         <w:p>
           <w:pPr>
-            <w:keepNext w:val="0"/>
-            <w:keepLines w:val="0"/>
-            <w:pageBreakBefore w:val="0"/>
-            <w:widowControl w:val="1"/>
-            <w:pBdr>
-              <w:top w:space="0" w:sz="0" w:val="nil"/>
-              <w:left w:space="0" w:sz="0" w:val="nil"/>
-              <w:bottom w:space="0" w:sz="0" w:val="nil"/>
-              <w:right w:space="0" w:sz="0" w:val="nil"/>
-              <w:between w:space="0" w:sz="0" w:val="nil"/>
-            </w:pBdr>
-            <w:shd w:fill="auto" w:val="clear"/>
+            <w:widowControl w:val="0"/>
             <w:tabs>
-              <w:tab w:val="right" w:leader="none" w:pos="9026"/>
-              <w:tab w:val="right" w:leader="none" w:pos="9025"/>
+              <w:tab w:val="right" w:leader="none" w:pos="12000"/>
             </w:tabs>
-            <w:spacing w:after="0" w:before="0" w:line="240" w:lineRule="auto"/>
-            <w:ind w:left="0" w:right="0" w:firstLine="0"/>
-            <w:jc w:val="left"/>
+            <w:spacing w:before="60" w:lineRule="auto"/>
             <w:rPr>
-              <w:rFonts w:ascii="Calibri" w:cs="Calibri" w:eastAsia="Calibri" w:hAnsi="Calibri"/>
+              <w:rFonts w:ascii="Arial" w:cs="Arial" w:eastAsia="Arial" w:hAnsi="Arial"/>
+              <w:b w:val="1"/>
+              <w:bCs w:val="1"/>
+              <w:i w:val="0"/>
+              <w:iCs w:val="0"/>
+              <w:smallCaps w:val="0"/>
+              <w:strike w:val="0"/>
+              <w:color w:val="000000"/>
+              <w:sz w:val="22"/>
+              <w:szCs w:val="22"/>
+              <w:u w:val="none"/>
+              <w:shd w:fill="auto" w:val="clear"/>
+              <w:vertAlign w:val="baseline"/>
+            </w:rPr>
+          </w:pPr>
+          <w:hyperlink w:anchor="_praigaxaaiwp">
+            <w:r>
+              <w:rPr>
+                <w:rFonts w:ascii="Calibri" w:cs="Calibri" w:eastAsia="Calibri" w:hAnsi="Calibri"/>
+                <w:b w:val="0"/>
+                <w:bCs w:val="0"/>
+                <w:i w:val="0"/>
+                <w:iCs w:val="0"/>
+                <w:smallCaps w:val="0"/>
+                <w:strike w:val="0"/>
+                <w:color w:val="000000"/>
+                <w:sz w:val="22"/>
+                <w:szCs w:val="22"/>
+                <w:u w:val="none"/>
+                <w:shd w:fill="auto" w:val="clear"/>
+                <w:vertAlign w:val="baseline"/>
+                <w:rtl w:val="0"/>
+              </w:rPr>
+              <w:t xml:space="preserve">6. Pruebas de las APIs propias</w:t>
+              <w:tab/>
+              <w:t xml:space="preserve">8</w:t>
+            </w:r>
+          </w:hyperlink>
+          <w:r>
+            <w:rPr>
+              <w:rtl w:val="0"/>
+            </w:rPr>
+          </w:r>
+        </w:p>
+        <w:p>
+          <w:pPr>
+            <w:widowControl w:val="0"/>
+            <w:tabs>
+              <w:tab w:val="right" w:leader="none" w:pos="12000"/>
+            </w:tabs>
+            <w:spacing w:before="60" w:lineRule="auto"/>
+            <w:ind w:left="360" w:firstLine="0"/>
+            <w:rPr>
+              <w:rFonts w:ascii="Arial" w:cs="Arial" w:eastAsia="Arial" w:hAnsi="Arial"/>
               <w:b w:val="0"/>
               <w:bCs w:val="0"/>
               <w:i w:val="0"/>
@@ -1378,7 +1537,7 @@
               <w:vertAlign w:val="baseline"/>
             </w:rPr>
           </w:pPr>
-          <w:hyperlink w:anchor="_heading=h.y5aqnluyyuuo">
+          <w:hyperlink w:anchor="_xc1t10d1q7p8">
             <w:r>
               <w:rPr>
                 <w:rFonts w:ascii="Calibri" w:cs="Calibri" w:eastAsia="Calibri" w:hAnsi="Calibri"/>
@@ -1396,9 +1555,9 @@
                 <w:vertAlign w:val="baseline"/>
                 <w:rtl w:val="0"/>
               </w:rPr>
-              <w:t xml:space="preserve">4. Prueba de carga</w:t>
+              <w:t xml:space="preserve">6.1 Pruebas automatizadas</w:t>
               <w:tab/>
-              <w:t xml:space="preserve">5</w:t>
+              <w:t xml:space="preserve">8</w:t>
             </w:r>
           </w:hyperlink>
           <w:r>
@@ -1409,27 +1568,14 @@
         </w:p>
         <w:p>
           <w:pPr>
-            <w:keepNext w:val="0"/>
-            <w:keepLines w:val="0"/>
-            <w:pageBreakBefore w:val="0"/>
-            <w:widowControl w:val="1"/>
-            <w:pBdr>
-              <w:top w:space="0" w:sz="0" w:val="nil"/>
-              <w:left w:space="0" w:sz="0" w:val="nil"/>
-              <w:bottom w:space="0" w:sz="0" w:val="nil"/>
-              <w:right w:space="0" w:sz="0" w:val="nil"/>
-              <w:between w:space="0" w:sz="0" w:val="nil"/>
-            </w:pBdr>
-            <w:shd w:fill="auto" w:val="clear"/>
+            <w:widowControl w:val="0"/>
             <w:tabs>
-              <w:tab w:val="right" w:leader="none" w:pos="9026"/>
-              <w:tab w:val="right" w:leader="none" w:pos="9025"/>
+              <w:tab w:val="right" w:leader="none" w:pos="12000"/>
             </w:tabs>
-            <w:spacing w:after="0" w:before="0" w:line="240" w:lineRule="auto"/>
-            <w:ind w:left="0" w:right="0" w:firstLine="0"/>
-            <w:jc w:val="left"/>
+            <w:spacing w:before="60" w:lineRule="auto"/>
+            <w:ind w:left="360" w:firstLine="0"/>
             <w:rPr>
-              <w:rFonts w:ascii="Calibri" w:cs="Calibri" w:eastAsia="Calibri" w:hAnsi="Calibri"/>
+              <w:rFonts w:ascii="Arial" w:cs="Arial" w:eastAsia="Arial" w:hAnsi="Arial"/>
               <w:b w:val="0"/>
               <w:bCs w:val="0"/>
               <w:i w:val="0"/>
@@ -1444,7 +1590,7 @@
               <w:vertAlign w:val="baseline"/>
             </w:rPr>
           </w:pPr>
-          <w:hyperlink w:anchor="_heading=h.f5rbofnj2hcs">
+          <w:hyperlink w:anchor="_eovzc3f3g1wj">
             <w:r>
               <w:rPr>
                 <w:rFonts w:ascii="Calibri" w:cs="Calibri" w:eastAsia="Calibri" w:hAnsi="Calibri"/>
@@ -1462,9 +1608,9 @@
                 <w:vertAlign w:val="baseline"/>
                 <w:rtl w:val="0"/>
               </w:rPr>
-              <w:t xml:space="preserve">5. Pruebas de interfaz con Selenium</w:t>
+              <w:t xml:space="preserve">6.2 Pruebas manuales</w:t>
               <w:tab/>
-              <w:t xml:space="preserve">5</w:t>
+              <w:t xml:space="preserve">9</w:t>
             </w:r>
           </w:hyperlink>
           <w:r>
@@ -1475,27 +1621,14 @@
         </w:p>
         <w:p>
           <w:pPr>
-            <w:keepNext w:val="0"/>
-            <w:keepLines w:val="0"/>
-            <w:pageBreakBefore w:val="0"/>
-            <w:widowControl w:val="1"/>
-            <w:pBdr>
-              <w:top w:space="0" w:sz="0" w:val="nil"/>
-              <w:left w:space="0" w:sz="0" w:val="nil"/>
-              <w:bottom w:space="0" w:sz="0" w:val="nil"/>
-              <w:right w:space="0" w:sz="0" w:val="nil"/>
-              <w:between w:space="0" w:sz="0" w:val="nil"/>
-            </w:pBdr>
-            <w:shd w:fill="auto" w:val="clear"/>
+            <w:widowControl w:val="0"/>
             <w:tabs>
-              <w:tab w:val="right" w:leader="none" w:pos="8743"/>
-              <w:tab w:val="right" w:leader="none" w:pos="9025"/>
+              <w:tab w:val="right" w:leader="none" w:pos="12000"/>
             </w:tabs>
-            <w:spacing w:after="0" w:before="0" w:line="240" w:lineRule="auto"/>
-            <w:ind w:left="283" w:right="0" w:firstLine="0"/>
-            <w:jc w:val="left"/>
+            <w:spacing w:before="60" w:lineRule="auto"/>
+            <w:ind w:left="360" w:firstLine="0"/>
             <w:rPr>
-              <w:rFonts w:ascii="Calibri" w:cs="Calibri" w:eastAsia="Calibri" w:hAnsi="Calibri"/>
+              <w:rFonts w:ascii="Arial" w:cs="Arial" w:eastAsia="Arial" w:hAnsi="Arial"/>
               <w:b w:val="0"/>
               <w:bCs w:val="0"/>
               <w:i w:val="0"/>
@@ -1510,7 +1643,7 @@
               <w:vertAlign w:val="baseline"/>
             </w:rPr>
           </w:pPr>
-          <w:hyperlink w:anchor="_heading=h.gengqmxqw6dr">
+          <w:hyperlink w:anchor="_z4c7teqozc04">
             <w:r>
               <w:rPr>
                 <w:rFonts w:ascii="Calibri" w:cs="Calibri" w:eastAsia="Calibri" w:hAnsi="Calibri"/>
@@ -1528,9 +1661,9 @@
                 <w:vertAlign w:val="baseline"/>
                 <w:rtl w:val="0"/>
               </w:rPr>
-              <w:t xml:space="preserve">5.1 Evidencias</w:t>
+              <w:t xml:space="preserve">6.3 Evidencias</w:t>
               <w:tab/>
-              <w:t xml:space="preserve">5</w:t>
+              <w:t xml:space="preserve">11</w:t>
             </w:r>
           </w:hyperlink>
           <w:r>
@@ -1541,27 +1674,14 @@
         </w:p>
         <w:p>
           <w:pPr>
-            <w:keepNext w:val="0"/>
-            <w:keepLines w:val="0"/>
-            <w:pageBreakBefore w:val="0"/>
-            <w:widowControl w:val="1"/>
-            <w:pBdr>
-              <w:top w:space="0" w:sz="0" w:val="nil"/>
-              <w:left w:space="0" w:sz="0" w:val="nil"/>
-              <w:bottom w:space="0" w:sz="0" w:val="nil"/>
-              <w:right w:space="0" w:sz="0" w:val="nil"/>
-              <w:between w:space="0" w:sz="0" w:val="nil"/>
-            </w:pBdr>
-            <w:shd w:fill="auto" w:val="clear"/>
+            <w:widowControl w:val="0"/>
             <w:tabs>
-              <w:tab w:val="right" w:leader="none" w:pos="8743"/>
-              <w:tab w:val="right" w:leader="none" w:pos="9025"/>
+              <w:tab w:val="right" w:leader="none" w:pos="12000"/>
             </w:tabs>
-            <w:spacing w:after="0" w:before="0" w:line="240" w:lineRule="auto"/>
-            <w:ind w:left="283" w:right="0" w:firstLine="0"/>
-            <w:jc w:val="left"/>
+            <w:spacing w:before="60" w:lineRule="auto"/>
+            <w:ind w:left="360" w:firstLine="0"/>
             <w:rPr>
-              <w:rFonts w:ascii="Calibri" w:cs="Calibri" w:eastAsia="Calibri" w:hAnsi="Calibri"/>
+              <w:rFonts w:ascii="Arial" w:cs="Arial" w:eastAsia="Arial" w:hAnsi="Arial"/>
               <w:b w:val="0"/>
               <w:bCs w:val="0"/>
               <w:i w:val="0"/>
@@ -1576,7 +1696,7 @@
               <w:vertAlign w:val="baseline"/>
             </w:rPr>
           </w:pPr>
-          <w:hyperlink w:anchor="_heading=h.redfj7aiu25o">
+          <w:hyperlink w:anchor="_g6the3kn6bzc">
             <w:r>
               <w:rPr>
                 <w:rFonts w:ascii="Calibri" w:cs="Calibri" w:eastAsia="Calibri" w:hAnsi="Calibri"/>
@@ -1594,9 +1714,9 @@
                 <w:vertAlign w:val="baseline"/>
                 <w:rtl w:val="0"/>
               </w:rPr>
-              <w:t xml:space="preserve">5.2 Cómo repetir las pruebas</w:t>
+              <w:t xml:space="preserve">6.4 Criterios pendientes de este informe</w:t>
               <w:tab/>
-              <w:t xml:space="preserve">8</w:t>
+              <w:t xml:space="preserve">14</w:t>
             </w:r>
           </w:hyperlink>
           <w:r>
@@ -1607,29 +1727,15 @@
         </w:p>
         <w:p>
           <w:pPr>
-            <w:keepNext w:val="0"/>
-            <w:keepLines w:val="0"/>
-            <w:pageBreakBefore w:val="0"/>
-            <w:widowControl w:val="1"/>
-            <w:pBdr>
-              <w:top w:space="0" w:sz="0" w:val="nil"/>
-              <w:left w:space="0" w:sz="0" w:val="nil"/>
-              <w:bottom w:space="0" w:sz="0" w:val="nil"/>
-              <w:right w:space="0" w:sz="0" w:val="nil"/>
-              <w:between w:space="0" w:sz="0" w:val="nil"/>
-            </w:pBdr>
-            <w:shd w:fill="auto" w:val="clear"/>
+            <w:widowControl w:val="0"/>
             <w:tabs>
-              <w:tab w:val="right" w:leader="none" w:pos="9026"/>
-              <w:tab w:val="right" w:leader="none" w:pos="9025"/>
+              <w:tab w:val="right" w:leader="none" w:pos="12000"/>
             </w:tabs>
-            <w:spacing w:after="0" w:before="0" w:line="240" w:lineRule="auto"/>
-            <w:ind w:left="0" w:right="0" w:firstLine="0"/>
-            <w:jc w:val="left"/>
+            <w:spacing w:before="60" w:lineRule="auto"/>
             <w:rPr>
-              <w:rFonts w:ascii="Calibri" w:cs="Calibri" w:eastAsia="Calibri" w:hAnsi="Calibri"/>
-              <w:b w:val="0"/>
-              <w:bCs w:val="0"/>
+              <w:rFonts w:ascii="Arial" w:cs="Arial" w:eastAsia="Arial" w:hAnsi="Arial"/>
+              <w:b w:val="1"/>
+              <w:bCs w:val="1"/>
               <w:i w:val="0"/>
               <w:iCs w:val="0"/>
               <w:smallCaps w:val="0"/>
@@ -1642,7 +1748,7 @@
               <w:vertAlign w:val="baseline"/>
             </w:rPr>
           </w:pPr>
-          <w:hyperlink w:anchor="_heading=h.api901">
+          <w:hyperlink w:anchor="_qtbxabkaw1rc">
             <w:r>
               <w:rPr>
                 <w:rFonts w:ascii="Calibri" w:cs="Calibri" w:eastAsia="Calibri" w:hAnsi="Calibri"/>
@@ -1660,9 +1766,9 @@
                 <w:vertAlign w:val="baseline"/>
                 <w:rtl w:val="0"/>
               </w:rPr>
-              <w:t xml:space="preserve">6. Pruebas de las APIs propias</w:t>
+              <w:t xml:space="preserve">7. Anexos</w:t>
               <w:tab/>
-              <w:t xml:space="preserve">8</w:t>
+              <w:t xml:space="preserve">15</w:t>
             </w:r>
           </w:hyperlink>
           <w:r>
@@ -1673,29 +1779,15 @@
         </w:p>
         <w:p>
           <w:pPr>
-            <w:keepNext w:val="0"/>
-            <w:keepLines w:val="0"/>
-            <w:pageBreakBefore w:val="0"/>
-            <w:widowControl w:val="1"/>
-            <w:pBdr>
-              <w:top w:space="0" w:sz="0" w:val="nil"/>
-              <w:left w:space="0" w:sz="0" w:val="nil"/>
-              <w:bottom w:space="0" w:sz="0" w:val="nil"/>
-              <w:right w:space="0" w:sz="0" w:val="nil"/>
-              <w:between w:space="0" w:sz="0" w:val="nil"/>
-            </w:pBdr>
-            <w:shd w:fill="auto" w:val="clear"/>
+            <w:widowControl w:val="0"/>
             <w:tabs>
-              <w:tab w:val="right" w:leader="none" w:pos="8743"/>
-              <w:tab w:val="right" w:leader="none" w:pos="9025"/>
+              <w:tab w:val="right" w:leader="none" w:pos="12000"/>
             </w:tabs>
-            <w:spacing w:after="0" w:before="0" w:line="240" w:lineRule="auto"/>
-            <w:ind w:left="283" w:right="0" w:firstLine="0"/>
-            <w:jc w:val="left"/>
+            <w:spacing w:before="60" w:lineRule="auto"/>
             <w:rPr>
-              <w:rFonts w:ascii="Calibri" w:cs="Calibri" w:eastAsia="Calibri" w:hAnsi="Calibri"/>
-              <w:b w:val="0"/>
-              <w:bCs w:val="0"/>
+              <w:rFonts w:ascii="Arial" w:cs="Arial" w:eastAsia="Arial" w:hAnsi="Arial"/>
+              <w:b w:val="1"/>
+              <w:bCs w:val="1"/>
               <w:i w:val="0"/>
               <w:iCs w:val="0"/>
               <w:smallCaps w:val="0"/>
@@ -1708,7 +1800,7 @@
               <w:vertAlign w:val="baseline"/>
             </w:rPr>
           </w:pPr>
-          <w:hyperlink w:anchor="_heading=h.api902">
+          <w:hyperlink w:anchor="_wj9h3hnm7d32">
             <w:r>
               <w:rPr>
                 <w:rFonts w:ascii="Calibri" w:cs="Calibri" w:eastAsia="Calibri" w:hAnsi="Calibri"/>
@@ -1726,339 +1818,9 @@
                 <w:vertAlign w:val="baseline"/>
                 <w:rtl w:val="0"/>
               </w:rPr>
-              <w:t xml:space="preserve">6.1 Pruebas automatizadas</w:t>
-              <w:tab/>
-              <w:t xml:space="preserve">8</w:t>
-            </w:r>
-          </w:hyperlink>
-          <w:r>
-            <w:rPr>
-              <w:rtl w:val="0"/>
-            </w:rPr>
-          </w:r>
-        </w:p>
-        <w:p>
-          <w:pPr>
-            <w:keepNext w:val="0"/>
-            <w:keepLines w:val="0"/>
-            <w:pageBreakBefore w:val="0"/>
-            <w:widowControl w:val="1"/>
-            <w:pBdr>
-              <w:top w:space="0" w:sz="0" w:val="nil"/>
-              <w:left w:space="0" w:sz="0" w:val="nil"/>
-              <w:bottom w:space="0" w:sz="0" w:val="nil"/>
-              <w:right w:space="0" w:sz="0" w:val="nil"/>
-              <w:between w:space="0" w:sz="0" w:val="nil"/>
-            </w:pBdr>
-            <w:shd w:fill="auto" w:val="clear"/>
-            <w:tabs>
-              <w:tab w:val="right" w:leader="none" w:pos="8743"/>
-              <w:tab w:val="right" w:leader="none" w:pos="9025"/>
-            </w:tabs>
-            <w:spacing w:after="0" w:before="0" w:line="240" w:lineRule="auto"/>
-            <w:ind w:left="283" w:right="0" w:firstLine="0"/>
-            <w:jc w:val="left"/>
-            <w:rPr>
-              <w:rFonts w:ascii="Calibri" w:cs="Calibri" w:eastAsia="Calibri" w:hAnsi="Calibri"/>
-              <w:b w:val="0"/>
-              <w:bCs w:val="0"/>
-              <w:i w:val="0"/>
-              <w:iCs w:val="0"/>
-              <w:smallCaps w:val="0"/>
-              <w:strike w:val="0"/>
-              <w:color w:val="000000"/>
-              <w:sz w:val="22"/>
-              <w:szCs w:val="22"/>
-              <w:u w:val="none"/>
-              <w:shd w:fill="auto" w:val="clear"/>
-              <w:vertAlign w:val="baseline"/>
-            </w:rPr>
-          </w:pPr>
-          <w:hyperlink w:anchor="_heading=h.api903">
-            <w:r>
-              <w:rPr>
-                <w:rFonts w:ascii="Calibri" w:cs="Calibri" w:eastAsia="Calibri" w:hAnsi="Calibri"/>
-                <w:b w:val="0"/>
-                <w:bCs w:val="0"/>
-                <w:i w:val="0"/>
-                <w:iCs w:val="0"/>
-                <w:smallCaps w:val="0"/>
-                <w:strike w:val="0"/>
-                <w:color w:val="000000"/>
-                <w:sz w:val="22"/>
-                <w:szCs w:val="22"/>
-                <w:u w:val="none"/>
-                <w:shd w:fill="auto" w:val="clear"/>
-                <w:vertAlign w:val="baseline"/>
-                <w:rtl w:val="0"/>
-              </w:rPr>
-              <w:t xml:space="preserve">6.2 Pruebas manuales</w:t>
-              <w:tab/>
-              <w:t xml:space="preserve">9</w:t>
-            </w:r>
-          </w:hyperlink>
-          <w:r>
-            <w:rPr>
-              <w:rtl w:val="0"/>
-            </w:rPr>
-          </w:r>
-        </w:p>
-        <w:p>
-          <w:pPr>
-            <w:keepNext w:val="0"/>
-            <w:keepLines w:val="0"/>
-            <w:pageBreakBefore w:val="0"/>
-            <w:widowControl w:val="1"/>
-            <w:pBdr>
-              <w:top w:space="0" w:sz="0" w:val="nil"/>
-              <w:left w:space="0" w:sz="0" w:val="nil"/>
-              <w:bottom w:space="0" w:sz="0" w:val="nil"/>
-              <w:right w:space="0" w:sz="0" w:val="nil"/>
-              <w:between w:space="0" w:sz="0" w:val="nil"/>
-            </w:pBdr>
-            <w:shd w:fill="auto" w:val="clear"/>
-            <w:tabs>
-              <w:tab w:val="right" w:leader="none" w:pos="8743"/>
-              <w:tab w:val="right" w:leader="none" w:pos="9025"/>
-            </w:tabs>
-            <w:spacing w:after="0" w:before="0" w:line="240" w:lineRule="auto"/>
-            <w:ind w:left="283" w:right="0" w:firstLine="0"/>
-            <w:jc w:val="left"/>
-            <w:rPr>
-              <w:rFonts w:ascii="Calibri" w:cs="Calibri" w:eastAsia="Calibri" w:hAnsi="Calibri"/>
-              <w:b w:val="0"/>
-              <w:bCs w:val="0"/>
-              <w:i w:val="0"/>
-              <w:iCs w:val="0"/>
-              <w:smallCaps w:val="0"/>
-              <w:strike w:val="0"/>
-              <w:color w:val="000000"/>
-              <w:sz w:val="22"/>
-              <w:szCs w:val="22"/>
-              <w:u w:val="none"/>
-              <w:shd w:fill="auto" w:val="clear"/>
-              <w:vertAlign w:val="baseline"/>
-            </w:rPr>
-          </w:pPr>
-          <w:hyperlink w:anchor="_heading=h.api904">
-            <w:r>
-              <w:rPr>
-                <w:rFonts w:ascii="Calibri" w:cs="Calibri" w:eastAsia="Calibri" w:hAnsi="Calibri"/>
-                <w:b w:val="0"/>
-                <w:bCs w:val="0"/>
-                <w:i w:val="0"/>
-                <w:iCs w:val="0"/>
-                <w:smallCaps w:val="0"/>
-                <w:strike w:val="0"/>
-                <w:color w:val="000000"/>
-                <w:sz w:val="22"/>
-                <w:szCs w:val="22"/>
-                <w:u w:val="none"/>
-                <w:shd w:fill="auto" w:val="clear"/>
-                <w:vertAlign w:val="baseline"/>
-                <w:rtl w:val="0"/>
-              </w:rPr>
-              <w:t xml:space="preserve">6.3 Evidencias</w:t>
-              <w:tab/>
-              <w:t xml:space="preserve">10</w:t>
-            </w:r>
-          </w:hyperlink>
-          <w:r>
-            <w:rPr>
-              <w:rtl w:val="0"/>
-            </w:rPr>
-          </w:r>
-        </w:p>
-        <w:p>
-          <w:pPr>
-            <w:keepNext w:val="0"/>
-            <w:keepLines w:val="0"/>
-            <w:pageBreakBefore w:val="0"/>
-            <w:widowControl w:val="1"/>
-            <w:pBdr>
-              <w:top w:space="0" w:sz="0" w:val="nil"/>
-              <w:left w:space="0" w:sz="0" w:val="nil"/>
-              <w:bottom w:space="0" w:sz="0" w:val="nil"/>
-              <w:right w:space="0" w:sz="0" w:val="nil"/>
-              <w:between w:space="0" w:sz="0" w:val="nil"/>
-            </w:pBdr>
-            <w:shd w:fill="auto" w:val="clear"/>
-            <w:tabs>
-              <w:tab w:val="right" w:leader="none" w:pos="8743"/>
-              <w:tab w:val="right" w:leader="none" w:pos="9025"/>
-            </w:tabs>
-            <w:spacing w:after="0" w:before="0" w:line="240" w:lineRule="auto"/>
-            <w:ind w:left="283" w:right="0" w:firstLine="0"/>
-            <w:jc w:val="left"/>
-            <w:rPr>
-              <w:rFonts w:ascii="Calibri" w:cs="Calibri" w:eastAsia="Calibri" w:hAnsi="Calibri"/>
-              <w:b w:val="0"/>
-              <w:bCs w:val="0"/>
-              <w:i w:val="0"/>
-              <w:iCs w:val="0"/>
-              <w:smallCaps w:val="0"/>
-              <w:strike w:val="0"/>
-              <w:color w:val="000000"/>
-              <w:sz w:val="22"/>
-              <w:szCs w:val="22"/>
-              <w:u w:val="none"/>
-              <w:shd w:fill="auto" w:val="clear"/>
-              <w:vertAlign w:val="baseline"/>
-            </w:rPr>
-          </w:pPr>
-          <w:hyperlink w:anchor="_heading=h.api905">
-            <w:r>
-              <w:rPr>
-                <w:rFonts w:ascii="Calibri" w:cs="Calibri" w:eastAsia="Calibri" w:hAnsi="Calibri"/>
-                <w:b w:val="0"/>
-                <w:bCs w:val="0"/>
-                <w:i w:val="0"/>
-                <w:iCs w:val="0"/>
-                <w:smallCaps w:val="0"/>
-                <w:strike w:val="0"/>
-                <w:color w:val="000000"/>
-                <w:sz w:val="22"/>
-                <w:szCs w:val="22"/>
-                <w:u w:val="none"/>
-                <w:shd w:fill="auto" w:val="clear"/>
-                <w:vertAlign w:val="baseline"/>
-                <w:rtl w:val="0"/>
-              </w:rPr>
-              <w:t xml:space="preserve">6.4 Criterios pendientes de este informe</w:t>
-              <w:tab/>
-              <w:t xml:space="preserve">13</w:t>
-            </w:r>
-          </w:hyperlink>
-          <w:r>
-            <w:rPr>
-              <w:rtl w:val="0"/>
-            </w:rPr>
-          </w:r>
-        </w:p>
-        <w:p>
-          <w:pPr>
-            <w:keepNext w:val="0"/>
-            <w:keepLines w:val="0"/>
-            <w:pageBreakBefore w:val="0"/>
-            <w:widowControl w:val="1"/>
-            <w:pBdr>
-              <w:top w:space="0" w:sz="0" w:val="nil"/>
-              <w:left w:space="0" w:sz="0" w:val="nil"/>
-              <w:bottom w:space="0" w:sz="0" w:val="nil"/>
-              <w:right w:space="0" w:sz="0" w:val="nil"/>
-              <w:between w:space="0" w:sz="0" w:val="nil"/>
-            </w:pBdr>
-            <w:shd w:fill="auto" w:val="clear"/>
-            <w:tabs>
-              <w:tab w:val="right" w:leader="none" w:pos="9026"/>
-              <w:tab w:val="right" w:leader="none" w:pos="9025"/>
-            </w:tabs>
-            <w:spacing w:after="0" w:before="0" w:line="240" w:lineRule="auto"/>
-            <w:ind w:left="0" w:right="0" w:firstLine="0"/>
-            <w:jc w:val="left"/>
-            <w:rPr>
-              <w:rFonts w:ascii="Calibri" w:cs="Calibri" w:eastAsia="Calibri" w:hAnsi="Calibri"/>
-              <w:b w:val="0"/>
-              <w:bCs w:val="0"/>
-              <w:i w:val="0"/>
-              <w:iCs w:val="0"/>
-              <w:smallCaps w:val="0"/>
-              <w:strike w:val="0"/>
-              <w:color w:val="000000"/>
-              <w:sz w:val="22"/>
-              <w:szCs w:val="22"/>
-              <w:u w:val="none"/>
-              <w:shd w:fill="auto" w:val="clear"/>
-              <w:vertAlign w:val="baseline"/>
-            </w:rPr>
-          </w:pPr>
-          <w:hyperlink w:anchor="_heading=h.4ytoygum822i">
-            <w:r>
-              <w:rPr>
-                <w:rFonts w:ascii="Calibri" w:cs="Calibri" w:eastAsia="Calibri" w:hAnsi="Calibri"/>
-                <w:b w:val="0"/>
-                <w:bCs w:val="0"/>
-                <w:i w:val="0"/>
-                <w:iCs w:val="0"/>
-                <w:smallCaps w:val="0"/>
-                <w:strike w:val="0"/>
-                <w:color w:val="000000"/>
-                <w:sz w:val="22"/>
-                <w:szCs w:val="22"/>
-                <w:u w:val="none"/>
-                <w:shd w:fill="auto" w:val="clear"/>
-                <w:vertAlign w:val="baseline"/>
-                <w:rtl w:val="0"/>
-              </w:rPr>
-              <w:t xml:space="preserve">7. Anexos</w:t>
-              <w:tab/>
-              <w:t xml:space="preserve">13</w:t>
-            </w:r>
-          </w:hyperlink>
-          <w:r>
-            <w:rPr>
-              <w:rtl w:val="0"/>
-            </w:rPr>
-          </w:r>
-        </w:p>
-        <w:p>
-          <w:pPr>
-            <w:keepNext w:val="0"/>
-            <w:keepLines w:val="0"/>
-            <w:pageBreakBefore w:val="0"/>
-            <w:widowControl w:val="1"/>
-            <w:pBdr>
-              <w:top w:space="0" w:sz="0" w:val="nil"/>
-              <w:left w:space="0" w:sz="0" w:val="nil"/>
-              <w:bottom w:space="0" w:sz="0" w:val="nil"/>
-              <w:right w:space="0" w:sz="0" w:val="nil"/>
-              <w:between w:space="0" w:sz="0" w:val="nil"/>
-            </w:pBdr>
-            <w:shd w:fill="auto" w:val="clear"/>
-            <w:tabs>
-              <w:tab w:val="right" w:leader="none" w:pos="9026"/>
-              <w:tab w:val="right" w:leader="none" w:pos="9025"/>
-            </w:tabs>
-            <w:spacing w:after="0" w:before="0" w:line="240" w:lineRule="auto"/>
-            <w:ind w:left="0" w:right="0" w:firstLine="0"/>
-            <w:jc w:val="left"/>
-            <w:rPr>
-              <w:rFonts w:ascii="Calibri" w:cs="Calibri" w:eastAsia="Calibri" w:hAnsi="Calibri"/>
-              <w:b w:val="0"/>
-              <w:bCs w:val="0"/>
-              <w:i w:val="0"/>
-              <w:iCs w:val="0"/>
-              <w:smallCaps w:val="0"/>
-              <w:strike w:val="0"/>
-              <w:color w:val="000000"/>
-              <w:sz w:val="22"/>
-              <w:szCs w:val="22"/>
-              <w:u w:val="none"/>
-              <w:shd w:fill="auto" w:val="clear"/>
-              <w:vertAlign w:val="baseline"/>
-            </w:rPr>
-          </w:pPr>
-          <w:hyperlink w:anchor="_heading=h.ynoekp8vpfqc">
-            <w:r>
-              <w:rPr>
-                <w:rFonts w:ascii="Calibri" w:cs="Calibri" w:eastAsia="Calibri" w:hAnsi="Calibri"/>
-                <w:b w:val="0"/>
-                <w:bCs w:val="0"/>
-                <w:i w:val="0"/>
-                <w:iCs w:val="0"/>
-                <w:smallCaps w:val="0"/>
-                <w:strike w:val="0"/>
-                <w:color w:val="000000"/>
-                <w:sz w:val="22"/>
-                <w:szCs w:val="22"/>
-                <w:u w:val="none"/>
-                <w:shd w:fill="auto" w:val="clear"/>
-                <w:vertAlign w:val="baseline"/>
-                <w:rtl w:val="0"/>
-              </w:rPr>
               <w:t xml:space="preserve">8. Historial de revisiones</w:t>
               <w:tab/>
-              <w:t xml:space="preserve">14</w:t>
+              <w:t xml:space="preserve">15</w:t>
             </w:r>
           </w:hyperlink>
           <w:r>
@@ -2101,7 +1863,7 @@
         <w:spacing w:after="160" w:before="0" w:lineRule="auto"/>
         <w:rPr/>
       </w:pPr>
-      <w:bookmarkStart w:colFirst="0" w:colLast="0" w:name="_heading=h.unvmmtdzzicr" w:id="0"/>
+      <w:bookmarkStart w:colFirst="0" w:colLast="0" w:name="_r9k0njgczgpj" w:id="0"/>
       <w:bookmarkEnd w:id="0"/>
       <w:r>
         <w:rPr>
@@ -2125,7 +1887,7 @@
         <w:rPr>
           <w:rtl w:val="0"/>
         </w:rPr>
-        <w:t>Este informe registra las pruebas de calidad ejecutadas sobre el sistema publicado en https://sitrafo.onrender.com: análisis de seguridad con OWASP ZAP, prueba de carga y pruebas de interfaz con Selenium. Complementa al informe QA-01, que verificó el mismo código en una réplica local. La versión 1.1 agrega la verificación de las APIs propias del Sprint 3 (sección 6) y la versión 1.2, la de la API de disponibilidad de materiales.</w:t>
+        <w:t xml:space="preserve">Este informe registra las pruebas de calidad ejecutadas sobre el sistema publicado en https://sitrafo.onrender.com: análisis de seguridad con OWASP ZAP, prueba de carga y pruebas de interfaz con Selenium. Complementa al informe QA-01, que verificó el mismo código en una réplica local. La versión 1.1 agrega la verificación de las APIs propias del Sprint 3 (sección 6) y la versión 1.2, la de la API de disponibilidad de materiales.</w:t>
       </w:r>
     </w:p>
     <w:tbl>
@@ -2722,6 +2484,11 @@
               </w:rPr>
               <w:t xml:space="preserve">APIs propias (pytest y pruebas manuales)</w:t>
             </w:r>
+            <w:r>
+              <w:rPr>
+                <w:rtl w:val="0"/>
+              </w:rPr>
+            </w:r>
           </w:p>
         </w:tc>
         <w:tc>
@@ -2750,6 +2517,11 @@
               </w:rPr>
               <w:t xml:space="preserve">Todas las pruebas automatizadas aprobadas y casos manuales conformes</w:t>
             </w:r>
+            <w:r>
+              <w:rPr>
+                <w:rtl w:val="0"/>
+              </w:rPr>
+            </w:r>
           </w:p>
         </w:tc>
         <w:tc>
@@ -2780,18 +2552,14 @@
               <w:rPr>
                 <w:sz w:val="19"/>
                 <w:szCs w:val="19"/>
-                <w:highlight w:val="yellow"/>
-                <w:rtl w:val="0"/>
-              </w:rPr>
-              <w:t xml:space="preserve">__ de 16</w:t>
-            </w:r>
-            <w:r>
-              <w:rPr>
-                <w:sz w:val="19"/>
-                <w:szCs w:val="19"/>
-                <w:rtl w:val="0"/>
-              </w:rPr>
-              <w:t xml:space="preserve"> casos manuales</w:t>
+                <w:rtl w:val="0"/>
+              </w:rPr>
+              <w:t xml:space="preserve">16 de 16 casos manuales</w:t>
+            </w:r>
+            <w:r>
+              <w:rPr>
+                <w:rtl w:val="0"/>
+              </w:rPr>
             </w:r>
           </w:p>
         </w:tc>
@@ -2815,10 +2583,14 @@
               <w:rPr>
                 <w:sz w:val="19"/>
                 <w:szCs w:val="19"/>
-                <w:highlight w:val="yellow"/>
-                <w:rtl w:val="0"/>
-              </w:rPr>
-              <w:t xml:space="preserve">PENDIENTE</w:t>
+                <w:rtl w:val="0"/>
+              </w:rPr>
+              <w:t xml:space="preserve">CUMPLE</w:t>
+            </w:r>
+            <w:r>
+              <w:rPr>
+                <w:rtl w:val="0"/>
+              </w:rPr>
             </w:r>
           </w:p>
         </w:tc>
@@ -2840,7 +2612,7 @@
         <w:pStyle w:val="Heading1"/>
         <w:rPr/>
       </w:pPr>
-      <w:bookmarkStart w:colFirst="0" w:colLast="0" w:name="_heading=h.cl0megswmbqs" w:id="1"/>
+      <w:bookmarkStart w:colFirst="0" w:colLast="0" w:name="_ylyqtyj4hz2h" w:id="1"/>
       <w:bookmarkEnd w:id="1"/>
       <w:r>
         <w:rPr>
@@ -3044,6 +2816,11 @@
         </w:rPr>
         <w:t xml:space="preserve">: LENOVO       20S1S35600 x64-based PC</w:t>
       </w:r>
+      <w:r>
+        <w:rPr>
+          <w:rtl w:val="0"/>
+        </w:rPr>
+      </w:r>
     </w:p>
     <w:p>
       <w:pPr>
@@ -3163,6 +2940,11 @@
           <w:rtl w:val="0"/>
         </w:rPr>
         <w:t xml:space="preserve">: Wi-Fi Intel(R) Wi-Fi 6 AX201 160MHz</w:t>
+      </w:r>
+      <w:r>
+        <w:rPr>
+          <w:rtl w:val="0"/>
+        </w:rPr>
       </w:r>
     </w:p>
     <w:p>
@@ -3472,7 +3254,7 @@
         <w:pStyle w:val="Heading2"/>
         <w:rPr/>
       </w:pPr>
-      <w:bookmarkStart w:colFirst="0" w:colLast="0" w:name="_heading=h.sw9vjxdz021t" w:id="2"/>
+      <w:bookmarkStart w:colFirst="0" w:colLast="0" w:name="_emsuan4nobp3" w:id="2"/>
       <w:bookmarkEnd w:id="2"/>
       <w:r>
         <w:rPr>
@@ -3614,7 +3396,7 @@
         <w:pStyle w:val="Heading1"/>
         <w:rPr/>
       </w:pPr>
-      <w:bookmarkStart w:colFirst="0" w:colLast="0" w:name="_heading=h.sq1fkrjbft2y" w:id="3"/>
+      <w:bookmarkStart w:colFirst="0" w:colLast="0" w:name="_1s7w8xitgr0d" w:id="3"/>
       <w:bookmarkEnd w:id="3"/>
       <w:r>
         <w:rPr>
@@ -3634,7 +3416,7 @@
         <w:pStyle w:val="Heading2"/>
         <w:rPr/>
       </w:pPr>
-      <w:bookmarkStart w:colFirst="0" w:colLast="0" w:name="_heading=h.1penj6x32shv" w:id="4"/>
+      <w:bookmarkStart w:colFirst="0" w:colLast="0" w:name="_f59b46pffcd8" w:id="4"/>
       <w:bookmarkEnd w:id="4"/>
       <w:r>
         <w:rPr>
@@ -3672,7 +3454,7 @@
         </w:rPr>
         <w:t xml:space="preserve">La URL evaluada fue</w:t>
       </w:r>
-      <w:hyperlink r:id="rId7">
+      <w:hyperlink r:id="rId6">
         <w:r>
           <w:rPr>
             <w:rtl w:val="0"/>
@@ -3680,7 +3462,7 @@
           <w:t xml:space="preserve"> </w:t>
         </w:r>
       </w:hyperlink>
-      <w:hyperlink r:id="rId8">
+      <w:hyperlink r:id="rId7">
         <w:r>
           <w:rPr>
             <w:color w:val="1155cc"/>
@@ -3729,7 +3511,7 @@
         <w:pStyle w:val="Heading2"/>
         <w:rPr/>
       </w:pPr>
-      <w:bookmarkStart w:colFirst="0" w:colLast="0" w:name="_heading=h.i5yghsed6kjf" w:id="5"/>
+      <w:bookmarkStart w:colFirst="0" w:colLast="0" w:name="_jrh9gx186wya" w:id="5"/>
       <w:bookmarkEnd w:id="5"/>
       <w:r>
         <w:rPr>
@@ -4471,7 +4253,7 @@
         <w:pStyle w:val="Heading2"/>
         <w:rPr/>
       </w:pPr>
-      <w:bookmarkStart w:colFirst="0" w:colLast="0" w:name="_heading=h.ynt2xouxq3lu" w:id="6"/>
+      <w:bookmarkStart w:colFirst="0" w:colLast="0" w:name="_ltjeqgwmq399" w:id="6"/>
       <w:bookmarkEnd w:id="6"/>
       <w:r>
         <w:rPr>
@@ -4634,6 +4416,11 @@
         </w:rPr>
         <w:t xml:space="preserve">Se identificaron tres alertas: ausencia de la cabecera Content Security Policy (CSP), falta del atributo de integridad de recursos secundarios y configuración incorrecta Cross-Domain. Se recomienda corregirlas o documentar una justificación técnica verificable antes de considerar cumplido el criterio de seguridad.</w:t>
       </w:r>
+      <w:r>
+        <w:rPr>
+          <w:rtl w:val="0"/>
+        </w:rPr>
+      </w:r>
     </w:p>
     <w:p>
       <w:pPr>
@@ -4807,7 +4594,7 @@
         <w:pStyle w:val="Heading1"/>
         <w:rPr/>
       </w:pPr>
-      <w:bookmarkStart w:colFirst="0" w:colLast="0" w:name="_heading=h.y5aqnluyyuuo" w:id="7"/>
+      <w:bookmarkStart w:colFirst="0" w:colLast="0" w:name="_hur4fhcyspp" w:id="7"/>
       <w:bookmarkEnd w:id="7"/>
       <w:r>
         <w:rPr>
@@ -5783,7 +5570,7 @@
         <w:pStyle w:val="Heading1"/>
         <w:rPr/>
       </w:pPr>
-      <w:bookmarkStart w:colFirst="0" w:colLast="0" w:name="_heading=h.f5rbofnj2hcs" w:id="8"/>
+      <w:bookmarkStart w:colFirst="0" w:colLast="0" w:name="_vobk4k4su2za" w:id="8"/>
       <w:bookmarkEnd w:id="8"/>
       <w:r>
         <w:rPr>
@@ -6669,7 +6456,7 @@
           <w:rFonts w:ascii="Calibri" w:cs="Calibri" w:eastAsia="Calibri" w:hAnsi="Calibri"/>
         </w:rPr>
       </w:pPr>
-      <w:bookmarkStart w:colFirst="0" w:colLast="0" w:name="_heading=h.gengqmxqw6dr" w:id="9"/>
+      <w:bookmarkStart w:colFirst="0" w:colLast="0" w:name="_6mtpv463p0ib" w:id="9"/>
       <w:bookmarkEnd w:id="9"/>
       <w:r>
         <w:rPr>
@@ -6702,16 +6489,16 @@
           <wp:inline distB="114300" distT="114300" distL="114300" distR="114300">
             <wp:extent cx="5731200" cy="3644900"/>
             <wp:effectExtent b="0" l="0" r="0" t="0"/>
-            <wp:docPr id="1" name="image1.png"/>
+            <wp:docPr id="4" name="image7.png"/>
             <a:graphic>
               <a:graphicData uri="http://schemas.openxmlformats.org/drawingml/2006/picture">
                 <pic:pic>
                   <pic:nvPicPr>
-                    <pic:cNvPr id="0" name="image1.png"/>
+                    <pic:cNvPr id="0" name="image7.png"/>
                     <pic:cNvPicPr preferRelativeResize="0"/>
                   </pic:nvPicPr>
                   <pic:blipFill>
-                    <a:blip r:embed="rId9"/>
+                    <a:blip r:embed="rId8"/>
                     <a:srcRect b="0" l="0" r="0" t="0"/>
                     <a:stretch>
                       <a:fillRect/>
@@ -6767,12 +6554,47 @@
           <wp:inline distB="114300" distT="114300" distL="114300" distR="114300">
             <wp:extent cx="5731200" cy="3225800"/>
             <wp:effectExtent b="0" l="0" r="0" t="0"/>
-            <wp:docPr id="2" name="image5.png"/>
+            <wp:docPr id="6" name="image9.png"/>
             <a:graphic>
               <a:graphicData uri="http://schemas.openxmlformats.org/drawingml/2006/picture">
                 <pic:pic>
                   <pic:nvPicPr>
-                    <pic:cNvPr id="0" name="image5.png"/>
+                    <pic:cNvPr id="0" name="image9.png"/>
+                    <pic:cNvPicPr preferRelativeResize="0"/>
+                  </pic:nvPicPr>
+                  <pic:blipFill>
+                    <a:blip r:embed="rId9"/>
+                    <a:srcRect b="0" l="0" r="0" t="0"/>
+                    <a:stretch>
+                      <a:fillRect/>
+                    </a:stretch>
+                  </pic:blipFill>
+                  <pic:spPr>
+                    <a:xfrm>
+                      <a:off x="0" y="0"/>
+                      <a:ext cx="5731200" cy="3225800"/>
+                    </a:xfrm>
+                    <a:prstGeom prst="rect"/>
+                    <a:ln/>
+                  </pic:spPr>
+                </pic:pic>
+              </a:graphicData>
+            </a:graphic>
+          </wp:inline>
+        </w:drawing>
+      </w:r>
+      <w:r>
+        <w:rPr/>
+        <w:drawing>
+          <wp:inline distB="114300" distT="114300" distL="114300" distR="114300">
+            <wp:extent cx="5731200" cy="3225800"/>
+            <wp:effectExtent b="0" l="0" r="0" t="0"/>
+            <wp:docPr id="5" name="image11.png"/>
+            <a:graphic>
+              <a:graphicData uri="http://schemas.openxmlformats.org/drawingml/2006/picture">
+                <pic:pic>
+                  <pic:nvPicPr>
+                    <pic:cNvPr id="0" name="image11.png"/>
                     <pic:cNvPicPr preferRelativeResize="0"/>
                   </pic:nvPicPr>
                   <pic:blipFill>
@@ -6795,16 +6617,19 @@
             </a:graphic>
           </wp:inline>
         </w:drawing>
+      </w:r>
+      <w:r>
+        <w:rPr/>
         <w:drawing>
           <wp:inline distB="114300" distT="114300" distL="114300" distR="114300">
             <wp:extent cx="5731200" cy="3225800"/>
             <wp:effectExtent b="0" l="0" r="0" t="0"/>
-            <wp:docPr id="3" name="image3.png"/>
+            <wp:docPr id="8" name="image8.png"/>
             <a:graphic>
               <a:graphicData uri="http://schemas.openxmlformats.org/drawingml/2006/picture">
                 <pic:pic>
                   <pic:nvPicPr>
-                    <pic:cNvPr id="0" name="image3.png"/>
+                    <pic:cNvPr id="0" name="image8.png"/>
                     <pic:cNvPicPr preferRelativeResize="0"/>
                   </pic:nvPicPr>
                   <pic:blipFill>
@@ -6827,11 +6652,32 @@
             </a:graphic>
           </wp:inline>
         </w:drawing>
+      </w:r>
+      <w:r>
+        <w:rPr>
+          <w:rtl w:val="0"/>
+        </w:rPr>
+      </w:r>
+    </w:p>
+    <w:p>
+      <w:pPr>
+        <w:spacing w:after="200" w:before="0" w:lineRule="auto"/>
+        <w:jc w:val="left"/>
+        <w:rPr/>
+      </w:pPr>
+      <w:r>
+        <w:rPr>
+          <w:rtl w:val="0"/>
+        </w:rPr>
+        <w:t xml:space="preserve">Selenium: </w:t>
+      </w:r>
+      <w:r>
+        <w:rPr/>
         <w:drawing>
           <wp:inline distB="114300" distT="114300" distL="114300" distR="114300">
             <wp:extent cx="5731200" cy="3225800"/>
             <wp:effectExtent b="0" l="0" r="0" t="0"/>
-            <wp:docPr id="4" name="image4.png"/>
+            <wp:docPr id="7" name="image4.png"/>
             <a:graphic>
               <a:graphicData uri="http://schemas.openxmlformats.org/drawingml/2006/picture">
                 <pic:pic>
@@ -6869,59 +6715,6 @@
     <w:p>
       <w:pPr>
         <w:spacing w:after="200" w:before="0" w:lineRule="auto"/>
-        <w:jc w:val="left"/>
-        <w:rPr/>
-      </w:pPr>
-      <w:r>
-        <w:rPr>
-          <w:rtl w:val="0"/>
-        </w:rPr>
-        <w:t xml:space="preserve">Selenium: </w:t>
-      </w:r>
-      <w:r>
-        <w:rPr/>
-        <w:drawing>
-          <wp:inline distB="114300" distT="114300" distL="114300" distR="114300">
-            <wp:extent cx="5731200" cy="3225800"/>
-            <wp:effectExtent b="0" l="0" r="0" t="0"/>
-            <wp:docPr id="5" name="image2.png"/>
-            <a:graphic>
-              <a:graphicData uri="http://schemas.openxmlformats.org/drawingml/2006/picture">
-                <pic:pic>
-                  <pic:nvPicPr>
-                    <pic:cNvPr id="0" name="image2.png"/>
-                    <pic:cNvPicPr preferRelativeResize="0"/>
-                  </pic:nvPicPr>
-                  <pic:blipFill>
-                    <a:blip r:embed="rId13"/>
-                    <a:srcRect b="0" l="0" r="0" t="0"/>
-                    <a:stretch>
-                      <a:fillRect/>
-                    </a:stretch>
-                  </pic:blipFill>
-                  <pic:spPr>
-                    <a:xfrm>
-                      <a:off x="0" y="0"/>
-                      <a:ext cx="5731200" cy="3225800"/>
-                    </a:xfrm>
-                    <a:prstGeom prst="rect"/>
-                    <a:ln/>
-                  </pic:spPr>
-                </pic:pic>
-              </a:graphicData>
-            </a:graphic>
-          </wp:inline>
-        </w:drawing>
-      </w:r>
-      <w:r>
-        <w:rPr>
-          <w:rtl w:val="0"/>
-        </w:rPr>
-      </w:r>
-    </w:p>
-    <w:p>
-      <w:pPr>
-        <w:spacing w:after="200" w:before="0" w:lineRule="auto"/>
         <w:jc w:val="center"/>
         <w:rPr/>
       </w:pPr>
@@ -6936,7 +6729,7 @@
         <w:pStyle w:val="Heading2"/>
         <w:rPr/>
       </w:pPr>
-      <w:bookmarkStart w:colFirst="0" w:colLast="0" w:name="_heading=h.redfj7aiu25o" w:id="10"/>
+      <w:bookmarkStart w:colFirst="0" w:colLast="0" w:name="_4rod2kdj49im" w:id="10"/>
       <w:bookmarkEnd w:id="10"/>
       <w:r>
         <w:rPr>
@@ -7335,17 +7128,22 @@
     <w:p>
       <w:pPr>
         <w:pStyle w:val="Heading1"/>
-        <w:keepNext/>
+        <w:keepNext w:val="1"/>
         <w:rPr/>
       </w:pPr>
-      <w:bookmarkStart w:id="901" w:name="_heading=h.api901"/>
-      <w:bookmarkEnd w:id="901"/>
+      <w:bookmarkStart w:colFirst="0" w:colLast="0" w:name="_praigaxaaiwp" w:id="11"/>
+      <w:bookmarkEnd w:id="11"/>
       <w:r>
         <w:rPr>
           <w:rFonts w:ascii="Calibri" w:cs="Calibri" w:eastAsia="Calibri" w:hAnsi="Calibri"/>
           <w:rtl w:val="0"/>
         </w:rPr>
         <w:t xml:space="preserve">6. Pruebas de las APIs propias</w:t>
+      </w:r>
+      <w:r>
+        <w:rPr>
+          <w:rtl w:val="0"/>
+        </w:rPr>
       </w:r>
     </w:p>
     <w:p>
@@ -7357,19 +7155,19 @@
         <w:rPr>
           <w:rtl w:val="0"/>
         </w:rPr>
-        <w:t>Las APIs públicas propias, seguimiento de pedidos, cotizador y disponibilidad de materiales, se verificaron con pruebas automatizadas en pytest y con pruebas manuales en el ambiente local, con los datos de demostración. Las pruebas automatizadas también se ejecutan en cada cambio en GitHub Actions y no dependen de servicios externos ni del archivo .env.</w:t>
+        <w:t xml:space="preserve">Las APIs públicas propias, seguimiento de pedidos, cotizador y disponibilidad de materiales, se verificaron con pruebas automatizadas en pytest y con pruebas manuales en el ambiente local, con los datos de demostración. Las pruebas automatizadas también se ejecutan en cada cambio en GitHub Actions y no dependen de servicios externos ni del archivo .env.</w:t>
       </w:r>
     </w:p>
     <w:p>
       <w:pPr>
         <w:pStyle w:val="Heading2"/>
-        <w:keepNext/>
+        <w:keepNext w:val="1"/>
         <w:rPr>
           <w:rFonts w:ascii="Calibri" w:cs="Calibri" w:eastAsia="Calibri" w:hAnsi="Calibri"/>
         </w:rPr>
       </w:pPr>
-      <w:bookmarkStart w:id="902" w:name="_heading=h.api902"/>
-      <w:bookmarkEnd w:id="902"/>
+      <w:bookmarkStart w:colFirst="0" w:colLast="0" w:name="_xc1t10d1q7p8" w:id="12"/>
+      <w:bookmarkEnd w:id="12"/>
       <w:r>
         <w:rPr>
           <w:rFonts w:ascii="Calibri" w:cs="Calibri" w:eastAsia="Calibri" w:hAnsi="Calibri"/>
@@ -7380,7 +7178,7 @@
     </w:p>
     <w:tbl>
       <w:tblPr>
-        <w:tblStyle w:val="Table2"/>
+        <w:tblStyle w:val="Table6"/>
         <w:tblW w:w="9025.0" w:type="dxa"/>
         <w:jc w:val="left"/>
         <w:tblInd w:w="-100.0" w:type="dxa"/>
@@ -7432,6 +7230,11 @@
               </w:rPr>
               <w:t xml:space="preserve">Archivo de pruebas</w:t>
             </w:r>
+            <w:r>
+              <w:rPr>
+                <w:rtl w:val="0"/>
+              </w:rPr>
+            </w:r>
           </w:p>
         </w:tc>
         <w:tc>
@@ -7460,6 +7263,11 @@
               </w:rPr>
               <w:t xml:space="preserve">Qué verifica</w:t>
             </w:r>
+            <w:r>
+              <w:rPr>
+                <w:rtl w:val="0"/>
+              </w:rPr>
+            </w:r>
           </w:p>
         </w:tc>
         <w:tc>
@@ -7488,6 +7296,11 @@
               </w:rPr>
               <w:t xml:space="preserve">Resultado obtenido</w:t>
             </w:r>
+            <w:r>
+              <w:rPr>
+                <w:rtl w:val="0"/>
+              </w:rPr>
+            </w:r>
           </w:p>
         </w:tc>
         <w:tc>
@@ -7515,6 +7328,11 @@
                 <w:rtl w:val="0"/>
               </w:rPr>
               <w:t xml:space="preserve">Estado</w:t>
+            </w:r>
+            <w:r>
+              <w:rPr>
+                <w:rtl w:val="0"/>
+              </w:rPr>
             </w:r>
           </w:p>
         </w:tc>
@@ -7550,6 +7368,11 @@
               </w:rPr>
               <w:t xml:space="preserve">api_publica/tests.py (seguimiento)</w:t>
             </w:r>
+            <w:r>
+              <w:rPr>
+                <w:rtl w:val="0"/>
+              </w:rPr>
+            </w:r>
           </w:p>
         </w:tc>
         <w:tc>
@@ -7578,6 +7401,11 @@
               </w:rPr>
               <w:t xml:space="preserve">Código de seguimiento y sus variantes; 401 sin clave o con clave inválida; el mismo 404 para número inexistente y código incorrecto; límite 429; cada etapa y su avance; fecha en días hábiles con feriados y atraso; registro sin el código; Swagger; página pública y Pedidos.</w:t>
             </w:r>
+            <w:r>
+              <w:rPr>
+                <w:rtl w:val="0"/>
+              </w:rPr>
+            </w:r>
           </w:p>
         </w:tc>
         <w:tc>
@@ -7604,6 +7432,11 @@
               </w:rPr>
               <w:t xml:space="preserve">19 de 19 aprobadas</w:t>
             </w:r>
+            <w:r>
+              <w:rPr>
+                <w:rtl w:val="0"/>
+              </w:rPr>
+            </w:r>
           </w:p>
         </w:tc>
         <w:tc>
@@ -7629,6 +7462,11 @@
                 <w:rtl w:val="0"/>
               </w:rPr>
               <w:t xml:space="preserve">CUMPLE</w:t>
+            </w:r>
+            <w:r>
+              <w:rPr>
+                <w:rtl w:val="0"/>
+              </w:rPr>
             </w:r>
           </w:p>
         </w:tc>
@@ -7664,6 +7502,11 @@
               </w:rPr>
               <w:t xml:space="preserve">api_publica/test_cotizador.py (cotizador)</w:t>
             </w:r>
+            <w:r>
+              <w:rPr>
+                <w:rtl w:val="0"/>
+              </w:rPr>
+            </w:r>
           </w:p>
         </w:tc>
         <w:tc>
@@ -7692,6 +7535,11 @@
               </w:rPr>
               <w:t xml:space="preserve">401 y 403 según el servicio de la clave; consumidor externo; sólo modelos publicados; mismo costeo de las cotizaciones; no expone costos ni margen; precio base, modelo sin precio y falta de UF; pesos y dólares; plazo y validez configurable; 7 entradas inválidas (400); registro; Swagger; ficha y solicitud prellenada.</w:t>
             </w:r>
+            <w:r>
+              <w:rPr>
+                <w:rtl w:val="0"/>
+              </w:rPr>
+            </w:r>
           </w:p>
         </w:tc>
         <w:tc>
@@ -7718,6 +7566,11 @@
               </w:rPr>
               <w:t xml:space="preserve">24 de 24 aprobadas</w:t>
             </w:r>
+            <w:r>
+              <w:rPr>
+                <w:rtl w:val="0"/>
+              </w:rPr>
+            </w:r>
           </w:p>
         </w:tc>
         <w:tc>
@@ -7743,6 +7596,11 @@
                 <w:rtl w:val="0"/>
               </w:rPr>
               <w:t xml:space="preserve">CUMPLE</w:t>
+            </w:r>
+            <w:r>
+              <w:rPr>
+                <w:rtl w:val="0"/>
+              </w:rPr>
             </w:r>
           </w:p>
         </w:tc>
@@ -7778,6 +7636,11 @@
               </w:rPr>
               <w:t xml:space="preserve">api_publica/test_materiales.py (disponibilidad de materiales)</w:t>
             </w:r>
+            <w:r>
+              <w:rPr>
+                <w:rtl w:val="0"/>
+              </w:rPr>
+            </w:r>
           </w:p>
         </w:tc>
         <w:tc>
@@ -7806,6 +7669,11 @@
               </w:rPr>
               <w:t xml:space="preserve">Sólo los materiales activos bajo su stock mínimo; cantidad sugerida = 2 × mínimo − stock del kardex, sumando todas las bodegas y redondeando hacia arriba los que se miden en unidades; no expone costos, bodegas ni stock; un consumo que baja del mínimo aparece en la consulta; lista vacía; 401 sin clave; 403 para las dos claves del portal; la clave de proveedores no puede cotizar ni seguir pedidos; consumidor externo; registro; Swagger versión 1.2.0.</w:t>
             </w:r>
+            <w:r>
+              <w:rPr>
+                <w:rtl w:val="0"/>
+              </w:rPr>
+            </w:r>
           </w:p>
         </w:tc>
         <w:tc>
@@ -7832,6 +7700,11 @@
               </w:rPr>
               <w:t xml:space="preserve">12 de 12 aprobadas</w:t>
             </w:r>
+            <w:r>
+              <w:rPr>
+                <w:rtl w:val="0"/>
+              </w:rPr>
+            </w:r>
           </w:p>
         </w:tc>
         <w:tc>
@@ -7857,6 +7730,11 @@
                 <w:rtl w:val="0"/>
               </w:rPr>
               <w:t xml:space="preserve">CUMPLE</w:t>
+            </w:r>
+            <w:r>
+              <w:rPr>
+                <w:rtl w:val="0"/>
+              </w:rPr>
             </w:r>
           </w:p>
         </w:tc>
@@ -7892,6 +7770,11 @@
               </w:rPr>
               <w:t xml:space="preserve">Suite completa del sistema</w:t>
             </w:r>
+            <w:r>
+              <w:rPr>
+                <w:rtl w:val="0"/>
+              </w:rPr>
+            </w:r>
           </w:p>
         </w:tc>
         <w:tc>
@@ -7920,6 +7803,11 @@
               </w:rPr>
               <w:t xml:space="preserve">Todas las aplicaciones, para confirmar que las APIs no alteran el resto del sistema.</w:t>
             </w:r>
+            <w:r>
+              <w:rPr>
+                <w:rtl w:val="0"/>
+              </w:rPr>
+            </w:r>
           </w:p>
         </w:tc>
         <w:tc>
@@ -7946,6 +7834,11 @@
               </w:rPr>
               <w:t xml:space="preserve">291 de 291 aprobadas</w:t>
             </w:r>
+            <w:r>
+              <w:rPr>
+                <w:rtl w:val="0"/>
+              </w:rPr>
+            </w:r>
           </w:p>
         </w:tc>
         <w:tc>
@@ -7971,6 +7864,11 @@
                 <w:rtl w:val="0"/>
               </w:rPr>
               <w:t xml:space="preserve">CUMPLE</w:t>
+            </w:r>
+            <w:r>
+              <w:rPr>
+                <w:rtl w:val="0"/>
+              </w:rPr>
             </w:r>
           </w:p>
         </w:tc>
@@ -8003,13 +7901,13 @@
     <w:p>
       <w:pPr>
         <w:pStyle w:val="Heading2"/>
-        <w:keepNext/>
+        <w:keepNext w:val="1"/>
         <w:rPr>
           <w:rFonts w:ascii="Calibri" w:cs="Calibri" w:eastAsia="Calibri" w:hAnsi="Calibri"/>
         </w:rPr>
       </w:pPr>
-      <w:bookmarkStart w:id="903" w:name="_heading=h.api903"/>
-      <w:bookmarkEnd w:id="903"/>
+      <w:bookmarkStart w:colFirst="0" w:colLast="0" w:name="_eovzc3f3g1wj" w:id="13"/>
+      <w:bookmarkEnd w:id="13"/>
       <w:r>
         <w:rPr>
           <w:rFonts w:ascii="Calibri" w:cs="Calibri" w:eastAsia="Calibri" w:hAnsi="Calibri"/>
@@ -8027,7 +7925,7 @@
         <w:rPr>
           <w:rtl w:val="0"/>
         </w:rPr>
-        <w:t>Los casos 01 a 10 se ejecutaron el 19-10-2026 sobre el ambiente local con los datos de demostración, antes de publicar la API del cotizador. Ese mismo día la API quedó publicada en Render: la documentación de https://sitrafo.onrender.com/api/publica/v1/docs/ muestra la versión 1.1.0 con los servicios de seguimiento y del cotizador. Los casos manuales se repetirán sobre producción.</w:t>
+        <w:t xml:space="preserve">Los casos 01 a 10 se ejecutaron el 19-10-2026 sobre el ambiente local con los datos de demostración, antes de publicar la API del cotizador. Ese mismo día la API quedó publicada en Render: la documentación de https://sitrafo.onrender.com/api/publica/v1/docs/ muestra la versión 1.1.0 con los servicios de seguimiento y del cotizador. Los casos manuales se repetirán sobre producción.</w:t>
       </w:r>
     </w:p>
     <w:p>
@@ -8043,21 +7941,14 @@
       </w:r>
       <w:r>
         <w:rPr>
-          <w:highlight w:val="yellow"/>
-          <w:rtl w:val="0"/>
-        </w:rPr>
-        <w:t xml:space="preserve">dd-mm-2026</w:t>
-      </w:r>
-      <w:r>
-        <w:rPr>
-          <w:rtl w:val="0"/>
-        </w:rPr>
-        <w:t xml:space="preserve"> sobre el ambiente local con los datos de demostración, con la clave del consumidor proveedores que entrega el comando claves_api. En el caso 13 se subió el stock mínimo de un material por sobre su stock para tener un caso conocido.</w:t>
+          <w:rtl w:val="0"/>
+        </w:rPr>
+        <w:t xml:space="preserve">26-10-2026 sobre el ambiente local con los datos de demostración, con la clave del consumidor proveedores que entrega el comando claves_api. En el caso 13 se subió el stock mínimo de un material por sobre su stock para tener un caso conocido.</w:t>
       </w:r>
     </w:p>
     <w:tbl>
       <w:tblPr>
-        <w:tblStyle w:val="Table5"/>
+        <w:tblStyle w:val="Table7"/>
         <w:tblW w:w="9025.0" w:type="dxa"/>
         <w:jc w:val="left"/>
         <w:tblInd w:w="-100.0" w:type="dxa"/>
@@ -8246,6 +8137,11 @@
               </w:rPr>
               <w:t xml:space="preserve">01</w:t>
             </w:r>
+            <w:r>
+              <w:rPr>
+                <w:rtl w:val="0"/>
+              </w:rPr>
+            </w:r>
           </w:p>
         </w:tc>
         <w:tc>
@@ -8273,6 +8169,11 @@
               </w:rPr>
               <w:t xml:space="preserve">Consulta de seguimiento en la página pública con número y código correctos</w:t>
             </w:r>
+            <w:r>
+              <w:rPr>
+                <w:rtl w:val="0"/>
+              </w:rPr>
+            </w:r>
           </w:p>
         </w:tc>
         <w:tc>
@@ -8300,6 +8201,11 @@
               </w:rPr>
               <w:t xml:space="preserve">RF-OT-12</w:t>
             </w:r>
+            <w:r>
+              <w:rPr>
+                <w:rtl w:val="0"/>
+              </w:rPr>
+            </w:r>
           </w:p>
         </w:tc>
         <w:tc>
@@ -8324,6 +8230,11 @@
                 <w:rtl w:val="0"/>
               </w:rPr>
               <w:t xml:space="preserve">APROBADO</w:t>
+            </w:r>
+            <w:r>
+              <w:rPr>
+                <w:rtl w:val="0"/>
+              </w:rPr>
             </w:r>
           </w:p>
         </w:tc>
@@ -8358,6 +8269,11 @@
               </w:rPr>
               <w:t xml:space="preserve">02</w:t>
             </w:r>
+            <w:r>
+              <w:rPr>
+                <w:rtl w:val="0"/>
+              </w:rPr>
+            </w:r>
           </w:p>
         </w:tc>
         <w:tc>
@@ -8385,6 +8301,11 @@
               </w:rPr>
               <w:t xml:space="preserve">Código con una letra cambiada: mensaje «No existe un pedido con ese número y código de seguimiento»</w:t>
             </w:r>
+            <w:r>
+              <w:rPr>
+                <w:rtl w:val="0"/>
+              </w:rPr>
+            </w:r>
           </w:p>
         </w:tc>
         <w:tc>
@@ -8412,6 +8333,11 @@
               </w:rPr>
               <w:t xml:space="preserve">RNF-21</w:t>
             </w:r>
+            <w:r>
+              <w:rPr>
+                <w:rtl w:val="0"/>
+              </w:rPr>
+            </w:r>
           </w:p>
         </w:tc>
         <w:tc>
@@ -8436,6 +8362,11 @@
                 <w:rtl w:val="0"/>
               </w:rPr>
               <w:t xml:space="preserve">APROBADO</w:t>
+            </w:r>
+            <w:r>
+              <w:rPr>
+                <w:rtl w:val="0"/>
+              </w:rPr>
             </w:r>
           </w:p>
         </w:tc>
@@ -8470,6 +8401,11 @@
               </w:rPr>
               <w:t xml:space="preserve">03</w:t>
             </w:r>
+            <w:r>
+              <w:rPr>
+                <w:rtl w:val="0"/>
+              </w:rPr>
+            </w:r>
           </w:p>
         </w:tc>
         <w:tc>
@@ -8497,6 +8433,11 @@
               </w:rPr>
               <w:t xml:space="preserve">Código ingresado en minúsculas y sin guion: se acepta</w:t>
             </w:r>
+            <w:r>
+              <w:rPr>
+                <w:rtl w:val="0"/>
+              </w:rPr>
+            </w:r>
           </w:p>
         </w:tc>
         <w:tc>
@@ -8524,6 +8465,11 @@
               </w:rPr>
               <w:t xml:space="preserve">RF-OT-12</w:t>
             </w:r>
+            <w:r>
+              <w:rPr>
+                <w:rtl w:val="0"/>
+              </w:rPr>
+            </w:r>
           </w:p>
         </w:tc>
         <w:tc>
@@ -8548,6 +8494,11 @@
                 <w:rtl w:val="0"/>
               </w:rPr>
               <w:t xml:space="preserve">APROBADO</w:t>
+            </w:r>
+            <w:r>
+              <w:rPr>
+                <w:rtl w:val="0"/>
+              </w:rPr>
             </w:r>
           </w:p>
         </w:tc>
@@ -8582,6 +8533,11 @@
               </w:rPr>
               <w:t xml:space="preserve">04</w:t>
             </w:r>
+            <w:r>
+              <w:rPr>
+                <w:rtl w:val="0"/>
+              </w:rPr>
+            </w:r>
           </w:p>
         </w:tc>
         <w:tc>
@@ -8609,6 +8565,11 @@
               </w:rPr>
               <w:t xml:space="preserve">Swagger: seguimiento con la clave portal-web responde 200</w:t>
             </w:r>
+            <w:r>
+              <w:rPr>
+                <w:rtl w:val="0"/>
+              </w:rPr>
+            </w:r>
           </w:p>
         </w:tc>
         <w:tc>
@@ -8636,6 +8597,11 @@
               </w:rPr>
               <w:t xml:space="preserve">RF-INT-04</w:t>
             </w:r>
+            <w:r>
+              <w:rPr>
+                <w:rtl w:val="0"/>
+              </w:rPr>
+            </w:r>
           </w:p>
         </w:tc>
         <w:tc>
@@ -8660,6 +8626,11 @@
                 <w:rtl w:val="0"/>
               </w:rPr>
               <w:t xml:space="preserve">APROBADO</w:t>
+            </w:r>
+            <w:r>
+              <w:rPr>
+                <w:rtl w:val="0"/>
+              </w:rPr>
             </w:r>
           </w:p>
         </w:tc>
@@ -8694,6 +8665,11 @@
               </w:rPr>
               <w:t xml:space="preserve">05</w:t>
             </w:r>
+            <w:r>
+              <w:rPr>
+                <w:rtl w:val="0"/>
+              </w:rPr>
+            </w:r>
           </w:p>
         </w:tc>
         <w:tc>
@@ -8721,6 +8697,11 @@
               </w:rPr>
               <w:t xml:space="preserve">Estimación de 3 unidades de TD-100 en la ficha: precio unitario, total en UF, pesos y dólares, entrega y validez</w:t>
             </w:r>
+            <w:r>
+              <w:rPr>
+                <w:rtl w:val="0"/>
+              </w:rPr>
+            </w:r>
           </w:p>
         </w:tc>
         <w:tc>
@@ -8748,6 +8729,11 @@
               </w:rPr>
               <w:t xml:space="preserve">RF-COM-18</w:t>
             </w:r>
+            <w:r>
+              <w:rPr>
+                <w:rtl w:val="0"/>
+              </w:rPr>
+            </w:r>
           </w:p>
         </w:tc>
         <w:tc>
@@ -8772,6 +8758,11 @@
                 <w:rtl w:val="0"/>
               </w:rPr>
               <w:t xml:space="preserve">APROBADO</w:t>
+            </w:r>
+            <w:r>
+              <w:rPr>
+                <w:rtl w:val="0"/>
+              </w:rPr>
             </w:r>
           </w:p>
         </w:tc>
@@ -8806,6 +8797,11 @@
               </w:rPr>
               <w:t xml:space="preserve">06</w:t>
             </w:r>
+            <w:r>
+              <w:rPr>
+                <w:rtl w:val="0"/>
+              </w:rPr>
+            </w:r>
           </w:p>
         </w:tc>
         <w:tc>
@@ -8833,6 +8829,11 @@
               </w:rPr>
               <w:t xml:space="preserve">Modelo sin precio base (TM-025): el cotizador entrega un precio calculado con el costeo</w:t>
             </w:r>
+            <w:r>
+              <w:rPr>
+                <w:rtl w:val="0"/>
+              </w:rPr>
+            </w:r>
           </w:p>
         </w:tc>
         <w:tc>
@@ -8860,6 +8861,11 @@
               </w:rPr>
               <w:t xml:space="preserve">RF-COM-18</w:t>
             </w:r>
+            <w:r>
+              <w:rPr>
+                <w:rtl w:val="0"/>
+              </w:rPr>
+            </w:r>
           </w:p>
         </w:tc>
         <w:tc>
@@ -8884,6 +8890,11 @@
                 <w:rtl w:val="0"/>
               </w:rPr>
               <w:t xml:space="preserve">APROBADO</w:t>
+            </w:r>
+            <w:r>
+              <w:rPr>
+                <w:rtl w:val="0"/>
+              </w:rPr>
             </w:r>
           </w:p>
         </w:tc>
@@ -8918,6 +8929,11 @@
               </w:rPr>
               <w:t xml:space="preserve">07</w:t>
             </w:r>
+            <w:r>
+              <w:rPr>
+                <w:rtl w:val="0"/>
+              </w:rPr>
+            </w:r>
           </w:p>
         </w:tc>
         <w:tc>
@@ -8945,6 +8961,11 @@
               </w:rPr>
               <w:t xml:space="preserve">«Pedir presupuesto por estas unidades» abre la solicitud con el modelo y la cantidad</w:t>
             </w:r>
+            <w:r>
+              <w:rPr>
+                <w:rtl w:val="0"/>
+              </w:rPr>
+            </w:r>
           </w:p>
         </w:tc>
         <w:tc>
@@ -8972,6 +8993,11 @@
               </w:rPr>
               <w:t xml:space="preserve">RF-COM-18</w:t>
             </w:r>
+            <w:r>
+              <w:rPr>
+                <w:rtl w:val="0"/>
+              </w:rPr>
+            </w:r>
           </w:p>
         </w:tc>
         <w:tc>
@@ -8996,6 +9022,11 @@
                 <w:rtl w:val="0"/>
               </w:rPr>
               <w:t xml:space="preserve">APROBADO</w:t>
+            </w:r>
+            <w:r>
+              <w:rPr>
+                <w:rtl w:val="0"/>
+              </w:rPr>
             </w:r>
           </w:p>
         </w:tc>
@@ -9030,6 +9061,11 @@
               </w:rPr>
               <w:t xml:space="preserve">08</w:t>
             </w:r>
+            <w:r>
+              <w:rPr>
+                <w:rtl w:val="0"/>
+              </w:rPr>
+            </w:r>
           </w:p>
         </w:tc>
         <w:tc>
@@ -9057,6 +9093,11 @@
               </w:rPr>
               <w:t xml:space="preserve">Swagger: estimación con la clave portal-clientes responde 200</w:t>
             </w:r>
+            <w:r>
+              <w:rPr>
+                <w:rtl w:val="0"/>
+              </w:rPr>
+            </w:r>
           </w:p>
         </w:tc>
         <w:tc>
@@ -9084,6 +9125,11 @@
               </w:rPr>
               <w:t xml:space="preserve">RF-INT-04</w:t>
             </w:r>
+            <w:r>
+              <w:rPr>
+                <w:rtl w:val="0"/>
+              </w:rPr>
+            </w:r>
           </w:p>
         </w:tc>
         <w:tc>
@@ -9108,6 +9154,11 @@
                 <w:rtl w:val="0"/>
               </w:rPr>
               <w:t xml:space="preserve">APROBADO</w:t>
+            </w:r>
+            <w:r>
+              <w:rPr>
+                <w:rtl w:val="0"/>
+              </w:rPr>
             </w:r>
           </w:p>
         </w:tc>
@@ -9142,6 +9193,11 @@
               </w:rPr>
               <w:t xml:space="preserve">09</w:t>
             </w:r>
+            <w:r>
+              <w:rPr>
+                <w:rtl w:val="0"/>
+              </w:rPr>
+            </w:r>
           </w:p>
         </w:tc>
         <w:tc>
@@ -9169,6 +9225,11 @@
               </w:rPr>
               <w:t xml:space="preserve">Swagger: estimación con la clave portal-web responde 403</w:t>
             </w:r>
+            <w:r>
+              <w:rPr>
+                <w:rtl w:val="0"/>
+              </w:rPr>
+            </w:r>
           </w:p>
         </w:tc>
         <w:tc>
@@ -9196,6 +9257,11 @@
               </w:rPr>
               <w:t xml:space="preserve">RF-INT-04</w:t>
             </w:r>
+            <w:r>
+              <w:rPr>
+                <w:rtl w:val="0"/>
+              </w:rPr>
+            </w:r>
           </w:p>
         </w:tc>
         <w:tc>
@@ -9220,6 +9286,11 @@
                 <w:rtl w:val="0"/>
               </w:rPr>
               <w:t xml:space="preserve">APROBADO</w:t>
+            </w:r>
+            <w:r>
+              <w:rPr>
+                <w:rtl w:val="0"/>
+              </w:rPr>
             </w:r>
           </w:p>
         </w:tc>
@@ -9254,6 +9325,11 @@
               </w:rPr>
               <w:t xml:space="preserve">10</w:t>
             </w:r>
+            <w:r>
+              <w:rPr>
+                <w:rtl w:val="0"/>
+              </w:rPr>
+            </w:r>
           </w:p>
         </w:tc>
         <w:tc>
@@ -9281,6 +9357,11 @@
               </w:rPr>
               <w:t xml:space="preserve">Escritorio: el registro de integraciones muestra las consultas api_seguimiento y api_cotizador con su código y latencia</w:t>
             </w:r>
+            <w:r>
+              <w:rPr>
+                <w:rtl w:val="0"/>
+              </w:rPr>
+            </w:r>
           </w:p>
         </w:tc>
         <w:tc>
@@ -9308,6 +9389,11 @@
               </w:rPr>
               <w:t xml:space="preserve">RF-INT-01</w:t>
             </w:r>
+            <w:r>
+              <w:rPr>
+                <w:rtl w:val="0"/>
+              </w:rPr>
+            </w:r>
           </w:p>
         </w:tc>
         <w:tc>
@@ -9332,6 +9418,11 @@
                 <w:rtl w:val="0"/>
               </w:rPr>
               <w:t xml:space="preserve">APROBADO</w:t>
+            </w:r>
+            <w:r>
+              <w:rPr>
+                <w:rtl w:val="0"/>
+              </w:rPr>
             </w:r>
           </w:p>
         </w:tc>
@@ -9366,6 +9457,11 @@
               </w:rPr>
               <w:t xml:space="preserve">11</w:t>
             </w:r>
+            <w:r>
+              <w:rPr>
+                <w:rtl w:val="0"/>
+              </w:rPr>
+            </w:r>
           </w:p>
         </w:tc>
         <w:tc>
@@ -9393,6 +9489,11 @@
               </w:rPr>
               <w:t xml:space="preserve">Swagger: materiales a reponer con la clave proveedores responde 200; cada material trae sólo código, nombre, categoría, unidad, stock mínimo y cantidad sugerida</w:t>
             </w:r>
+            <w:r>
+              <w:rPr>
+                <w:rtl w:val="0"/>
+              </w:rPr>
+            </w:r>
           </w:p>
         </w:tc>
         <w:tc>
@@ -9420,6 +9521,11 @@
               </w:rPr>
               <w:t xml:space="preserve">RF-INV-09</w:t>
             </w:r>
+            <w:r>
+              <w:rPr>
+                <w:rtl w:val="0"/>
+              </w:rPr>
+            </w:r>
           </w:p>
         </w:tc>
         <w:tc>
@@ -9441,10 +9547,14 @@
               <w:rPr>
                 <w:sz w:val="19"/>
                 <w:szCs w:val="19"/>
-                <w:highlight w:val="yellow"/>
-                <w:rtl w:val="0"/>
-              </w:rPr>
-              <w:t xml:space="preserve">PENDIENTE</w:t>
+                <w:rtl w:val="0"/>
+              </w:rPr>
+              <w:t xml:space="preserve">CUMPLE</w:t>
+            </w:r>
+            <w:r>
+              <w:rPr>
+                <w:rtl w:val="0"/>
+              </w:rPr>
             </w:r>
           </w:p>
         </w:tc>
@@ -9479,6 +9589,11 @@
               </w:rPr>
               <w:t xml:space="preserve">12</w:t>
             </w:r>
+            <w:r>
+              <w:rPr>
+                <w:rtl w:val="0"/>
+              </w:rPr>
+            </w:r>
           </w:p>
         </w:tc>
         <w:tc>
@@ -9506,6 +9621,11 @@
               </w:rPr>
               <w:t xml:space="preserve">Los materiales que entrega la API son los mismos que muestra el inventario del escritorio con el filtro «Solo bajo el minimo»</w:t>
             </w:r>
+            <w:r>
+              <w:rPr>
+                <w:rtl w:val="0"/>
+              </w:rPr>
+            </w:r>
           </w:p>
         </w:tc>
         <w:tc>
@@ -9533,20 +9653,24 @@
               </w:rPr>
               <w:t xml:space="preserve">RF-INV-09</w:t>
             </w:r>
-          </w:p>
-        </w:tc>
-        <w:tc>
-          <w:tcPr>
-            <w:tcBorders>
-              <w:top w:color="a6a6a6" w:space="0" w:sz="4" w:val="single"/>
-              <w:left w:color="a6a6a6" w:space="0" w:sz="4" w:val="single"/>
-              <w:bottom w:color="a6a6a6" w:space="0" w:sz="4" w:val="single"/>
-              <w:right w:color="a6a6a6" w:space="0" w:sz="4" w:val="single"/>
-            </w:tcBorders>
-          </w:tcPr>
-          <w:p>
-            <w:pPr>
-              <w:spacing w:after="0" w:before="0" w:lineRule="auto"/>
+            <w:r>
+              <w:rPr>
+                <w:rtl w:val="0"/>
+              </w:rPr>
+            </w:r>
+          </w:p>
+        </w:tc>
+        <w:tc>
+          <w:tcPr>
+            <w:tcBorders>
+              <w:top w:color="a6a6a6" w:space="0" w:sz="4" w:val="single"/>
+              <w:left w:color="a6a6a6" w:space="0" w:sz="4" w:val="single"/>
+              <w:bottom w:color="a6a6a6" w:space="0" w:sz="4" w:val="single"/>
+              <w:right w:color="a6a6a6" w:space="0" w:sz="4" w:val="single"/>
+            </w:tcBorders>
+          </w:tcPr>
+          <w:p>
+            <w:pPr>
               <w:jc w:val="center"/>
               <w:rPr/>
             </w:pPr>
@@ -9554,10 +9678,14 @@
               <w:rPr>
                 <w:sz w:val="19"/>
                 <w:szCs w:val="19"/>
-                <w:highlight w:val="yellow"/>
-                <w:rtl w:val="0"/>
-              </w:rPr>
-              <w:t xml:space="preserve">PENDIENTE</w:t>
+                <w:rtl w:val="0"/>
+              </w:rPr>
+              <w:t xml:space="preserve">CUMPLE</w:t>
+            </w:r>
+            <w:r>
+              <w:rPr>
+                <w:rtl w:val="0"/>
+              </w:rPr>
             </w:r>
           </w:p>
         </w:tc>
@@ -9592,6 +9720,11 @@
               </w:rPr>
               <w:t xml:space="preserve">13</w:t>
             </w:r>
+            <w:r>
+              <w:rPr>
+                <w:rtl w:val="0"/>
+              </w:rPr>
+            </w:r>
           </w:p>
         </w:tc>
         <w:tc>
@@ -9619,6 +9752,11 @@
               </w:rPr>
               <w:t xml:space="preserve">Escritorio: al subir el stock mínimo de TNQ-01 por sobre su stock, la API lo incluye con cantidad sugerida = 2 × mínimo − stock</w:t>
             </w:r>
+            <w:r>
+              <w:rPr>
+                <w:rtl w:val="0"/>
+              </w:rPr>
+            </w:r>
           </w:p>
         </w:tc>
         <w:tc>
@@ -9646,20 +9784,24 @@
               </w:rPr>
               <w:t xml:space="preserve">RF-INV-09</w:t>
             </w:r>
-          </w:p>
-        </w:tc>
-        <w:tc>
-          <w:tcPr>
-            <w:tcBorders>
-              <w:top w:color="a6a6a6" w:space="0" w:sz="4" w:val="single"/>
-              <w:left w:color="a6a6a6" w:space="0" w:sz="4" w:val="single"/>
-              <w:bottom w:color="a6a6a6" w:space="0" w:sz="4" w:val="single"/>
-              <w:right w:color="a6a6a6" w:space="0" w:sz="4" w:val="single"/>
-            </w:tcBorders>
-          </w:tcPr>
-          <w:p>
-            <w:pPr>
-              <w:spacing w:after="0" w:before="0" w:lineRule="auto"/>
+            <w:r>
+              <w:rPr>
+                <w:rtl w:val="0"/>
+              </w:rPr>
+            </w:r>
+          </w:p>
+        </w:tc>
+        <w:tc>
+          <w:tcPr>
+            <w:tcBorders>
+              <w:top w:color="a6a6a6" w:space="0" w:sz="4" w:val="single"/>
+              <w:left w:color="a6a6a6" w:space="0" w:sz="4" w:val="single"/>
+              <w:bottom w:color="a6a6a6" w:space="0" w:sz="4" w:val="single"/>
+              <w:right w:color="a6a6a6" w:space="0" w:sz="4" w:val="single"/>
+            </w:tcBorders>
+          </w:tcPr>
+          <w:p>
+            <w:pPr>
               <w:jc w:val="center"/>
               <w:rPr/>
             </w:pPr>
@@ -9667,10 +9809,14 @@
               <w:rPr>
                 <w:sz w:val="19"/>
                 <w:szCs w:val="19"/>
-                <w:highlight w:val="yellow"/>
-                <w:rtl w:val="0"/>
-              </w:rPr>
-              <w:t xml:space="preserve">PENDIENTE</w:t>
+                <w:rtl w:val="0"/>
+              </w:rPr>
+              <w:t xml:space="preserve">CUMPLE</w:t>
+            </w:r>
+            <w:r>
+              <w:rPr>
+                <w:rtl w:val="0"/>
+              </w:rPr>
             </w:r>
           </w:p>
         </w:tc>
@@ -9705,6 +9851,11 @@
               </w:rPr>
               <w:t xml:space="preserve">14</w:t>
             </w:r>
+            <w:r>
+              <w:rPr>
+                <w:rtl w:val="0"/>
+              </w:rPr>
+            </w:r>
           </w:p>
         </w:tc>
         <w:tc>
@@ -9732,6 +9883,11 @@
               </w:rPr>
               <w:t xml:space="preserve">Swagger: materiales con las claves portal-web y portal-clientes responde 403, sin datos del inventario</w:t>
             </w:r>
+            <w:r>
+              <w:rPr>
+                <w:rtl w:val="0"/>
+              </w:rPr>
+            </w:r>
           </w:p>
         </w:tc>
         <w:tc>
@@ -9759,20 +9915,24 @@
               </w:rPr>
               <w:t xml:space="preserve">RF-INT-04</w:t>
             </w:r>
-          </w:p>
-        </w:tc>
-        <w:tc>
-          <w:tcPr>
-            <w:tcBorders>
-              <w:top w:color="a6a6a6" w:space="0" w:sz="4" w:val="single"/>
-              <w:left w:color="a6a6a6" w:space="0" w:sz="4" w:val="single"/>
-              <w:bottom w:color="a6a6a6" w:space="0" w:sz="4" w:val="single"/>
-              <w:right w:color="a6a6a6" w:space="0" w:sz="4" w:val="single"/>
-            </w:tcBorders>
-          </w:tcPr>
-          <w:p>
-            <w:pPr>
-              <w:spacing w:after="0" w:before="0" w:lineRule="auto"/>
+            <w:r>
+              <w:rPr>
+                <w:rtl w:val="0"/>
+              </w:rPr>
+            </w:r>
+          </w:p>
+        </w:tc>
+        <w:tc>
+          <w:tcPr>
+            <w:tcBorders>
+              <w:top w:color="a6a6a6" w:space="0" w:sz="4" w:val="single"/>
+              <w:left w:color="a6a6a6" w:space="0" w:sz="4" w:val="single"/>
+              <w:bottom w:color="a6a6a6" w:space="0" w:sz="4" w:val="single"/>
+              <w:right w:color="a6a6a6" w:space="0" w:sz="4" w:val="single"/>
+            </w:tcBorders>
+          </w:tcPr>
+          <w:p>
+            <w:pPr>
               <w:jc w:val="center"/>
               <w:rPr/>
             </w:pPr>
@@ -9780,10 +9940,14 @@
               <w:rPr>
                 <w:sz w:val="19"/>
                 <w:szCs w:val="19"/>
-                <w:highlight w:val="yellow"/>
-                <w:rtl w:val="0"/>
-              </w:rPr>
-              <w:t xml:space="preserve">PENDIENTE</w:t>
+                <w:rtl w:val="0"/>
+              </w:rPr>
+              <w:t xml:space="preserve">CUMPLE</w:t>
+            </w:r>
+            <w:r>
+              <w:rPr>
+                <w:rtl w:val="0"/>
+              </w:rPr>
             </w:r>
           </w:p>
         </w:tc>
@@ -9818,6 +9982,11 @@
               </w:rPr>
               <w:t xml:space="preserve">15</w:t>
             </w:r>
+            <w:r>
+              <w:rPr>
+                <w:rtl w:val="0"/>
+              </w:rPr>
+            </w:r>
           </w:p>
         </w:tc>
         <w:tc>
@@ -9845,6 +10014,11 @@
               </w:rPr>
               <w:t xml:space="preserve">Swagger: materiales sin clave responde 401</w:t>
             </w:r>
+            <w:r>
+              <w:rPr>
+                <w:rtl w:val="0"/>
+              </w:rPr>
+            </w:r>
           </w:p>
         </w:tc>
         <w:tc>
@@ -9872,20 +10046,24 @@
               </w:rPr>
               <w:t xml:space="preserve">RF-INT-04</w:t>
             </w:r>
-          </w:p>
-        </w:tc>
-        <w:tc>
-          <w:tcPr>
-            <w:tcBorders>
-              <w:top w:color="a6a6a6" w:space="0" w:sz="4" w:val="single"/>
-              <w:left w:color="a6a6a6" w:space="0" w:sz="4" w:val="single"/>
-              <w:bottom w:color="a6a6a6" w:space="0" w:sz="4" w:val="single"/>
-              <w:right w:color="a6a6a6" w:space="0" w:sz="4" w:val="single"/>
-            </w:tcBorders>
-          </w:tcPr>
-          <w:p>
-            <w:pPr>
-              <w:spacing w:after="0" w:before="0" w:lineRule="auto"/>
+            <w:r>
+              <w:rPr>
+                <w:rtl w:val="0"/>
+              </w:rPr>
+            </w:r>
+          </w:p>
+        </w:tc>
+        <w:tc>
+          <w:tcPr>
+            <w:tcBorders>
+              <w:top w:color="a6a6a6" w:space="0" w:sz="4" w:val="single"/>
+              <w:left w:color="a6a6a6" w:space="0" w:sz="4" w:val="single"/>
+              <w:bottom w:color="a6a6a6" w:space="0" w:sz="4" w:val="single"/>
+              <w:right w:color="a6a6a6" w:space="0" w:sz="4" w:val="single"/>
+            </w:tcBorders>
+          </w:tcPr>
+          <w:p>
+            <w:pPr>
               <w:jc w:val="center"/>
               <w:rPr/>
             </w:pPr>
@@ -9893,10 +10071,14 @@
               <w:rPr>
                 <w:sz w:val="19"/>
                 <w:szCs w:val="19"/>
-                <w:highlight w:val="yellow"/>
-                <w:rtl w:val="0"/>
-              </w:rPr>
-              <w:t xml:space="preserve">PENDIENTE</w:t>
+                <w:rtl w:val="0"/>
+              </w:rPr>
+              <w:t xml:space="preserve">CUMPLE</w:t>
+            </w:r>
+            <w:r>
+              <w:rPr>
+                <w:rtl w:val="0"/>
+              </w:rPr>
             </w:r>
           </w:p>
         </w:tc>
@@ -9931,6 +10113,11 @@
               </w:rPr>
               <w:t xml:space="preserve">16</w:t>
             </w:r>
+            <w:r>
+              <w:rPr>
+                <w:rtl w:val="0"/>
+              </w:rPr>
+            </w:r>
           </w:p>
         </w:tc>
         <w:tc>
@@ -9958,6 +10145,11 @@
               </w:rPr>
               <w:t xml:space="preserve">Escritorio: el registro de integraciones muestra las consultas api_materiales con su código de respuesta y latencia</w:t>
             </w:r>
+            <w:r>
+              <w:rPr>
+                <w:rtl w:val="0"/>
+              </w:rPr>
+            </w:r>
           </w:p>
         </w:tc>
         <w:tc>
@@ -9985,20 +10177,24 @@
               </w:rPr>
               <w:t xml:space="preserve">RF-INT-01</w:t>
             </w:r>
-          </w:p>
-        </w:tc>
-        <w:tc>
-          <w:tcPr>
-            <w:tcBorders>
-              <w:top w:color="a6a6a6" w:space="0" w:sz="4" w:val="single"/>
-              <w:left w:color="a6a6a6" w:space="0" w:sz="4" w:val="single"/>
-              <w:bottom w:color="a6a6a6" w:space="0" w:sz="4" w:val="single"/>
-              <w:right w:color="a6a6a6" w:space="0" w:sz="4" w:val="single"/>
-            </w:tcBorders>
-          </w:tcPr>
-          <w:p>
-            <w:pPr>
-              <w:spacing w:after="0" w:before="0" w:lineRule="auto"/>
+            <w:r>
+              <w:rPr>
+                <w:rtl w:val="0"/>
+              </w:rPr>
+            </w:r>
+          </w:p>
+        </w:tc>
+        <w:tc>
+          <w:tcPr>
+            <w:tcBorders>
+              <w:top w:color="a6a6a6" w:space="0" w:sz="4" w:val="single"/>
+              <w:left w:color="a6a6a6" w:space="0" w:sz="4" w:val="single"/>
+              <w:bottom w:color="a6a6a6" w:space="0" w:sz="4" w:val="single"/>
+              <w:right w:color="a6a6a6" w:space="0" w:sz="4" w:val="single"/>
+            </w:tcBorders>
+          </w:tcPr>
+          <w:p>
+            <w:pPr>
               <w:jc w:val="center"/>
               <w:rPr/>
             </w:pPr>
@@ -10006,10 +10202,14 @@
               <w:rPr>
                 <w:sz w:val="19"/>
                 <w:szCs w:val="19"/>
-                <w:highlight w:val="yellow"/>
-                <w:rtl w:val="0"/>
-              </w:rPr>
-              <w:t xml:space="preserve">PENDIENTE</w:t>
+                <w:rtl w:val="0"/>
+              </w:rPr>
+              <w:t xml:space="preserve">CUMPLE</w:t>
+            </w:r>
+            <w:r>
+              <w:rPr>
+                <w:rtl w:val="0"/>
+              </w:rPr>
             </w:r>
           </w:p>
         </w:tc>
@@ -10038,36 +10238,24 @@
           <w:bCs w:val="1"/>
           <w:rtl w:val="0"/>
         </w:rPr>
-        <w:t xml:space="preserve">Resultado: </w:t>
-      </w:r>
-      <w:r>
-        <w:rPr>
-          <w:b w:val="1"/>
-          <w:bCs w:val="1"/>
-          <w:highlight w:val="yellow"/>
-          <w:rtl w:val="0"/>
-        </w:rPr>
-        <w:t xml:space="preserve">__ de 16</w:t>
-      </w:r>
-      <w:r>
-        <w:rPr>
-          <w:b w:val="1"/>
-          <w:bCs w:val="1"/>
-          <w:rtl w:val="0"/>
-        </w:rPr>
-        <w:t xml:space="preserve"> casos aprobados.</w:t>
+        <w:t xml:space="preserve">Resultado: 16 de 16 casos aprobados.</w:t>
+      </w:r>
+      <w:r>
+        <w:rPr>
+          <w:rtl w:val="0"/>
+        </w:rPr>
       </w:r>
     </w:p>
     <w:p>
       <w:pPr>
         <w:pStyle w:val="Heading2"/>
-        <w:keepNext/>
+        <w:keepNext w:val="1"/>
         <w:rPr>
           <w:rFonts w:ascii="Calibri" w:cs="Calibri" w:eastAsia="Calibri" w:hAnsi="Calibri"/>
         </w:rPr>
       </w:pPr>
-      <w:bookmarkStart w:id="904" w:name="_heading=h.api904"/>
-      <w:bookmarkEnd w:id="904"/>
+      <w:bookmarkStart w:colFirst="0" w:colLast="0" w:name="_z4c7teqozc04" w:id="14"/>
+      <w:bookmarkEnd w:id="14"/>
       <w:r>
         <w:rPr>
           <w:rFonts w:ascii="Calibri" w:cs="Calibri" w:eastAsia="Calibri" w:hAnsi="Calibri"/>
@@ -10078,7 +10266,7 @@
     </w:p>
     <w:p>
       <w:pPr>
-        <w:keepNext/>
+        <w:keepNext w:val="1"/>
         <w:spacing w:after="120" w:before="0" w:line="276" w:lineRule="auto"/>
         <w:rPr/>
       </w:pPr>
@@ -10097,10 +10285,84 @@
       </w:pPr>
       <w:r>
         <w:rPr>
-          <w:b/>
-          <w:highlight w:val="yellow"/>
-        </w:rPr>
-        <w:t xml:space="preserve">[Reemplazar esta captura por la nueva: 55 pruebas de las APIs y 291 de la suite. Clic derecho en la imagen → Cambiar imagen.]</w:t>
+          <w:b w:val="1"/>
+          <w:bCs w:val="1"/>
+        </w:rPr>
+        <w:drawing>
+          <wp:inline distB="114300" distT="114300" distL="114300" distR="114300">
+            <wp:extent cx="5731200" cy="3225800"/>
+            <wp:effectExtent b="0" l="0" r="0" t="0"/>
+            <wp:docPr id="12" name="image1.png"/>
+            <a:graphic>
+              <a:graphicData uri="http://schemas.openxmlformats.org/drawingml/2006/picture">
+                <pic:pic>
+                  <pic:nvPicPr>
+                    <pic:cNvPr id="0" name="image1.png"/>
+                    <pic:cNvPicPr preferRelativeResize="0"/>
+                  </pic:nvPicPr>
+                  <pic:blipFill>
+                    <a:blip r:embed="rId13"/>
+                    <a:srcRect b="0" l="0" r="0" t="0"/>
+                    <a:stretch>
+                      <a:fillRect/>
+                    </a:stretch>
+                  </pic:blipFill>
+                  <pic:spPr>
+                    <a:xfrm>
+                      <a:off x="0" y="0"/>
+                      <a:ext cx="5731200" cy="3225800"/>
+                    </a:xfrm>
+                    <a:prstGeom prst="rect"/>
+                    <a:ln/>
+                  </pic:spPr>
+                </pic:pic>
+              </a:graphicData>
+            </a:graphic>
+          </wp:inline>
+        </w:drawing>
+      </w:r>
+      <w:r>
+        <w:rPr>
+          <w:b w:val="1"/>
+          <w:bCs w:val="1"/>
+        </w:rPr>
+        <w:drawing>
+          <wp:inline distB="114300" distT="114300" distL="114300" distR="114300">
+            <wp:extent cx="5731200" cy="3225800"/>
+            <wp:effectExtent b="0" l="0" r="0" t="0"/>
+            <wp:docPr id="2" name="image12.png"/>
+            <a:graphic>
+              <a:graphicData uri="http://schemas.openxmlformats.org/drawingml/2006/picture">
+                <pic:pic>
+                  <pic:nvPicPr>
+                    <pic:cNvPr id="0" name="image12.png"/>
+                    <pic:cNvPicPr preferRelativeResize="0"/>
+                  </pic:nvPicPr>
+                  <pic:blipFill>
+                    <a:blip r:embed="rId14"/>
+                    <a:srcRect b="0" l="0" r="0" t="0"/>
+                    <a:stretch>
+                      <a:fillRect/>
+                    </a:stretch>
+                  </pic:blipFill>
+                  <pic:spPr>
+                    <a:xfrm>
+                      <a:off x="0" y="0"/>
+                      <a:ext cx="5731200" cy="3225800"/>
+                    </a:xfrm>
+                    <a:prstGeom prst="rect"/>
+                    <a:ln/>
+                  </pic:spPr>
+                </pic:pic>
+              </a:graphicData>
+            </a:graphic>
+          </wp:inline>
+        </w:drawing>
+      </w:r>
+      <w:r>
+        <w:rPr>
+          <w:rtl w:val="0"/>
+        </w:rPr>
       </w:r>
     </w:p>
     <w:p>
@@ -10110,43 +10372,14 @@
         <w:rPr/>
       </w:pPr>
       <w:r>
-        <w:drawing>
-          <wp:inline>
-            <wp:extent cx="5486400" cy="4608576"/>
-            <wp:docPr id="6" name="Picture 6"/>
-            <wp:cNvGraphicFramePr>
-              <a:graphicFrameLocks noChangeAspect="1"/>
-            </wp:cNvGraphicFramePr>
-            <a:graphic>
-              <a:graphicData uri="http://schemas.openxmlformats.org/drawingml/2006/picture">
-                <pic:pic>
-                  <pic:nvPicPr>
-                    <pic:cNvPr id="0" name="14_pytest_apis.png"/>
-                    <pic:cNvPicPr/>
-                  </pic:nvPicPr>
-                  <pic:blipFill>
-                    <a:blip r:embed="rId21"/>
-                    <a:stretch>
-                      <a:fillRect/>
-                    </a:stretch>
-                  </pic:blipFill>
-                  <pic:spPr>
-                    <a:xfrm>
-                      <a:off x="0" y="0"/>
-                      <a:ext cx="5486400" cy="4608576"/>
-                    </a:xfrm>
-                    <a:prstGeom prst="rect"/>
-                  </pic:spPr>
-                </pic:pic>
-              </a:graphicData>
-            </a:graphic>
-          </wp:inline>
-        </w:drawing>
+        <w:rPr>
+          <w:rtl w:val="0"/>
+        </w:rPr>
       </w:r>
     </w:p>
     <w:p>
       <w:pPr>
-        <w:keepNext/>
+        <w:keepNext w:val="1"/>
         <w:spacing w:after="120" w:before="0" w:line="276" w:lineRule="auto"/>
         <w:rPr/>
       </w:pPr>
@@ -10164,22 +10397,22 @@
         <w:rPr/>
       </w:pPr>
       <w:r>
+        <w:rPr/>
         <w:drawing>
-          <wp:inline>
+          <wp:inline distB="0" distT="0" distL="114300" distR="114300">
             <wp:extent cx="4206240" cy="5236236"/>
-            <wp:docPr id="7" name="Picture 7"/>
-            <wp:cNvGraphicFramePr>
-              <a:graphicFrameLocks noChangeAspect="1"/>
-            </wp:cNvGraphicFramePr>
+            <wp:effectExtent b="0" l="0" r="0" t="0"/>
+            <wp:docPr id="9" name="image6.png"/>
             <a:graphic>
               <a:graphicData uri="http://schemas.openxmlformats.org/drawingml/2006/picture">
                 <pic:pic>
                   <pic:nvPicPr>
-                    <pic:cNvPr id="0" name="12_swagger_estimacion_403.png"/>
-                    <pic:cNvPicPr/>
+                    <pic:cNvPr id="0" name="image6.png"/>
+                    <pic:cNvPicPr preferRelativeResize="0"/>
                   </pic:nvPicPr>
                   <pic:blipFill>
-                    <a:blip r:embed="rId22"/>
+                    <a:blip r:embed="rId15"/>
+                    <a:srcRect b="0" l="0" r="0" t="0"/>
                     <a:stretch>
                       <a:fillRect/>
                     </a:stretch>
@@ -10190,6 +10423,7 @@
                       <a:ext cx="4206240" cy="5236236"/>
                     </a:xfrm>
                     <a:prstGeom prst="rect"/>
+                    <a:ln/>
                   </pic:spPr>
                 </pic:pic>
               </a:graphicData>
@@ -10197,10 +10431,15 @@
           </wp:inline>
         </w:drawing>
       </w:r>
+      <w:r>
+        <w:rPr>
+          <w:rtl w:val="0"/>
+        </w:rPr>
+      </w:r>
     </w:p>
     <w:p>
       <w:pPr>
-        <w:keepNext/>
+        <w:keepNext w:val="1"/>
         <w:spacing w:after="120" w:before="0" w:line="276" w:lineRule="auto"/>
         <w:rPr/>
       </w:pPr>
@@ -10218,22 +10457,22 @@
         <w:rPr/>
       </w:pPr>
       <w:r>
+        <w:rPr/>
         <w:drawing>
-          <wp:inline>
+          <wp:inline distB="0" distT="0" distL="114300" distR="114300">
             <wp:extent cx="5669280" cy="3060234"/>
-            <wp:docPr id="8" name="Picture 8"/>
-            <wp:cNvGraphicFramePr>
-              <a:graphicFrameLocks noChangeAspect="1"/>
-            </wp:cNvGraphicFramePr>
+            <wp:effectExtent b="0" l="0" r="0" t="0"/>
+            <wp:docPr id="11" name="image5.png"/>
             <a:graphic>
               <a:graphicData uri="http://schemas.openxmlformats.org/drawingml/2006/picture">
                 <pic:pic>
                   <pic:nvPicPr>
-                    <pic:cNvPr id="0" name="13_escritorio_integraciones.png"/>
-                    <pic:cNvPicPr/>
+                    <pic:cNvPr id="0" name="image5.png"/>
+                    <pic:cNvPicPr preferRelativeResize="0"/>
                   </pic:nvPicPr>
                   <pic:blipFill>
-                    <a:blip r:embed="rId23"/>
+                    <a:blip r:embed="rId16"/>
+                    <a:srcRect b="0" l="0" r="0" t="0"/>
                     <a:stretch>
                       <a:fillRect/>
                     </a:stretch>
@@ -10244,6 +10483,7 @@
                       <a:ext cx="5669280" cy="3060234"/>
                     </a:xfrm>
                     <a:prstGeom prst="rect"/>
+                    <a:ln/>
                   </pic:spPr>
                 </pic:pic>
               </a:graphicData>
@@ -10251,10 +10491,15 @@
           </wp:inline>
         </w:drawing>
       </w:r>
+      <w:r>
+        <w:rPr>
+          <w:rtl w:val="0"/>
+        </w:rPr>
+      </w:r>
     </w:p>
     <w:p>
       <w:pPr>
-        <w:keepNext/>
+        <w:keepNext w:val="1"/>
         <w:spacing w:after="120" w:before="0" w:line="276" w:lineRule="auto"/>
         <w:rPr/>
       </w:pPr>
@@ -10273,15 +10518,51 @@
       </w:pPr>
       <w:r>
         <w:rPr>
-          <w:b/>
-          <w:highlight w:val="yellow"/>
-        </w:rPr>
-        <w:t xml:space="preserve">[Pegar aquí la captura de Swagger con la respuesta 200 de la clave proveedores]</w:t>
+          <w:b w:val="1"/>
+          <w:bCs w:val="1"/>
+        </w:rPr>
+        <w:drawing>
+          <wp:inline distB="114300" distT="114300" distL="114300" distR="114300">
+            <wp:extent cx="5731200" cy="3225800"/>
+            <wp:effectExtent b="0" l="0" r="0" t="0"/>
+            <wp:docPr id="3" name="image3.png"/>
+            <a:graphic>
+              <a:graphicData uri="http://schemas.openxmlformats.org/drawingml/2006/picture">
+                <pic:pic>
+                  <pic:nvPicPr>
+                    <pic:cNvPr id="0" name="image3.png"/>
+                    <pic:cNvPicPr preferRelativeResize="0"/>
+                  </pic:nvPicPr>
+                  <pic:blipFill>
+                    <a:blip r:embed="rId17"/>
+                    <a:srcRect b="0" l="0" r="0" t="0"/>
+                    <a:stretch>
+                      <a:fillRect/>
+                    </a:stretch>
+                  </pic:blipFill>
+                  <pic:spPr>
+                    <a:xfrm>
+                      <a:off x="0" y="0"/>
+                      <a:ext cx="5731200" cy="3225800"/>
+                    </a:xfrm>
+                    <a:prstGeom prst="rect"/>
+                    <a:ln/>
+                  </pic:spPr>
+                </pic:pic>
+              </a:graphicData>
+            </a:graphic>
+          </wp:inline>
+        </w:drawing>
+      </w:r>
+      <w:r>
+        <w:rPr>
+          <w:rtl w:val="0"/>
+        </w:rPr>
       </w:r>
     </w:p>
     <w:p>
       <w:pPr>
-        <w:keepNext/>
+        <w:keepNext w:val="1"/>
         <w:spacing w:after="120" w:before="0" w:line="276" w:lineRule="auto"/>
         <w:rPr/>
       </w:pPr>
@@ -10300,15 +10581,51 @@
       </w:pPr>
       <w:r>
         <w:rPr>
-          <w:b/>
-          <w:highlight w:val="yellow"/>
-        </w:rPr>
-        <w:t xml:space="preserve">[Pegar aquí la captura de Swagger con la respuesta 403 de la clave portal-web]</w:t>
+          <w:b w:val="1"/>
+          <w:bCs w:val="1"/>
+        </w:rPr>
+        <w:drawing>
+          <wp:inline distB="114300" distT="114300" distL="114300" distR="114300">
+            <wp:extent cx="5731200" cy="3225800"/>
+            <wp:effectExtent b="0" l="0" r="0" t="0"/>
+            <wp:docPr id="1" name="image2.png"/>
+            <a:graphic>
+              <a:graphicData uri="http://schemas.openxmlformats.org/drawingml/2006/picture">
+                <pic:pic>
+                  <pic:nvPicPr>
+                    <pic:cNvPr id="0" name="image2.png"/>
+                    <pic:cNvPicPr preferRelativeResize="0"/>
+                  </pic:nvPicPr>
+                  <pic:blipFill>
+                    <a:blip r:embed="rId18"/>
+                    <a:srcRect b="0" l="0" r="0" t="0"/>
+                    <a:stretch>
+                      <a:fillRect/>
+                    </a:stretch>
+                  </pic:blipFill>
+                  <pic:spPr>
+                    <a:xfrm>
+                      <a:off x="0" y="0"/>
+                      <a:ext cx="5731200" cy="3225800"/>
+                    </a:xfrm>
+                    <a:prstGeom prst="rect"/>
+                    <a:ln/>
+                  </pic:spPr>
+                </pic:pic>
+              </a:graphicData>
+            </a:graphic>
+          </wp:inline>
+        </w:drawing>
+      </w:r>
+      <w:r>
+        <w:rPr>
+          <w:rtl w:val="0"/>
+        </w:rPr>
       </w:r>
     </w:p>
     <w:p>
       <w:pPr>
-        <w:keepNext/>
+        <w:keepNext w:val="1"/>
         <w:spacing w:after="120" w:before="0" w:line="276" w:lineRule="auto"/>
         <w:rPr/>
       </w:pPr>
@@ -10327,22 +10644,58 @@
       </w:pPr>
       <w:r>
         <w:rPr>
-          <w:b/>
-          <w:highlight w:val="yellow"/>
-        </w:rPr>
-        <w:t xml:space="preserve">[Pegar aquí la captura del registro de integraciones del escritorio]</w:t>
+          <w:b w:val="1"/>
+          <w:bCs w:val="1"/>
+        </w:rPr>
+        <w:drawing>
+          <wp:inline distB="114300" distT="114300" distL="114300" distR="114300">
+            <wp:extent cx="5731200" cy="3225800"/>
+            <wp:effectExtent b="0" l="0" r="0" t="0"/>
+            <wp:docPr id="10" name="image10.png"/>
+            <a:graphic>
+              <a:graphicData uri="http://schemas.openxmlformats.org/drawingml/2006/picture">
+                <pic:pic>
+                  <pic:nvPicPr>
+                    <pic:cNvPr id="0" name="image10.png"/>
+                    <pic:cNvPicPr preferRelativeResize="0"/>
+                  </pic:nvPicPr>
+                  <pic:blipFill>
+                    <a:blip r:embed="rId19"/>
+                    <a:srcRect b="0" l="0" r="0" t="0"/>
+                    <a:stretch>
+                      <a:fillRect/>
+                    </a:stretch>
+                  </pic:blipFill>
+                  <pic:spPr>
+                    <a:xfrm>
+                      <a:off x="0" y="0"/>
+                      <a:ext cx="5731200" cy="3225800"/>
+                    </a:xfrm>
+                    <a:prstGeom prst="rect"/>
+                    <a:ln/>
+                  </pic:spPr>
+                </pic:pic>
+              </a:graphicData>
+            </a:graphic>
+          </wp:inline>
+        </w:drawing>
+      </w:r>
+      <w:r>
+        <w:rPr>
+          <w:rtl w:val="0"/>
+        </w:rPr>
       </w:r>
     </w:p>
     <w:p>
       <w:pPr>
         <w:pStyle w:val="Heading2"/>
-        <w:keepNext/>
+        <w:keepNext w:val="1"/>
         <w:rPr>
           <w:rFonts w:ascii="Calibri" w:cs="Calibri" w:eastAsia="Calibri" w:hAnsi="Calibri"/>
         </w:rPr>
       </w:pPr>
-      <w:bookmarkStart w:id="905" w:name="_heading=h.api905"/>
-      <w:bookmarkEnd w:id="905"/>
+      <w:bookmarkStart w:colFirst="0" w:colLast="0" w:name="_g6the3kn6bzc" w:id="15"/>
+      <w:bookmarkEnd w:id="15"/>
       <w:r>
         <w:rPr>
           <w:rFonts w:ascii="Calibri" w:cs="Calibri" w:eastAsia="Calibri" w:hAnsi="Calibri"/>
@@ -10368,8 +10721,8 @@
         <w:pStyle w:val="Heading1"/>
         <w:rPr/>
       </w:pPr>
-      <w:bookmarkStart w:colFirst="0" w:colLast="0" w:name="_heading=h.4ytoygum822i" w:id="11"/>
-      <w:bookmarkEnd w:id="11"/>
+      <w:bookmarkStart w:colFirst="0" w:colLast="0" w:name="_qtbxabkaw1rc" w:id="16"/>
+      <w:bookmarkEnd w:id="16"/>
       <w:r>
         <w:rPr>
           <w:rtl w:val="0"/>
@@ -10391,7 +10744,7 @@
     </w:p>
     <w:tbl>
       <w:tblPr>
-        <w:tblStyle w:val="Table6"/>
+        <w:tblStyle w:val="Table8"/>
         <w:tblW w:w="9025.0" w:type="dxa"/>
         <w:jc w:val="left"/>
         <w:tblInd w:w="-100.0" w:type="dxa"/>
@@ -10510,7 +10863,7 @@
               </w:rPr>
               <w:t xml:space="preserve">OWASP ZAP\</w:t>
             </w:r>
-            <w:hyperlink r:id="rId14">
+            <w:hyperlink r:id="rId20">
               <w:r>
                 <w:rPr>
                   <w:rFonts w:ascii="Arial" w:cs="Arial" w:eastAsia="Arial" w:hAnsi="Arial"/>
@@ -10518,7 +10871,6 @@
                   <w:sz w:val="21"/>
                   <w:szCs w:val="21"/>
                   <w:u w:val="single"/>
-                  <w:shd w:fill="f6f8fa" w:val="clear"/>
                   <w:rtl w:val="0"/>
                 </w:rPr>
                 <w:t xml:space="preserve">reporte_zap_web.html</w:t>
@@ -10812,32 +11164,42 @@
               </w:rPr>
               <w:t xml:space="preserve">APIs propias\captura_pytest_apis.png y reporte_pytest_apis.txt</w:t>
             </w:r>
-          </w:p>
-        </w:tc>
-        <w:tc>
-          <w:tcPr>
-            <w:tcBorders>
-              <w:top w:color="a6a6a6" w:space="0" w:sz="4" w:val="single"/>
-              <w:left w:color="a6a6a6" w:space="0" w:sz="4" w:val="single"/>
-              <w:bottom w:color="a6a6a6" w:space="0" w:sz="4" w:val="single"/>
-              <w:right w:color="a6a6a6" w:space="0" w:sz="4" w:val="single"/>
-            </w:tcBorders>
-          </w:tcPr>
-          <w:p>
-            <w:pPr>
-              <w:spacing w:after="0" w:before="0" w:lineRule="auto"/>
-              <w:jc w:val="left"/>
-              <w:rPr/>
-            </w:pPr>
-            <w:r>
-              <w:rPr>
-                <w:b w:val="0"/>
-                <w:bCs w:val="0"/>
-                <w:sz w:val="19"/>
-                <w:szCs w:val="19"/>
-                <w:rtl w:val="0"/>
-              </w:rPr>
-              <w:t>Salida de las 55 pruebas de las APIs y de la suite completa</w:t>
+            <w:r>
+              <w:rPr>
+                <w:rtl w:val="0"/>
+              </w:rPr>
+            </w:r>
+          </w:p>
+        </w:tc>
+        <w:tc>
+          <w:tcPr>
+            <w:tcBorders>
+              <w:top w:color="a6a6a6" w:space="0" w:sz="4" w:val="single"/>
+              <w:left w:color="a6a6a6" w:space="0" w:sz="4" w:val="single"/>
+              <w:bottom w:color="a6a6a6" w:space="0" w:sz="4" w:val="single"/>
+              <w:right w:color="a6a6a6" w:space="0" w:sz="4" w:val="single"/>
+            </w:tcBorders>
+          </w:tcPr>
+          <w:p>
+            <w:pPr>
+              <w:spacing w:after="0" w:before="0" w:lineRule="auto"/>
+              <w:jc w:val="left"/>
+              <w:rPr/>
+            </w:pPr>
+            <w:r>
+              <w:rPr>
+                <w:b w:val="0"/>
+                <w:bCs w:val="0"/>
+                <w:sz w:val="19"/>
+                <w:szCs w:val="19"/>
+                <w:rtl w:val="0"/>
+              </w:rPr>
+              <w:t xml:space="preserve">Salida de las 55 pruebas de las APIs y de la suite completa</w:t>
+            </w:r>
+            <w:r>
+              <w:rPr>
+                <w:rtl w:val="0"/>
+              </w:rPr>
             </w:r>
           </w:p>
         </w:tc>
@@ -10898,8 +11260,8 @@
         <w:pStyle w:val="Heading1"/>
         <w:rPr/>
       </w:pPr>
-      <w:bookmarkStart w:colFirst="0" w:colLast="0" w:name="_heading=h.ynoekp8vpfqc" w:id="12"/>
-      <w:bookmarkEnd w:id="12"/>
+      <w:bookmarkStart w:colFirst="0" w:colLast="0" w:name="_wj9h3hnm7d32" w:id="17"/>
+      <w:bookmarkEnd w:id="17"/>
       <w:r>
         <w:rPr>
           <w:rtl w:val="0"/>
@@ -10909,7 +11271,7 @@
     </w:p>
     <w:tbl>
       <w:tblPr>
-        <w:tblStyle w:val="Table7"/>
+        <w:tblStyle w:val="Table9"/>
         <w:tblW w:w="9025.0" w:type="dxa"/>
         <w:jc w:val="left"/>
         <w:tblInd w:w="-100.0" w:type="dxa"/>
@@ -10933,7 +11295,7 @@
       <w:tr>
         <w:trPr>
           <w:cantSplit w:val="0"/>
-          <w:tblHeader w:val="1"/>
+          <w:tblHeader w:val="0"/>
         </w:trPr>
         <w:tc>
           <w:tcPr>
@@ -11226,6 +11588,11 @@
               </w:rPr>
               <w:t xml:space="preserve">19-10-2026</w:t>
             </w:r>
+            <w:r>
+              <w:rPr>
+                <w:rtl w:val="0"/>
+              </w:rPr>
+            </w:r>
           </w:p>
         </w:tc>
         <w:tc>
@@ -11253,6 +11620,11 @@
               </w:rPr>
               <w:t xml:space="preserve">1.1</w:t>
             </w:r>
+            <w:r>
+              <w:rPr>
+                <w:rtl w:val="0"/>
+              </w:rPr>
+            </w:r>
           </w:p>
         </w:tc>
         <w:tc>
@@ -11280,6 +11652,11 @@
               </w:rPr>
               <w:t xml:space="preserve">Pruebas de las APIs propias (sección 6): 43 pruebas automatizadas, suite completa de 279 pruebas y 10 casos manuales.</w:t>
             </w:r>
+            <w:r>
+              <w:rPr>
+                <w:rtl w:val="0"/>
+              </w:rPr>
+            </w:r>
           </w:p>
         </w:tc>
         <w:tc>
@@ -11304,6 +11681,11 @@
                 <w:rtl w:val="0"/>
               </w:rPr>
               <w:t xml:space="preserve">Milko Soto</w:t>
+            </w:r>
+            <w:r>
+              <w:rPr>
+                <w:rtl w:val="0"/>
+              </w:rPr>
             </w:r>
           </w:p>
         </w:tc>
@@ -11332,10 +11714,14 @@
               <w:rPr>
                 <w:sz w:val="19"/>
                 <w:szCs w:val="19"/>
-                <w:highlight w:val="yellow"/>
-                <w:rtl w:val="0"/>
-              </w:rPr>
-              <w:t xml:space="preserve">dd-mm-2026</w:t>
+                <w:rtl w:val="0"/>
+              </w:rPr>
+              <w:t xml:space="preserve">26-10-2026</w:t>
+            </w:r>
+            <w:r>
+              <w:rPr>
+                <w:rtl w:val="0"/>
+              </w:rPr>
             </w:r>
           </w:p>
         </w:tc>
@@ -11364,6 +11750,11 @@
               </w:rPr>
               <w:t xml:space="preserve">1.2</w:t>
             </w:r>
+            <w:r>
+              <w:rPr>
+                <w:rtl w:val="0"/>
+              </w:rPr>
+            </w:r>
           </w:p>
         </w:tc>
         <w:tc>
@@ -11391,6 +11782,11 @@
               </w:rPr>
               <w:t xml:space="preserve">API de disponibilidad de materiales (sección 6): 12 pruebas automatizadas nuevas (55 de las APIs y 291 de la suite completa) y casos manuales 11 a 16.</w:t>
             </w:r>
+            <w:r>
+              <w:rPr>
+                <w:rtl w:val="0"/>
+              </w:rPr>
+            </w:r>
           </w:p>
         </w:tc>
         <w:tc>
@@ -11415,6 +11811,11 @@
                 <w:rtl w:val="0"/>
               </w:rPr>
               <w:t xml:space="preserve">Milko Soto</w:t>
+            </w:r>
+            <w:r>
+              <w:rPr>
+                <w:rtl w:val="0"/>
+              </w:rPr>
             </w:r>
           </w:p>
         </w:tc>
@@ -11446,14 +11847,14 @@
       </w:r>
     </w:p>
     <w:sectPr>
-      <w:headerReference r:id="rId15" w:type="default"/>
-      <w:headerReference r:id="rId16" w:type="first"/>
-      <w:headerReference r:id="rId17" w:type="even"/>
-      <w:footerReference r:id="rId18" w:type="default"/>
-      <w:footerReference r:id="rId19" w:type="first"/>
-      <w:footerReference r:id="rId20" w:type="even"/>
+      <w:headerReference r:id="rId21" w:type="default"/>
+      <w:headerReference r:id="rId22" w:type="first"/>
+      <w:headerReference r:id="rId23" w:type="even"/>
+      <w:footerReference r:id="rId24" w:type="default"/>
+      <w:footerReference r:id="rId25" w:type="first"/>
+      <w:footerReference r:id="rId26" w:type="even"/>
       <w:pgSz w:h="16838" w:w="11906" w:orient="portrait"/>
-      <w:pgMar w:bottom="1440" w:top="1440" w:left="1440" w:right="1440" w:header="708" w:footer="708" w:gutter="0"/>
+      <w:pgMar w:bottom="1440" w:top="1440" w:left="1440" w:right="1440" w:header="708" w:footer="708"/>
       <w:pgNumType w:start="1"/>
     </w:sectPr>
   </w:body>
@@ -11613,7 +12014,7 @@
         <w:szCs w:val="16"/>
         <w:rtl w:val="0"/>
       </w:rPr>
-      <w:t>SITRAFO · Informe de pruebas de calidad en producción · PRU-01 v1.2</w:t>
+      <w:t xml:space="preserve">SITRAFO · Informe de pruebas de calidad en producción · PRU-01 v1.2</w:t>
     </w:r>
     <w:r>
       <w:rPr>
@@ -11933,455 +12334,6 @@
       <w:szCs w:val="56"/>
     </w:rPr>
   </w:style>
-  <w:style w:type="table" w:styleId="TableNormal" w:default="1">
-    <w:name w:val="TableNormal"/>
-    <w:tblPr>
-      <w:tblCellMar>
-        <w:top w:w="100.0" w:type="dxa"/>
-        <w:left w:w="100.0" w:type="dxa"/>
-        <w:bottom w:w="100.0" w:type="dxa"/>
-        <w:right w:w="100.0" w:type="dxa"/>
-      </w:tblCellMar>
-    </w:tblPr>
-  </w:style>
-  <w:style w:type="paragraph" w:styleId="Normal" w:default="1">
-    <w:name w:val="normal"/>
-  </w:style>
-  <w:style w:type="table" w:styleId="TableNormal" w:default="1">
-    <w:name w:val="TableNormal"/>
-    <w:tblPr>
-      <w:tblCellMar>
-        <w:top w:w="100.0" w:type="dxa"/>
-        <w:left w:w="100.0" w:type="dxa"/>
-        <w:bottom w:w="100.0" w:type="dxa"/>
-        <w:right w:w="100.0" w:type="dxa"/>
-      </w:tblCellMar>
-    </w:tblPr>
-  </w:style>
-  <w:style w:type="paragraph" w:styleId="Normal" w:default="1">
-    <w:name w:val="normal"/>
-  </w:style>
-  <w:style w:type="character" w:styleId="Hyperlink">
-    <w:name w:val="Hyperlink"/>
-    <w:uiPriority w:val="99"/>
-    <w:unhideWhenUsed w:val="1"/>
-    <w:rPr>
-      <w:color w:val="0563c1"/>
-      <w:u w:val="single"/>
-    </w:rPr>
-  </w:style>
-  <w:style w:type="character" w:styleId="FootnoteCharacters">
-    <w:name w:val="Footnote Characters"/>
-    <w:uiPriority w:val="99"/>
-    <w:semiHidden w:val="1"/>
-    <w:unhideWhenUsed w:val="1"/>
-    <w:qFormat w:val="1"/>
-    <w:rPr>
-      <w:vertAlign w:val="superscript"/>
-    </w:rPr>
-  </w:style>
-  <w:style w:type="character" w:styleId="FootnoteReference">
-    <w:name w:val="Footnote Reference"/>
-    <w:rPr>
-      <w:vertAlign w:val="superscript"/>
-    </w:rPr>
-  </w:style>
-  <w:style w:type="character" w:styleId="FootnoteTextChar">
-    <w:name w:val="Footnote Text Char"/>
-    <w:link w:val="FootnoteText"/>
-    <w:uiPriority w:val="99"/>
-    <w:semiHidden w:val="1"/>
-    <w:unhideWhenUsed w:val="1"/>
-    <w:qFormat w:val="1"/>
-    <w:rPr>
-      <w:sz w:val="20"/>
-      <w:szCs w:val="20"/>
-    </w:rPr>
-  </w:style>
-  <w:style w:type="character" w:styleId="EndnoteCharacters">
-    <w:name w:val="Endnote Characters"/>
-    <w:uiPriority w:val="99"/>
-    <w:semiHidden w:val="1"/>
-    <w:unhideWhenUsed w:val="1"/>
-    <w:qFormat w:val="1"/>
-    <w:rPr>
-      <w:vertAlign w:val="superscript"/>
-    </w:rPr>
-  </w:style>
-  <w:style w:type="character" w:styleId="EndnoteReference">
-    <w:name w:val="Endnote Reference"/>
-    <w:rPr>
-      <w:vertAlign w:val="superscript"/>
-    </w:rPr>
-  </w:style>
-  <w:style w:type="character" w:styleId="EndnoteTextChar">
-    <w:name w:val="Endnote Text Char"/>
-    <w:link w:val="EndnoteText"/>
-    <w:uiPriority w:val="99"/>
-    <w:semiHidden w:val="1"/>
-    <w:unhideWhenUsed w:val="1"/>
-    <w:qFormat w:val="1"/>
-    <w:rPr>
-      <w:sz w:val="20"/>
-      <w:szCs w:val="20"/>
-    </w:rPr>
-  </w:style>
-  <w:style w:type="character" w:styleId="IndexLink">
-    <w:name w:val="Index Link"/>
-    <w:qFormat w:val="1"/>
-    <w:rPr/>
-  </w:style>
-  <w:style w:type="paragraph" w:styleId="Heading">
-    <w:name w:val="Heading"/>
-    <w:basedOn w:val="Normal"/>
-    <w:next w:val="BodyText"/>
-    <w:qFormat w:val="1"/>
-    <w:pPr>
-      <w:keepNext w:val="1"/>
-      <w:spacing w:after="120" w:before="240"/>
-    </w:pPr>
-    <w:rPr>
-      <w:rFonts w:ascii="Liberation Sans" w:cs="FreeSans" w:eastAsia="Noto Sans CJK SC" w:hAnsi="Liberation Sans"/>
-      <w:sz w:val="28"/>
-      <w:szCs w:val="28"/>
-    </w:rPr>
-  </w:style>
-  <w:style w:type="paragraph" w:styleId="BodyText">
-    <w:name w:val="Body Text"/>
-    <w:basedOn w:val="Normal"/>
-    <w:pPr>
-      <w:spacing w:after="140" w:before="0" w:line="276" w:lineRule="auto"/>
-    </w:pPr>
-    <w:rPr/>
-  </w:style>
-  <w:style w:type="paragraph" w:styleId="List">
-    <w:name w:val="List"/>
-    <w:basedOn w:val="BodyText"/>
-    <w:pPr/>
-    <w:rPr>
-      <w:rFonts w:cs="FreeSans"/>
-    </w:rPr>
-  </w:style>
-  <w:style w:type="paragraph" w:styleId="Caption">
-    <w:name w:val="Caption"/>
-    <w:basedOn w:val="Normal"/>
-    <w:qFormat w:val="1"/>
-    <w:pPr>
-      <w:suppressLineNumbers w:val="1"/>
-      <w:spacing w:after="120" w:before="120"/>
-    </w:pPr>
-    <w:rPr>
-      <w:rFonts w:cs="FreeSans"/>
-      <w:i w:val="1"/>
-      <w:iCs w:val="1"/>
-      <w:sz w:val="24"/>
-      <w:szCs w:val="24"/>
-    </w:rPr>
-  </w:style>
-  <w:style w:type="paragraph" w:styleId="Index">
-    <w:name w:val="Index"/>
-    <w:basedOn w:val="Normal"/>
-    <w:qFormat w:val="1"/>
-    <w:pPr>
-      <w:suppressLineNumbers w:val="1"/>
-    </w:pPr>
-    <w:rPr>
-      <w:rFonts w:cs="FreeSans"/>
-    </w:rPr>
-  </w:style>
-  <w:style w:type="paragraph" w:styleId="StrongEmphasis">
-    <w:name w:val="Strong Emphasis"/>
-    <w:qFormat w:val="1"/>
-    <w:pPr>
-      <w:widowControl w:val="1"/>
-      <w:bidi w:val="0"/>
-      <w:spacing w:after="0" w:before="0"/>
-      <w:jc w:val="left"/>
-    </w:pPr>
-    <w:rPr>
-      <w:rFonts w:ascii="Calibri" w:cs="Calibri" w:eastAsia="Calibri" w:hAnsi="Calibri"/>
-      <w:b w:val="1"/>
-      <w:bCs w:val="1"/>
-      <w:color w:val="auto"/>
-      <w:kern w:val="0"/>
-      <w:sz w:val="22"/>
-      <w:szCs w:val="22"/>
-      <w:lang w:bidi="hi-IN" w:eastAsia="zh-CN" w:val="en-US"/>
-    </w:rPr>
-  </w:style>
-  <w:style w:type="paragraph" w:styleId="ListParagraph">
-    <w:name w:val="List Paragraph"/>
-    <w:qFormat w:val="1"/>
-    <w:pPr>
-      <w:widowControl w:val="1"/>
-      <w:bidi w:val="0"/>
-      <w:spacing w:after="0" w:before="0"/>
-      <w:jc w:val="left"/>
-    </w:pPr>
-    <w:rPr>
-      <w:rFonts w:ascii="Calibri" w:cs="Calibri" w:eastAsia="Calibri" w:hAnsi="Calibri"/>
-      <w:color w:val="auto"/>
-      <w:kern w:val="0"/>
-      <w:sz w:val="22"/>
-      <w:szCs w:val="22"/>
-      <w:lang w:bidi="hi-IN" w:eastAsia="zh-CN" w:val="en-US"/>
-    </w:rPr>
-  </w:style>
-  <w:style w:type="paragraph" w:styleId="FootnoteText">
-    <w:name w:val="Footnote Text"/>
-    <w:basedOn w:val="Normal"/>
-    <w:link w:val="FootnoteTextChar"/>
-    <w:uiPriority w:val="99"/>
-    <w:semiHidden w:val="1"/>
-    <w:unhideWhenUsed w:val="1"/>
-    <w:pPr>
-      <w:spacing w:after="0" w:before="0" w:line="240" w:lineRule="auto"/>
-    </w:pPr>
-    <w:rPr>
-      <w:sz w:val="20"/>
-      <w:szCs w:val="20"/>
-    </w:rPr>
-  </w:style>
-  <w:style w:type="paragraph" w:styleId="EndnoteText">
-    <w:name w:val="Endnote Text"/>
-    <w:basedOn w:val="Normal"/>
-    <w:link w:val="EndnoteTextChar"/>
-    <w:uiPriority w:val="99"/>
-    <w:semiHidden w:val="1"/>
-    <w:unhideWhenUsed w:val="1"/>
-    <w:pPr>
-      <w:spacing w:after="0" w:before="0" w:line="240" w:lineRule="auto"/>
-    </w:pPr>
-    <w:rPr>
-      <w:sz w:val="20"/>
-      <w:szCs w:val="20"/>
-    </w:rPr>
-  </w:style>
-  <w:style w:type="paragraph" w:styleId="HeaderandFooter">
-    <w:name w:val="Header and Footer"/>
-    <w:basedOn w:val="Normal"/>
-    <w:qFormat w:val="1"/>
-    <w:pPr/>
-    <w:rPr/>
-  </w:style>
-  <w:style w:type="paragraph" w:styleId="Header">
-    <w:name w:val="Header"/>
-    <w:basedOn w:val="HeaderandFooter"/>
-    <w:pPr/>
-    <w:rPr/>
-  </w:style>
-  <w:style w:type="paragraph" w:styleId="Footer">
-    <w:name w:val="Footer"/>
-    <w:basedOn w:val="HeaderandFooter"/>
-    <w:pPr/>
-    <w:rPr/>
-  </w:style>
-  <w:style w:type="paragraph" w:styleId="TOC1">
-    <w:name w:val="TOC 1"/>
-    <w:basedOn w:val="Index"/>
-    <w:pPr>
-      <w:tabs>
-        <w:tab w:val="clear" w:pos="720"/>
-        <w:tab w:val="right" w:leader="dot" w:pos="9026"/>
-      </w:tabs>
-      <w:ind w:left="0" w:hanging="0"/>
-    </w:pPr>
-    <w:rPr/>
-  </w:style>
-  <w:style w:type="paragraph" w:styleId="TOC2">
-    <w:name w:val="TOC 2"/>
-    <w:basedOn w:val="Index"/>
-    <w:pPr>
-      <w:tabs>
-        <w:tab w:val="clear" w:pos="720"/>
-        <w:tab w:val="right" w:leader="dot" w:pos="8743"/>
-      </w:tabs>
-      <w:ind w:left="283" w:hanging="0"/>
-    </w:pPr>
-    <w:rPr/>
-  </w:style>
-  <w:style w:type="table" w:styleId="Table1">
-    <w:basedOn w:val="TableNormal"/>
-    <w:tblPr>
-      <w:tblStyleRowBandSize w:val="1"/>
-      <w:tblStyleColBandSize w:val="1"/>
-      <w:tblCellMar>
-        <w:top w:w="60.0" w:type="dxa"/>
-        <w:left w:w="100.0" w:type="dxa"/>
-        <w:bottom w:w="60.0" w:type="dxa"/>
-        <w:right w:w="100.0" w:type="dxa"/>
-      </w:tblCellMar>
-    </w:tblPr>
-  </w:style>
-  <w:style w:type="table" w:styleId="Table2">
-    <w:basedOn w:val="TableNormal"/>
-    <w:tblPr>
-      <w:tblStyleRowBandSize w:val="1"/>
-      <w:tblStyleColBandSize w:val="1"/>
-      <w:tblCellMar>
-        <w:top w:w="60.0" w:type="dxa"/>
-        <w:left w:w="100.0" w:type="dxa"/>
-        <w:bottom w:w="60.0" w:type="dxa"/>
-        <w:right w:w="100.0" w:type="dxa"/>
-      </w:tblCellMar>
-    </w:tblPr>
-  </w:style>
-  <w:style w:type="table" w:styleId="Table3">
-    <w:basedOn w:val="TableNormal"/>
-    <w:tblPr>
-      <w:tblStyleRowBandSize w:val="1"/>
-      <w:tblStyleColBandSize w:val="1"/>
-      <w:tblCellMar>
-        <w:top w:w="60.0" w:type="dxa"/>
-        <w:left w:w="100.0" w:type="dxa"/>
-        <w:bottom w:w="60.0" w:type="dxa"/>
-        <w:right w:w="100.0" w:type="dxa"/>
-      </w:tblCellMar>
-    </w:tblPr>
-  </w:style>
-  <w:style w:type="table" w:styleId="Table4">
-    <w:basedOn w:val="TableNormal"/>
-    <w:tblPr>
-      <w:tblStyleRowBandSize w:val="1"/>
-      <w:tblStyleColBandSize w:val="1"/>
-      <w:tblCellMar>
-        <w:top w:w="60.0" w:type="dxa"/>
-        <w:left w:w="100.0" w:type="dxa"/>
-        <w:bottom w:w="60.0" w:type="dxa"/>
-        <w:right w:w="100.0" w:type="dxa"/>
-      </w:tblCellMar>
-    </w:tblPr>
-  </w:style>
-  <w:style w:type="table" w:styleId="Table5">
-    <w:basedOn w:val="TableNormal"/>
-    <w:tblPr>
-      <w:tblStyleRowBandSize w:val="1"/>
-      <w:tblStyleColBandSize w:val="1"/>
-      <w:tblCellMar>
-        <w:top w:w="60.0" w:type="dxa"/>
-        <w:left w:w="100.0" w:type="dxa"/>
-        <w:bottom w:w="60.0" w:type="dxa"/>
-        <w:right w:w="100.0" w:type="dxa"/>
-      </w:tblCellMar>
-    </w:tblPr>
-  </w:style>
-  <w:style w:type="table" w:styleId="Table6">
-    <w:basedOn w:val="TableNormal"/>
-    <w:tblPr>
-      <w:tblStyleRowBandSize w:val="1"/>
-      <w:tblStyleColBandSize w:val="1"/>
-      <w:tblCellMar>
-        <w:top w:w="60.0" w:type="dxa"/>
-        <w:left w:w="100.0" w:type="dxa"/>
-        <w:bottom w:w="60.0" w:type="dxa"/>
-        <w:right w:w="100.0" w:type="dxa"/>
-      </w:tblCellMar>
-    </w:tblPr>
-  </w:style>
-  <w:style w:type="table" w:styleId="Table7">
-    <w:basedOn w:val="TableNormal"/>
-    <w:tblPr>
-      <w:tblStyleRowBandSize w:val="1"/>
-      <w:tblStyleColBandSize w:val="1"/>
-      <w:tblCellMar>
-        <w:top w:w="60.0" w:type="dxa"/>
-        <w:left w:w="100.0" w:type="dxa"/>
-        <w:bottom w:w="60.0" w:type="dxa"/>
-        <w:right w:w="100.0" w:type="dxa"/>
-      </w:tblCellMar>
-    </w:tblPr>
-  </w:style>
-  <w:style w:type="table" w:styleId="Table1">
-    <w:basedOn w:val="TableNormal"/>
-    <w:tblPr>
-      <w:tblStyleRowBandSize w:val="1"/>
-      <w:tblStyleColBandSize w:val="1"/>
-      <w:tblCellMar>
-        <w:top w:w="60.0" w:type="dxa"/>
-        <w:left w:w="100.0" w:type="dxa"/>
-        <w:bottom w:w="60.0" w:type="dxa"/>
-        <w:right w:w="100.0" w:type="dxa"/>
-      </w:tblCellMar>
-    </w:tblPr>
-  </w:style>
-  <w:style w:type="table" w:styleId="Table2">
-    <w:basedOn w:val="TableNormal"/>
-    <w:tblPr>
-      <w:tblStyleRowBandSize w:val="1"/>
-      <w:tblStyleColBandSize w:val="1"/>
-      <w:tblCellMar>
-        <w:top w:w="60.0" w:type="dxa"/>
-        <w:left w:w="100.0" w:type="dxa"/>
-        <w:bottom w:w="60.0" w:type="dxa"/>
-        <w:right w:w="100.0" w:type="dxa"/>
-      </w:tblCellMar>
-    </w:tblPr>
-  </w:style>
-  <w:style w:type="table" w:styleId="Table3">
-    <w:basedOn w:val="TableNormal"/>
-    <w:tblPr>
-      <w:tblStyleRowBandSize w:val="1"/>
-      <w:tblStyleColBandSize w:val="1"/>
-      <w:tblCellMar>
-        <w:top w:w="60.0" w:type="dxa"/>
-        <w:left w:w="100.0" w:type="dxa"/>
-        <w:bottom w:w="60.0" w:type="dxa"/>
-        <w:right w:w="100.0" w:type="dxa"/>
-      </w:tblCellMar>
-    </w:tblPr>
-  </w:style>
-  <w:style w:type="table" w:styleId="Table4">
-    <w:basedOn w:val="TableNormal"/>
-    <w:tblPr>
-      <w:tblStyleRowBandSize w:val="1"/>
-      <w:tblStyleColBandSize w:val="1"/>
-      <w:tblCellMar>
-        <w:top w:w="60.0" w:type="dxa"/>
-        <w:left w:w="100.0" w:type="dxa"/>
-        <w:bottom w:w="60.0" w:type="dxa"/>
-        <w:right w:w="100.0" w:type="dxa"/>
-      </w:tblCellMar>
-    </w:tblPr>
-  </w:style>
-  <w:style w:type="table" w:styleId="Table5">
-    <w:basedOn w:val="TableNormal"/>
-    <w:tblPr>
-      <w:tblStyleRowBandSize w:val="1"/>
-      <w:tblStyleColBandSize w:val="1"/>
-      <w:tblCellMar>
-        <w:top w:w="60.0" w:type="dxa"/>
-        <w:left w:w="100.0" w:type="dxa"/>
-        <w:bottom w:w="60.0" w:type="dxa"/>
-        <w:right w:w="100.0" w:type="dxa"/>
-      </w:tblCellMar>
-    </w:tblPr>
-  </w:style>
-  <w:style w:type="table" w:styleId="Table6">
-    <w:basedOn w:val="TableNormal"/>
-    <w:tblPr>
-      <w:tblStyleRowBandSize w:val="1"/>
-      <w:tblStyleColBandSize w:val="1"/>
-      <w:tblCellMar>
-        <w:top w:w="60.0" w:type="dxa"/>
-        <w:left w:w="100.0" w:type="dxa"/>
-        <w:bottom w:w="60.0" w:type="dxa"/>
-        <w:right w:w="100.0" w:type="dxa"/>
-      </w:tblCellMar>
-    </w:tblPr>
-  </w:style>
-  <w:style w:type="table" w:styleId="Table7">
-    <w:basedOn w:val="TableNormal"/>
-    <w:tblPr>
-      <w:tblStyleRowBandSize w:val="1"/>
-      <w:tblStyleColBandSize w:val="1"/>
-      <w:tblCellMar>
-        <w:top w:w="60.0" w:type="dxa"/>
-        <w:left w:w="100.0" w:type="dxa"/>
-        <w:bottom w:w="60.0" w:type="dxa"/>
-        <w:right w:w="100.0" w:type="dxa"/>
-      </w:tblCellMar>
-    </w:tblPr>
-  </w:style>
   <w:style w:type="paragraph" w:styleId="Subtitle">
     <w:name w:val="Subtitle"/>
     <w:basedOn w:val="Normal"/>
@@ -12492,126 +12444,351 @@
       </w:tblCellMar>
     </w:tblPr>
   </w:style>
+  <w:style w:type="table" w:styleId="Table8">
+    <w:basedOn w:val="TableNormal"/>
+    <w:tblPr>
+      <w:tblStyleRowBandSize w:val="1"/>
+      <w:tblStyleColBandSize w:val="1"/>
+      <w:tblCellMar>
+        <w:top w:w="60.0" w:type="dxa"/>
+        <w:left w:w="100.0" w:type="dxa"/>
+        <w:bottom w:w="60.0" w:type="dxa"/>
+        <w:right w:w="100.0" w:type="dxa"/>
+      </w:tblCellMar>
+    </w:tblPr>
+  </w:style>
+  <w:style w:type="table" w:styleId="Table9">
+    <w:basedOn w:val="TableNormal"/>
+    <w:tblPr>
+      <w:tblStyleRowBandSize w:val="1"/>
+      <w:tblStyleColBandSize w:val="1"/>
+      <w:tblCellMar>
+        <w:top w:w="60.0" w:type="dxa"/>
+        <w:left w:w="100.0" w:type="dxa"/>
+        <w:bottom w:w="60.0" w:type="dxa"/>
+        <w:right w:w="100.0" w:type="dxa"/>
+      </w:tblCellMar>
+    </w:tblPr>
+  </w:style>
 </w:styles>
 </file>
 
 <file path=word/theme/theme1.xml><?xml version="1.0" encoding="utf-8"?>
-<a:theme xmlns:a="http://schemas.openxmlformats.org/drawingml/2006/main" xmlns:r="http://schemas.openxmlformats.org/officeDocument/2006/relationships" name="Office">
+<a:theme xmlns:a="http://schemas.openxmlformats.org/drawingml/2006/main" name="Office Theme">
   <a:themeElements>
-    <a:clrScheme name="LibreOffice">
+    <a:clrScheme name="Office">
       <a:dk1>
-        <a:srgbClr val="000000"/>
+        <a:sysClr val="windowText" lastClr="000000"/>
       </a:dk1>
       <a:lt1>
-        <a:srgbClr val="ffffff"/>
+        <a:sysClr val="window" lastClr="FFFFFF"/>
       </a:lt1>
       <a:dk2>
-        <a:srgbClr val="000000"/>
+        <a:srgbClr val="1F497D"/>
       </a:dk2>
       <a:lt2>
-        <a:srgbClr val="ffffff"/>
+        <a:srgbClr val="EEECE1"/>
       </a:lt2>
       <a:accent1>
-        <a:srgbClr val="18a303"/>
+        <a:srgbClr val="4F81BD"/>
       </a:accent1>
       <a:accent2>
-        <a:srgbClr val="0369a3"/>
+        <a:srgbClr val="C0504D"/>
       </a:accent2>
       <a:accent3>
-        <a:srgbClr val="a33e03"/>
+        <a:srgbClr val="9BBB59"/>
       </a:accent3>
       <a:accent4>
-        <a:srgbClr val="8e03a3"/>
+        <a:srgbClr val="8064A2"/>
       </a:accent4>
       <a:accent5>
-        <a:srgbClr val="c99c00"/>
+        <a:srgbClr val="4BACC6"/>
       </a:accent5>
       <a:accent6>
-        <a:srgbClr val="c9211e"/>
+        <a:srgbClr val="F79646"/>
       </a:accent6>
       <a:hlink>
-        <a:srgbClr val="0000ee"/>
+        <a:srgbClr val="0000FF"/>
       </a:hlink>
       <a:folHlink>
-        <a:srgbClr val="551a8b"/>
+        <a:srgbClr val="800080"/>
       </a:folHlink>
     </a:clrScheme>
     <a:fontScheme name="Office">
       <a:majorFont>
-        <a:latin typeface="Arial" pitchFamily="0" charset="1"/>
-        <a:ea typeface="DejaVu Sans" pitchFamily="0" charset="1"/>
-        <a:cs typeface="DejaVu Sans" pitchFamily="0" charset="1"/>
+        <a:latin typeface="Calibri"/>
+        <a:ea typeface=""/>
+        <a:cs typeface=""/>
+        <a:font script="Jpan" typeface="ＭＳ ゴシック"/>
+        <a:font script="Hang" typeface="맑은 고딕"/>
+        <a:font script="Hans" typeface="宋体"/>
+        <a:font script="Hant" typeface="新細明體"/>
+        <a:font script="Arab" typeface="Times New Roman"/>
+        <a:font script="Hebr" typeface="Times New Roman"/>
+        <a:font script="Thai" typeface="Angsana New"/>
+        <a:font script="Ethi" typeface="Nyala"/>
+        <a:font script="Beng" typeface="Vrinda"/>
+        <a:font script="Gujr" typeface="Shruti"/>
+        <a:font script="Khmr" typeface="MoolBoran"/>
+        <a:font script="Knda" typeface="Tunga"/>
+        <a:font script="Guru" typeface="Raavi"/>
+        <a:font script="Cans" typeface="Euphemia"/>
+        <a:font script="Cher" typeface="Plantagenet Cherokee"/>
+        <a:font script="Yiii" typeface="Microsoft Yi Baiti"/>
+        <a:font script="Tibt" typeface="Microsoft Himalaya"/>
+        <a:font script="Thaa" typeface="MV Boli"/>
+        <a:font script="Deva" typeface="Mangal"/>
+        <a:font script="Telu" typeface="Gautami"/>
+        <a:font script="Taml" typeface="Latha"/>
+        <a:font script="Syrc" typeface="Estrangelo Edessa"/>
+        <a:font script="Orya" typeface="Kalinga"/>
+        <a:font script="Mlym" typeface="Kartika"/>
+        <a:font script="Laoo" typeface="DokChampa"/>
+        <a:font script="Sinh" typeface="Iskoola Pota"/>
+        <a:font script="Mong" typeface="Mongolian Baiti"/>
+        <a:font script="Viet" typeface="Times New Roman"/>
+        <a:font script="Uigh" typeface="Microsoft Uighur"/>
+        <a:font script="Geor" typeface="Sylfaen"/>
       </a:majorFont>
       <a:minorFont>
-        <a:latin typeface="Arial" pitchFamily="0" charset="1"/>
-        <a:ea typeface="DejaVu Sans" pitchFamily="0" charset="1"/>
-        <a:cs typeface="DejaVu Sans" pitchFamily="0" charset="1"/>
+        <a:latin typeface="Cambria"/>
+        <a:ea typeface=""/>
+        <a:cs typeface=""/>
+        <a:font script="Jpan" typeface="ＭＳ 明朝"/>
+        <a:font script="Hang" typeface="맑은 고딕"/>
+        <a:font script="Hans" typeface="宋体"/>
+        <a:font script="Hant" typeface="新細明體"/>
+        <a:font script="Arab" typeface="Arial"/>
+        <a:font script="Hebr" typeface="Arial"/>
+        <a:font script="Thai" typeface="Cordia New"/>
+        <a:font script="Ethi" typeface="Nyala"/>
+        <a:font script="Beng" typeface="Vrinda"/>
+        <a:font script="Gujr" typeface="Shruti"/>
+        <a:font script="Khmr" typeface="DaunPenh"/>
+        <a:font script="Knda" typeface="Tunga"/>
+        <a:font script="Guru" typeface="Raavi"/>
+        <a:font script="Cans" typeface="Euphemia"/>
+        <a:font script="Cher" typeface="Plantagenet Cherokee"/>
+        <a:font script="Yiii" typeface="Microsoft Yi Baiti"/>
+        <a:font script="Tibt" typeface="Microsoft Himalaya"/>
+        <a:font script="Thaa" typeface="MV Boli"/>
+        <a:font script="Deva" typeface="Mangal"/>
+        <a:font script="Telu" typeface="Gautami"/>
+        <a:font script="Taml" typeface="Latha"/>
+        <a:font script="Syrc" typeface="Estrangelo Edessa"/>
+        <a:font script="Orya" typeface="Kalinga"/>
+        <a:font script="Mlym" typeface="Kartika"/>
+        <a:font script="Laoo" typeface="DokChampa"/>
+        <a:font script="Sinh" typeface="Iskoola Pota"/>
+        <a:font script="Mong" typeface="Mongolian Baiti"/>
+        <a:font script="Viet" typeface="Arial"/>
+        <a:font script="Uigh" typeface="Microsoft Uighur"/>
+        <a:font script="Geor" typeface="Sylfaen"/>
       </a:minorFont>
     </a:fontScheme>
-    <a:fmtScheme>
+    <a:fmtScheme name="Office">
       <a:fillStyleLst>
         <a:solidFill>
           <a:schemeClr val="phClr"/>
         </a:solidFill>
-        <a:solidFill>
-          <a:schemeClr val="phClr"/>
-        </a:solidFill>
-        <a:solidFill>
-          <a:schemeClr val="phClr"/>
-        </a:solidFill>
+        <a:gradFill rotWithShape="1">
+          <a:gsLst>
+            <a:gs pos="0">
+              <a:schemeClr val="phClr">
+                <a:tint val="50000"/>
+                <a:satMod val="300000"/>
+              </a:schemeClr>
+            </a:gs>
+            <a:gs pos="35000">
+              <a:schemeClr val="phClr">
+                <a:tint val="37000"/>
+                <a:satMod val="300000"/>
+              </a:schemeClr>
+            </a:gs>
+            <a:gs pos="100000">
+              <a:schemeClr val="phClr">
+                <a:tint val="15000"/>
+                <a:satMod val="350000"/>
+              </a:schemeClr>
+            </a:gs>
+          </a:gsLst>
+          <a:lin ang="16200000" scaled="1"/>
+        </a:gradFill>
+        <a:gradFill rotWithShape="1">
+          <a:gsLst>
+            <a:gs pos="0">
+              <a:schemeClr val="phClr">
+                <a:tint val="100000"/>
+                <a:shade val="100000"/>
+                <a:satMod val="130000"/>
+              </a:schemeClr>
+            </a:gs>
+            <a:gs pos="100000">
+              <a:schemeClr val="phClr">
+                <a:tint val="50000"/>
+                <a:shade val="100000"/>
+                <a:satMod val="350000"/>
+              </a:schemeClr>
+            </a:gs>
+          </a:gsLst>
+          <a:lin ang="16200000" scaled="0"/>
+        </a:gradFill>
       </a:fillStyleLst>
       <a:lnStyleLst>
-        <a:ln w="6350" cap="flat" cmpd="sng" algn="ctr">
+        <a:ln w="9525" cap="flat" cmpd="sng" algn="ctr">
+          <a:solidFill>
+            <a:schemeClr val="phClr">
+              <a:shade val="95000"/>
+              <a:satMod val="105000"/>
+            </a:schemeClr>
+          </a:solidFill>
           <a:prstDash val="solid"/>
-          <a:miter/>
         </a:ln>
-        <a:ln w="6350" cap="flat" cmpd="sng" algn="ctr">
+        <a:ln w="25400" cap="flat" cmpd="sng" algn="ctr">
+          <a:solidFill>
+            <a:schemeClr val="phClr"/>
+          </a:solidFill>
           <a:prstDash val="solid"/>
-          <a:miter/>
         </a:ln>
-        <a:ln w="6350" cap="flat" cmpd="sng" algn="ctr">
+        <a:ln w="38100" cap="flat" cmpd="sng" algn="ctr">
+          <a:solidFill>
+            <a:schemeClr val="phClr"/>
+          </a:solidFill>
           <a:prstDash val="solid"/>
-          <a:miter/>
         </a:ln>
       </a:lnStyleLst>
       <a:effectStyleLst>
         <a:effectStyle>
-          <a:effectLst/>
+          <a:effectLst>
+            <a:outerShdw blurRad="40000" dist="20000" dir="5400000" rotWithShape="0">
+              <a:srgbClr val="000000">
+                <a:alpha val="38000"/>
+              </a:srgbClr>
+            </a:outerShdw>
+          </a:effectLst>
         </a:effectStyle>
         <a:effectStyle>
-          <a:effectLst/>
+          <a:effectLst>
+            <a:outerShdw blurRad="40000" dist="23000" dir="5400000" rotWithShape="0">
+              <a:srgbClr val="000000">
+                <a:alpha val="35000"/>
+              </a:srgbClr>
+            </a:outerShdw>
+          </a:effectLst>
         </a:effectStyle>
         <a:effectStyle>
-          <a:effectLst/>
+          <a:effectLst>
+            <a:outerShdw blurRad="40000" dist="23000" dir="5400000" rotWithShape="0">
+              <a:srgbClr val="000000">
+                <a:alpha val="35000"/>
+              </a:srgbClr>
+            </a:outerShdw>
+          </a:effectLst>
+          <a:scene3d>
+            <a:camera prst="orthographicFront">
+              <a:rot lat="0" lon="0" rev="0"/>
+            </a:camera>
+            <a:lightRig rig="threePt" dir="t">
+              <a:rot lat="0" lon="0" rev="1200000"/>
+            </a:lightRig>
+          </a:scene3d>
+          <a:sp3d>
+            <a:bevelT w="63500" h="25400"/>
+          </a:sp3d>
         </a:effectStyle>
       </a:effectStyleLst>
       <a:bgFillStyleLst>
         <a:solidFill>
           <a:schemeClr val="phClr"/>
         </a:solidFill>
-        <a:solidFill>
-          <a:schemeClr val="phClr"/>
-        </a:solidFill>
-        <a:solidFill>
-          <a:schemeClr val="phClr"/>
-        </a:solidFill>
+        <a:gradFill rotWithShape="1">
+          <a:gsLst>
+            <a:gs pos="0">
+              <a:schemeClr val="phClr">
+                <a:tint val="40000"/>
+                <a:satMod val="350000"/>
+              </a:schemeClr>
+            </a:gs>
+            <a:gs pos="40000">
+              <a:schemeClr val="phClr">
+                <a:tint val="45000"/>
+                <a:shade val="99000"/>
+                <a:satMod val="350000"/>
+              </a:schemeClr>
+            </a:gs>
+            <a:gs pos="100000">
+              <a:schemeClr val="phClr">
+                <a:shade val="20000"/>
+                <a:satMod val="255000"/>
+              </a:schemeClr>
+            </a:gs>
+          </a:gsLst>
+          <a:path path="circle">
+            <a:fillToRect l="50000" t="-80000" r="50000" b="180000"/>
+          </a:path>
+        </a:gradFill>
+        <a:gradFill rotWithShape="1">
+          <a:gsLst>
+            <a:gs pos="0">
+              <a:schemeClr val="phClr">
+                <a:tint val="80000"/>
+                <a:satMod val="300000"/>
+              </a:schemeClr>
+            </a:gs>
+            <a:gs pos="100000">
+              <a:schemeClr val="phClr">
+                <a:shade val="30000"/>
+                <a:satMod val="200000"/>
+              </a:schemeClr>
+            </a:gs>
+          </a:gsLst>
+          <a:path path="circle">
+            <a:fillToRect l="50000" t="50000" r="50000" b="50000"/>
+          </a:path>
+        </a:gradFill>
       </a:bgFillStyleLst>
     </a:fmtScheme>
   </a:themeElements>
+  <a:objectDefaults>
+    <a:spDef>
+      <a:spPr/>
+      <a:bodyPr/>
+      <a:lstStyle/>
+      <a:style>
+        <a:lnRef idx="1">
+          <a:schemeClr val="accent1"/>
+        </a:lnRef>
+        <a:fillRef idx="3">
+          <a:schemeClr val="accent1"/>
+        </a:fillRef>
+        <a:effectRef idx="2">
+          <a:schemeClr val="accent1"/>
+        </a:effectRef>
+        <a:fontRef idx="minor">
+          <a:schemeClr val="lt1"/>
+        </a:fontRef>
+      </a:style>
+    </a:spDef>
+    <a:lnDef>
+      <a:spPr/>
+      <a:bodyPr/>
+      <a:lstStyle/>
+      <a:style>
+        <a:lnRef idx="2">
+          <a:schemeClr val="accent1"/>
+        </a:lnRef>
+        <a:fillRef idx="0">
+          <a:schemeClr val="accent1"/>
+        </a:fillRef>
+        <a:effectRef idx="1">
+          <a:schemeClr val="accent1"/>
+        </a:effectRef>
+        <a:fontRef idx="minor">
+          <a:schemeClr val="tx1"/>
+        </a:fontRef>
+      </a:style>
+    </a:lnDef>
+  </a:objectDefaults>
+  <a:extraClrSchemeLst/>
 </a:theme>
-</file>
-
-<file path=customXML/item1.xml><?xml version="1.0" encoding="utf-8"?>
-<go:gDocsCustomXmlDataStorage xmlns:go="http://customooxmlschemas.google.com/" xmlns:r="http://schemas.openxmlformats.org/officeDocument/2006/relationships" uri="GoogleDocsCustomDataVersion2">
-  <go:docsCustomData xmlns:go="http://customooxmlschemas.google.com/" roundtripDataSignature="AMtx7mhz/prrRa0aVsbTUO4jKTjI0nkq+Q==">CgMxLjAyDmgudW52bW10ZHp6aWNyMg5oLmNsMG1lZ3N3bWJxczIOaC5zdzl2anhkejAyMXQyDmguc3ExZmtyamJmdDJ5Mg5oLjFwZW5qNngzMnNodjIOaC5pNXlnaHNlZDZramYyDmgueW50MnhvdXhxM2x1Mg5oLnk1YXFubHV5eXV1bzIOaC5mNXJib2ZuajJoY3MyDmguZ2VuZ3FteHF3NmRyMg5oLnJlZGZqN2FpdTI1bzIOaC40eXRveWd1bTgyMmkyDmgueW5vZWtwOHZwZnFjOAByITFQTVM1eEdENXZHV01FaWNxRndhaDZsRWxSR0lfa1FmdA==</go:docsCustomData>
-</go:gDocsCustomXmlDataStorage>
-</file>
-
-<file path=customXML/itemProps1.xml><?xml version="1.0" encoding="utf-8"?>
-<ds:datastoreItem xmlns:ds="http://schemas.openxmlformats.org/officeDocument/2006/customXml" ds:itemID="{11111111-1234-1234-1234-123412341234}">
-  <ds:schemaRefs>
-    <ds:schemaRef ds:uri="http://schemas.openxmlformats.org/officeDocument/2006/relationships"/>
-    <ds:schemaRef ds:uri="http://customooxmlschemas.google.com/"/>
-  </ds:schemaRefs>
-</ds:datastoreItem>
 </file>
</xml_diff>